<commit_message>
fix: soften 'name label circularity' -> 'quantify'; add temporal-holdout leakage caveat
- 'name this failure mode' over-claims (Preibisch 2026 already addressed
  recursive data corruption); changed to 'quantify' across abstract + cover letter
- Limitations now disclose the temporal-holdout model's training snapshot was
  not time-truncated, so the result bounds labeler-level circularity rather than
  formally excluding post-2022 leakage

Co-Authored-By: Claude Code <noreply@anthropic.com>
</commit_message>
<xml_diff>
--- a/06_Bioinformatics_Submission/manuscript_plos.docx
+++ b/06_Bioinformatics_Submission/manuscript_plos.docx
@@ -224,7 +224,7 @@
         <w:pStyle w:val="FirstParagraph"/>
       </w:pPr>
       <w:r>
-        <w:t xml:space="preserve">Peptide-MHC-I binding predictors are routinely trained on computationally labelled data, yet benchmark scores that merely reproduce the labeler’s decision boundary are rarely distinguished from true binding accuracy. We name this failure mode</w:t>
+        <w:t xml:space="preserve">Peptide-MHC-I binding predictors are routinely trained on computationally labelled data, yet benchmark scores that merely reproduce the labeler’s decision boundary are rarely distinguished from true binding accuracy. We quantify a failure mode —</w:t>
       </w:r>
       <w:r>
         <w:t xml:space="preserve"> </w:t>
@@ -240,7 +240,7 @@
         <w:t xml:space="preserve"> </w:t>
       </w:r>
       <w:r>
-        <w:t xml:space="preserve">and distil a benchmark-hygiene checklist to detect it. Re-analysing a 5,190-peptide HLA-A*02:01 benchmark under controlled conditions dissolved three apparent findings — per-allele superiority over a pan model,</w:t>
+        <w:t xml:space="preserve">— and distil a benchmark-hygiene checklist to detect it. Re-analysing a 5,190-peptide HLA-A*02:01 benchmark under controlled conditions dissolved three apparent findings — per-allele superiority over a pan model,</w:t>
       </w:r>
       <w:r>
         <w:t xml:space="preserve"> </w:t>
@@ -4386,7 +4386,7 @@
         <w:pStyle w:val="FirstParagraph"/>
       </w:pPr>
       <w:r>
-        <w:t xml:space="preserve">Training labels are MHCflurry-derived rather than experimental affinities, so our single-allele benchmark is itself subject to the label circularity we describe; we quantify this by cross-referencing the 42 A*02:01-verified IEDB epitopes against MHCflurry’s training corpus; the large majority overlapped, and the few non-overlapping epitopes were nonetheless correctly classified, providing limited evidence of generalisation beyond the training distribution. The single-allele design was deliberate — holding the allele constant isolates label-source variation from allele-driven confounds — but the multi-allele extension addresses the generalisability question directly. The multi-allele estimates rest on IEDB-derived positives; experimental (non-IEDB) validation of the extreme tail is outstanding, and a pMHC-fine-tuned structure model (beyond generic AlphaFold-Multimer) might lift the Type B plateau. All translational predictions and the cancer neoepitope candidates require experimental confirmation (e.g., IFN-γ ELISpot or tetramer staining). Antigen-processing steps (proteasomal cleavage, TAP transport) are not modelled.</w:t>
+        <w:t xml:space="preserve">Training labels are MHCflurry-derived rather than experimental affinities, so our single-allele benchmark is itself subject to the label circularity we describe; we quantify this by cross-referencing the 42 A*02:01-verified IEDB epitopes against MHCflurry’s training corpus; the large majority overlapped, and the few non-overlapping epitopes were nonetheless correctly classified, providing limited evidence of generalisation beyond the training distribution. Similarly, the temporal holdout (§3.11) shows that post-2022 epitopes are recognised without a detectable drop, but the evaluated model’s training snapshot was not time-truncated to pre-2022, so this result bounds labeler-level circularity rather than formally excluding leakage of post-2022 peptides into the model’s training data. The single-allele design was deliberate — holding the allele constant isolates label-source variation from allele-driven confounds — but the multi-allele extension addresses the generalisability question directly. The multi-allele estimates rest on IEDB-derived positives; experimental (non-IEDB) validation of the extreme tail is outstanding, and a pMHC-fine-tuned structure model (beyond generic AlphaFold-Multimer) might lift the Type B plateau. All translational predictions and the cancer neoepitope candidates require experimental confirmation (e.g., IFN-γ ELISpot or tetramer staining). Antigen-processing steps (proteasomal cleavage, TAP transport) are not modelled.</w:t>
       </w:r>
     </w:p>
     <w:bookmarkEnd w:id="39"/>

</xml_diff>

<commit_message>
docs: retitle to 'Benchmark Hygiene Reveals Label Circularity and Ground-Truth Contamination...'
'Non-Canonical Frontier' over-claimed a plateau that re-runs showed is partly a
threshold artifact. New title leads with the two defensible findings (label
circularity + ground-truth contamination). Synced across md/LaTeX source/cover
letters/README/CITATION.cff/CLAUDE.md.

Co-Authored-By: Claude Code <noreply@anthropic.com>
</commit_message>
<xml_diff>
--- a/06_Bioinformatics_Submission/manuscript_plos.docx
+++ b/06_Bioinformatics_Submission/manuscript_plos.docx
@@ -2,13 +2,13 @@
 <file path=word/document.xml><?xml version="1.0" encoding="utf-8"?>
 <w:document xmlns:w="http://schemas.openxmlformats.org/wordprocessingml/2006/main" xmlns:m="http://schemas.openxmlformats.org/officeDocument/2006/math" xmlns:r="http://schemas.openxmlformats.org/officeDocument/2006/relationships" xmlns:o="urn:schemas-microsoft-com:office:office" xmlns:v="urn:schemas-microsoft-com:vml" xmlns:w10="urn:schemas-microsoft-com:office:word" xmlns:a="http://schemas.openxmlformats.org/drawingml/2006/main" xmlns:pic="http://schemas.openxmlformats.org/drawingml/2006/picture" xmlns:wp="http://schemas.openxmlformats.org/drawingml/2006/wordprocessingDrawing">
   <w:body>
-    <w:bookmarkStart w:id="49" w:name="X9e5fcdec263207596ea0c9145201f0120d49339"/>
+    <w:bookmarkStart w:id="49" w:name="X9f3b6b50a31cc0676e3d2d802693a629a9e8acf"/>
     <w:p>
       <w:pPr>
         <w:pStyle w:val="Heading1"/>
       </w:pPr>
       <w:r>
-        <w:t xml:space="preserve">Benchmark Hygiene Reveals the Non-Canonical Frontier of Peptide-MHC-I Binding Prediction</w:t>
+        <w:t xml:space="preserve">Benchmark Hygiene Reveals Label Circularity and Ground-Truth Contamination in Peptide-MHC-I Binding Prediction</w:t>
       </w:r>
     </w:p>
     <w:p>

</xml_diff>

<commit_message>
fix: resolve 3-judge re-review — denominator, title, biology, reproducibility
- 48/42/41 denominator now explicit (49 -> 48 via ILRGSVAHK -> 42 via 6 more);
  NetMHCpan 40/48 flagged as non-comparable (bounded 34/42-40/42 on clean set)
- title downgraded: drop 'Ground-Truth Contamination' (no field-level measurement),
  keep 'Label Circularity' (backed by 62.24%)
- ELAGIGILTV: 10-mer A27L variant outside 9-mer window (10/10, not 10/11)
- 'break circularity' -> 'characterise labels independently'
- p53 R248W: P3 solvent-exposed/TCR-facing, not groove-fit
- Table 8 caption + pan16 '11'->'10' + 62.24% 'quantifies'->'consistent with'
- deposit a0201_benchmark_42.csv (42+20) for headline-result reproducibility

Co-Authored-By: Claude Code <noreply@anthropic.com>
</commit_message>
<xml_diff>
--- a/06_Bioinformatics_Submission/manuscript_plos.docx
+++ b/06_Bioinformatics_Submission/manuscript_plos.docx
@@ -2,13 +2,13 @@
 <file path=word/document.xml><?xml version="1.0" encoding="utf-8"?>
 <w:document xmlns:w="http://schemas.openxmlformats.org/wordprocessingml/2006/main" xmlns:m="http://schemas.openxmlformats.org/officeDocument/2006/math" xmlns:r="http://schemas.openxmlformats.org/officeDocument/2006/relationships" xmlns:o="urn:schemas-microsoft-com:office:office" xmlns:v="urn:schemas-microsoft-com:vml" xmlns:w10="urn:schemas-microsoft-com:office:word" xmlns:a="http://schemas.openxmlformats.org/drawingml/2006/main" xmlns:pic="http://schemas.openxmlformats.org/drawingml/2006/picture" xmlns:wp="http://schemas.openxmlformats.org/drawingml/2006/wordprocessingDrawing">
   <w:body>
-    <w:bookmarkStart w:id="49" w:name="X9f3b6b50a31cc0676e3d2d802693a629a9e8acf"/>
+    <w:bookmarkStart w:id="49" w:name="X5ffde9b164606a1cef79c337ee07fb8488914a3"/>
     <w:p>
       <w:pPr>
         <w:pStyle w:val="Heading1"/>
       </w:pPr>
       <w:r>
-        <w:t xml:space="preserve">Benchmark Hygiene Reveals Label Circularity and Ground-Truth Contamination in Peptide-MHC-I Binding Prediction</w:t>
+        <w:t xml:space="preserve">Benchmark Hygiene Reveals Label Circularity in Peptide-MHC-I Binding Prediction</w:t>
       </w:r>
     </w:p>
     <w:p>
@@ -441,7 +441,7 @@
         <w:pStyle w:val="FirstParagraph"/>
       </w:pPr>
       <w:r>
-        <w:t xml:space="preserve">Experimentally confirmed class I binders were curated from the IEDB [14] for five common alleles (HLA-A*02:01, A*01:01, A*03:01, B*07:02, B*44:03), yielding n = 14,488 positives (canonical 11,225; Type A 151; Type B 3,112). A 15-allele panel (pan16: 11 additional alleles — A*11:01, A*24:02, B*08:01, B*15:01, B*27:05, B*35:01, B*40:01, B*49:01, B*51:01, B*57:01) was curated for generalisation testing. Protein-background negatives were sampled from natural proteomes to avoid the uniform-random decoys used in earlier evaluations. IEDB data were queried live from query-api.iedb.org (accessed 2026-08-02); the 15-allele and temporal-holdout estimates are therefore snapshot-dependent and drift slightly as the IEDB grows.</w:t>
+        <w:t xml:space="preserve">Experimentally confirmed class I binders were curated from the IEDB [14] for five common alleles (HLA-A*02:01, A*01:01, A*03:01, B*07:02, B*44:03), yielding n = 14,488 positives (canonical 11,225; Type A 151; Type B 3,112). A 15-allele panel (pan16: 10 additional alleles — A*11:01, A*24:02, B*08:01, B*15:01, B*27:05, B*35:01, B*40:01, B*49:01, B*51:01, B*57:01) was curated for generalisation testing. Protein-background negatives were sampled from natural proteomes to avoid the uniform-random decoys used in earlier evaluations. IEDB data were queried live from query-api.iedb.org (accessed 2026-08-02); the 15-allele and temporal-holdout estimates are therefore snapshot-dependent and drift slightly as the IEDB grows.</w:t>
       </w:r>
     </w:p>
     <w:bookmarkEnd w:id="16"/>
@@ -1548,7 +1548,16 @@
         <w:pStyle w:val="FirstParagraph"/>
       </w:pPr>
       <w:r>
-        <w:t xml:space="preserve">The Deep FFN achieved 97.6% sensitivity (41/42; Wilson 95% CI 87.7–99.6%), 75.0% specificity (15/20), ROC AUC 0.970 against IEDB epitopes (Table 5, Figure 3). Independent re-verification against the IEDB (query-api.iedb.org, accessed 2026-10-23) excluded seven peptides lacking A*02:01 restriction:</w:t>
+        <w:t xml:space="preserve">The Deep FFN achieved 97.6% sensitivity (41/42; Wilson 95% CI 87.7–99.6%), 75.0% specificity (15/20), ROC AUC 0.970 against IEDB epitopes (Table 5, Figure 3). Of the original 49 A*02:01-restricted epitopes, one (</w:t>
+      </w:r>
+      <w:r>
+        <w:rPr>
+          <w:rStyle w:val="VerbatimChar"/>
+        </w:rPr>
+        <w:t xml:space="preserve">ILRGSVAHK</w:t>
+      </w:r>
+      <w:r>
+        <w:t xml:space="preserve">) was removed on re-curation for allele mis-attribution (HLA-A*03:01, previously mis-attributed to B*08:01), leaving 48. IEDB re-verification (query-api.iedb.org, accessed 2026-10-23) then excluded six further peptides lacking A*02:01 restriction —</w:t>
       </w:r>
       <w:r>
         <w:t xml:space="preserve"> </w:t>
@@ -1602,21 +1611,6 @@
         <w:rPr>
           <w:rStyle w:val="VerbatimChar"/>
         </w:rPr>
-        <w:t xml:space="preserve">ILRGSVAHK</w:t>
-      </w:r>
-      <w:r>
-        <w:t xml:space="preserve"> </w:t>
-      </w:r>
-      <w:r>
-        <w:t xml:space="preserve">(HLA-A*03:01; previously mis-attributed to B*08:01),</w:t>
-      </w:r>
-      <w:r>
-        <w:t xml:space="preserve"> </w:t>
-      </w:r>
-      <w:r>
-        <w:rPr>
-          <w:rStyle w:val="VerbatimChar"/>
-        </w:rPr>
         <w:t xml:space="preserve">QYDPVAALF</w:t>
       </w:r>
       <w:r>
@@ -1653,7 +1647,7 @@
         <w:t xml:space="preserve"> </w:t>
       </w:r>
       <w:r>
-        <w:t xml:space="preserve">(no positive A*02:01 record). The single remaining false negative,</w:t>
+        <w:t xml:space="preserve">(no positive A*02:01 record) — giving the final 42-epitope benchmark. The single remaining false negative,</w:t>
       </w:r>
       <w:r>
         <w:t xml:space="preserve"> </w:t>
@@ -1668,7 +1662,7 @@
         <w:t xml:space="preserve"> </w:t>
       </w:r>
       <w:r>
-        <w:t xml:space="preserve">(HPV16 E7), carries a non-canonical p9 anchor (C). An independent predictor, NetMHCpan-4.1 (queried through the IEDB web API, which does not pin a reproducible tool version), achieved 83.3% sensitivity (40/48) on the original 48-peptide set (not re-evaluated on the corrected 42-peptide set). This gap partly reflects label circularity (most of the epitopes overlap MHCflurry’s training corpus), but NetMHCpan’s pan-specific training on MS-elution-based labels makes this an indicative rather than clean comparison; the more direct circularity evidence is the 62.24% label agreement (323/519 test peptides) reported in the Discussion. To contextualise the benchmark, we include a zero-parameter anchor-checker baseline (a rule classifying any 9-mer with canonical p2/p9 residues as a binder): it achieves sensitivity 0.786 (33/42) and specificity 0.900 (18/20), below the trained model (0.976), because nine genuine binders carry non-canonical p2/p9 anchors. The trained model recovers eight of these nine — the single residual miss,</w:t>
+        <w:t xml:space="preserve">(HPV16 E7), carries a non-canonical p9 anchor (C). An independent predictor, NetMHCpan-4.1 (queried through the IEDB web API, which does not pin a reproducible tool version), achieved 83.3% sensitivity (40/48) on the original 48-peptide set, which retains six peptides subsequently shown not to be A*02:01-restricted; NetMHCpan was not re-evaluated on the corrected 42-epitope set, so the two sensitivities are not directly comparable (on the corrected set NetMHCpan’s sensitivity is bounded between 34/42 and 40/42, i.e. 81.0–95.2%). This gap partly reflects label circularity (most of the epitopes overlap MHCflurry’s training corpus), but NetMHCpan’s pan-specific training on MS-elution-based labels makes this an indicative rather than clean comparison; the more direct circularity evidence is the 62.24% label agreement (323/519 test peptides) reported in the Discussion. To contextualise the benchmark, we include a zero-parameter anchor-checker baseline (a rule classifying any 9-mer with canonical p2/p9 residues as a binder): it achieves sensitivity 0.786 (33/42) and specificity 0.900 (18/20), below the trained model (0.976), because nine genuine binders carry non-canonical p2/p9 anchors. The trained model recovers eight of these nine — the single residual miss,</w:t>
       </w:r>
       <w:r>
         <w:t xml:space="preserve"> </w:t>
@@ -1683,7 +1677,7 @@
         <w:t xml:space="preserve"> </w:t>
       </w:r>
       <w:r>
-        <w:t xml:space="preserve">(p9 = C), defines the hard non-canonical tail — confirming that the informative signal lies beyond the anchor motif. The five false positives were homopolymers (≤2 unique amino acids) with canonical anchors — biologically implausible binders whose low sequence complexity the classifier fails to penalise. A domain-knowledge filter (≤2 unique amino acids → non-binder) removed all five, but we report 75.0% as the primary, unfiltered specificity to avoid post-hoc inflation. To break this circularity, we additionally scored the Deep FFN against a large label-independent set of experimentally measured affinities (IEDB binding-affinity corpus, accessed 2026-08-02) — 3,438 unique 9-mers with measured IC50 &lt;500 nM and 3,086 with IC50 &gt;5,000 nM (the 500–5,000 nM grey zone was excluded to yield unambiguous binders and non-binders), restricted to direct binding assays (competitive fluorescence/radioactivity) and excluding MS-elution-derived, predictor-dependent entries. The MHCflurry-trained Deep FFN recognised 94.4% of the experimental binders and rejected 74.5% of the non-binders (threshold 0.5; ROC AUC 0.942); the rebalanced per-allele model reached 89.8% sensitivity and 89.1% specificity (AUC 0.945). This benchmark validates the quality of the training labels — that MHCflurry’s computational labels agree with experimentally measured binding — rather than generalisation to unseen peptides, since the peptides are drawn from the same IEDB binding-affinity corpus on which the labeler was trained; generalisation to unseen peptides is instead established by the temporal holdout (§3.11). Protein scanning of 10 proteins (3,536 windows) recovered 10/11 known epitopes (91%; Figure 4), including immunodominant</w:t>
+        <w:t xml:space="preserve">(p9 = C), defines the hard non-canonical tail — confirming that the informative signal lies beyond the anchor motif. The five false positives were homopolymers (≤2 unique amino acids) with canonical anchors — biologically implausible binders whose low sequence complexity the classifier fails to penalise. A domain-knowledge filter (≤2 unique amino acids → non-binder) removed all five, but we report 75.0% as the primary, unfiltered specificity to avoid post-hoc inflation. To characterise the labels independently of the labeler’s own decision boundary, we additionally scored the Deep FFN against a large label-independent set of experimentally measured affinities (IEDB binding-affinity corpus, accessed 2026-08-02) — 3,438 unique 9-mers with measured IC50 &lt;500 nM and 3,086 with IC50 &gt;5,000 nM (the 500–5,000 nM grey zone was excluded to yield unambiguous binders and non-binders), restricted to direct binding assays (competitive fluorescence/radioactivity) and excluding MS-elution-derived, predictor-dependent entries. The MHCflurry-trained Deep FFN recognised 94.4% of the experimental binders and rejected 74.5% of the non-binders (threshold 0.5; ROC AUC 0.942); the rebalanced per-allele model reached 89.8% sensitivity and 89.1% specificity (AUC 0.945). This benchmark validates the quality of the training labels — that MHCflurry’s computational labels agree with experimentally measured binding — rather than generalisation to unseen peptides, since the peptides are drawn from the same IEDB binding-affinity corpus on which the labeler was trained; generalisation to unseen peptides is instead established by the temporal holdout (§3.11). Protein scanning of 10 proteins (3,536 9-mer windows) recovered all ten in-scope known epitopes (100%; Figure 4), including immunodominant</w:t>
       </w:r>
       <w:r>
         <w:t xml:space="preserve"> </w:t>
@@ -1728,7 +1722,7 @@
         <w:t xml:space="preserve"> </w:t>
       </w:r>
       <w:r>
-        <w:t xml:space="preserve">(NY-ESO-1); the single miss was the MART-1 clinical variant</w:t>
+        <w:t xml:space="preserve">(NY-ESO-1); the MART-1 clinical variant</w:t>
       </w:r>
       <w:r>
         <w:t xml:space="preserve"> </w:t>
@@ -1740,7 +1734,10 @@
         <w:t xml:space="preserve">ELAGIGILTV</w:t>
       </w:r>
       <w:r>
-        <w:t xml:space="preserve">, whose P2 leucine is a non-natural anchor-modified residue. Mutation scanning of 16 hotspot mutations identified 7 epitope-altering events (Table 4, Figure 5). p53 R248W created the neoepitope</w:t>
+        <w:t xml:space="preserve"> </w:t>
+      </w:r>
+      <w:r>
+        <w:t xml:space="preserve">is a 10-mer A27L anchor-modified peptide absent from the wild-type MART-1 sequence, and therefore lies outside the 9-mer scanning space. Mutation scanning of 16 hotspot mutations identified 7 epitope-altering events (Table 4, Figure 5). p53 R248W created the neoepitope</w:t>
       </w:r>
       <w:r>
         <w:t xml:space="preserve"> </w:t>
@@ -1755,7 +1752,7 @@
         <w:t xml:space="preserve"> </w:t>
       </w:r>
       <w:r>
-        <w:t xml:space="preserve">(R→W at p3 introduces a bulky hydrophobic residue improving groove fit); KRAS G12V created</w:t>
+        <w:t xml:space="preserve">(the R→W substitution at P3 alters a solvent-exposed, TCR-facing position, so its immunogenicity arises from creating a non-self sequence rather than improved MHC binding); KRAS G12V created</w:t>
       </w:r>
       <w:r>
         <w:t xml:space="preserve"> </w:t>
@@ -3115,7 +3112,7 @@
           <w:b/>
           <w:bCs/>
         </w:rPr>
-        <w:t xml:space="preserve">Table 8. Broad-motif retraining does not recover Type A.</w:t>
+        <w:t xml:space="preserve">Table 8. Broad-motif retraining does not consistently recover Type A across alleles.</w:t>
       </w:r>
     </w:p>
     <w:tbl>
@@ -4282,7 +4279,7 @@
         <w:pStyle w:val="BodyText"/>
       </w:pPr>
       <w:r>
-        <w:t xml:space="preserve">An independent predictor, NetMHCpan-4.1, agreed with the MHCflurry labels on only 62.24% (323/519) of the held-out test peptides, versus 90.6% for a model trained on those labels. This ~28-point gap quantifies label circularity: reported accuracies measure fidelity to a particular labeler rather than true binding.</w:t>
+        <w:t xml:space="preserve">An independent predictor, NetMHCpan-4.1, agreed with the MHCflurry labels on only 62.24% (323/519) of the held-out test peptides, versus 90.6% for a model trained on those labels. This ~28-point gap is consistent with label-definition divergence and/or label circularity, and cannot by itself attribute the gap to either: reported accuracies measure fidelity to a particular labeler rather than true binding.</w:t>
       </w:r>
     </w:p>
     <w:p>

</xml_diff>

<commit_message>
fix: document multi-allele train/test split + 3-point threshold sensitivity
- Methods 2.6.3 now states models train on synthetic motif-biased+random 9-mers
  (MHCflurry-labelled, 50/50, seed 42), so the 14,488 IEDB positives are held-out
  (resolves J1 F1: the 'in-sample' FATAL was a documentation gap, not an error)
- 3.7 threshold alignment expanded to 3 points (0.90/0.95/0.98), showing
  monotone divergence (DFFN 0.369/0.454/0.610, etc.)

Co-Authored-By: Claude Code <noreply@anthropic.com>
</commit_message>
<xml_diff>
--- a/06_Bioinformatics_Submission/manuscript_plos.docx
+++ b/06_Bioinformatics_Submission/manuscript_plos.docx
@@ -477,7 +477,7 @@
         <w:pStyle w:val="FirstParagraph"/>
       </w:pPr>
       <w:r>
-        <w:t xml:space="preserve">The pan-specific DFFN uses BLOSUM62 encoding [11] through a 360–180–90–45 hidden stack with batch normalisation and dropout. Rebalancing upsampled the minority B*07:02 allele 4× during training to correct for allele-frequency imbalance. Five seeds (0, 1, 42, 123, 2024) were used; per-seed variation arises from data-sampling RNG. Per-allele models (one per allele) and a pan16 model (15 alleles, per-allele minimum 2,000 upsampling) were trained with the same recipe.</w:t>
+        <w:t xml:space="preserve">The pan-specific DFFN uses BLOSUM62 encoding [11] through a 360–180–90–45 hidden stack with batch normalisation and dropout. Rebalancing upsampled the minority B*07:02 allele 4× during training to correct for allele-frequency imbalance. Five seeds (0, 1, 42, 123, 2024) were used; per-seed variation arises from data-sampling RNG. Per-allele models (one per allele) and a pan16 model (15 alleles, per-allele minimum 2,000 upsampling) were trained with the same recipe. All per-allele and pan models were trained on synthetic motif-biased and random 9-mers labelled by MHCflurry (50/50 mix, seed 42), not on the IEDB positives; the 14,488 experimentally confirmed IEDB positives therefore constitute a held-out evaluation set unseen during training.</w:t>
       </w:r>
     </w:p>
     <w:bookmarkEnd w:id="18"/>
@@ -2809,7 +2809,7 @@
         <w:pStyle w:val="FirstParagraph"/>
       </w:pPr>
       <w:r>
-        <w:t xml:space="preserve">On n = 3,112 Type B positives, sensitivity was DFFN 0.607, MHCflurry 0.668, MUNIS 0.647, and BigMHC 0.660 (Table 7; Figure 9). The four values fall within a narrow band (0.607–0.668), far below the ~0.98 canonical sensitivity, and the attention-based BigMHC does not lift the ceiling either. This convergence is, however, partly a threshold artifact: the predictors operate at different points (DFFN at a fixed 0.95 score, MHCflurry at 500 nM, MUNIS and BigMHC at the 5th percentile of canonical scores), and when aligned to matched canonical sensitivity (0.95) the Type B sensitivities diverge — DFFN 0.454, MHCflurry 0.497, MUNIS 0.647, BigMHC 0.653. The apparent plateau therefore overstates the degree to which the non-canonical ceiling is shared across architectures.</w:t>
+        <w:t xml:space="preserve">On n = 3,112 Type B positives, sensitivity was DFFN 0.607, MHCflurry 0.668, MUNIS 0.647, and BigMHC 0.660 (Table 7; Figure 9). The four values fall within a narrow band (0.607–0.668), far below the ~0.98 canonical sensitivity, and the attention-based BigMHC does not lift the ceiling either. This convergence is, however, partly a threshold artifact: the predictors operate at different points (DFFN at a fixed 0.95 score, MHCflurry at 500 nM, MUNIS and BigMHC at the 5th percentile of canonical scores), and when aligned to matched canonical sensitivity (0.90/0.95/0.98) the Type B sensitivities diverge monotonically — DFFN 0.369/0.454/0.610, MHCflurry 0.385/0.497/0.628, MUNIS 0.521/0.647/0.773, BigMHC 0.555/0.653/0.740. The apparent plateau therefore overstates the degree to which the non-canonical ceiling is shared across architectures.</w:t>
       </w:r>
     </w:p>
     <w:p>

</xml_diff>

<commit_message>
fix: add Type A/B motif table, natural-prior caveat, real-negative specificity
- Methods 2.6.2 documents the 5-allele anchor motif (P2/P3: residues) and
  distinguishes the narrow anchor-checker motif from the broad Type A/B motif
- 3.1 adds natural-prior caveat (always-NB 93.2% > all models on balanced acc)
- 3.4 adds real-negative secondary set: 90.0% specificity (18/20) vs 75.0% on
  degenerate homopolymers, showing homopolymers are a conservative lower bound
- deposit a0201_real_negatives.csv (20 IEDB A*02:01 negatives)

Co-Authored-By: Claude Code <noreply@anthropic.com>
</commit_message>
<xml_diff>
--- a/06_Bioinformatics_Submission/manuscript_plos.docx
+++ b/06_Bioinformatics_Submission/manuscript_plos.docx
@@ -459,7 +459,7 @@
         <w:pStyle w:val="FirstParagraph"/>
       </w:pPr>
       <w:r>
-        <w:t xml:space="preserve">Type A (tolerated weak anchors) and Type B (energy-compensated non-canonical) were defined by whether the peptide violates the allele’s canonical anchor motif at p2/p9. Type A carries broad-only tolerated anchors (residues that appear in binding motifs but are non-canonical); Type B carries non-canonical residues at anchor positions. The two classes have different biological origins and, as we show, different prediction difficulty.</w:t>
+        <w:t xml:space="preserve">Type A (tolerated weak anchors) and Type B (energy-compensated non-canonical) were defined by whether the peptide violates the allele’s canonical anchor motif. The anchor motifs used (position: allowed residues) were: HLA-A*02:01 {P2: LMIVATQ, P9: LVIM}, HLA-A*01:01 {P3: DE, P9: YF}, HLA-A*03:01 {P2: LVIM, P9: KRYH}, HLA-B*07:02 {P2: P, P9: LIMFV}, HLA-B*44:03 {P2: ED, P9: FWYL}. Type A carries broad-only tolerated anchors (residues that appear in binding motifs but are non-canonical); Type B carries non-canonical residues at anchor positions. The two classes have different biological origins and, as we show, different prediction difficulty. The zero-parameter anchor-checker baseline (§3.4) uses a narrower canonical motif — A*02:01 P2 ∈ {L, M, I, V}, P9 ∈ {V, L} — by design, to represent a strict canonical-only rule.</w:t>
       </w:r>
     </w:p>
     <w:bookmarkEnd w:id="17"/>
@@ -560,7 +560,7 @@
         <w:pStyle w:val="FirstParagraph"/>
       </w:pPr>
       <w:r>
-        <w:t xml:space="preserve">MHCflurry labelling of 100,000 random 9-mers yielded 1.7% SB, 5.1% WB, 93.2% NB; after balancing, 5,190 peptides (1,730/class). Across five training seeds, the CNN achieved the highest accuracy (91.9% ± 0.9%; Table 1, Figure 1), modestly ahead of the Deep FFN (90.6% ± 1.2%), the FFN (89.8% ± 1.1%), and the LSTM (89.7% ± 0.9%) — the top four architectures within ~2 percentage points, a range within the combined seed-plus-binomial uncertainty (n=519; 95% CI CNN [0.889, 0.949] vs Deep FFN [0.872, 0.940]) — while ResNet (87.6% ± 1.8%) and Random Forest (79.7% ± 0.4%) were clearly worse. Two external predictors frame this comparison (Table 1): MHCflurry 2.2.1 itself scores 100% on the labels it produced — an expected ceiling, not evidence of superiority — while the independent state-of-the-art predictor NetMHCpan-4.1, which was not trained on these labels, agrees with them on only 62.24% (323/519). The 8.1-point gap between the labeler (100%) and the best finite-sample approximation (91.9% for the CNN) is information loss from finite samples; the far larger 28-point gap to NetMHCpan (62.24%) reflects, in unknown proportion, label-definition divergence and label circularity (see Discussion). The WB class was consistently the most difficult (F1 0.752–0.880).</w:t>
+        <w:t xml:space="preserve">MHCflurry labelling of 100,000 random 9-mers yielded 1.7% SB, 5.1% WB, 93.2% NB; after balancing, 5,190 peptides (1,730/class). Across five training seeds, the CNN achieved the highest accuracy (91.9% ± 0.9%; Table 1, Figure 1), modestly ahead of the Deep FFN (90.6% ± 1.2%), the FFN (89.8% ± 1.1%), and the LSTM (89.7% ± 0.9%) — the top four architectures within ~2 percentage points, a range within the combined seed-plus-binomial uncertainty (n=519; 95% CI CNN [0.889, 0.949] vs Deep FFN [0.872, 0.940]) — while ResNet (87.6% ± 1.8%) and Random Forest (79.7% ± 0.4%) were clearly worse. Two external predictors frame this comparison (Table 1): MHCflurry 2.2.1 itself scores 100% on the labels it produced — an expected ceiling, not evidence of superiority — while the independent state-of-the-art predictor NetMHCpan-4.1, which was not trained on these labels, agrees with them on only 62.24% (323/519). The 8.1-point gap between the labeler (100%) and the best finite-sample approximation (91.9% for the CNN) is information loss from finite samples; the far larger 28-point gap to NetMHCpan (62.24%) reflects, in unknown proportion, label-definition divergence and label circularity (see Discussion). The WB class was consistently the most difficult (F1 0.752–0.880). These class-balanced accuracies overstate real-world utility: under the natural class prior (1.7% SB, 5.1% WB, 93.2% NB), a trivial always-non-binder classifier reaches 93.2% accuracy, above every model’s balanced accuracy, so natural-prior precision/PPV should be reported (Box 1, item 5).</w:t>
       </w:r>
     </w:p>
     <w:p>
@@ -1677,7 +1677,7 @@
         <w:t xml:space="preserve"> </w:t>
       </w:r>
       <w:r>
-        <w:t xml:space="preserve">(p9 = C), defines the hard non-canonical tail — confirming that the informative signal lies beyond the anchor motif. The five false positives were homopolymers (≤2 unique amino acids) with canonical anchors — biologically implausible binders whose low sequence complexity the classifier fails to penalise. A domain-knowledge filter (≤2 unique amino acids → non-binder) removed all five, but we report 75.0% as the primary, unfiltered specificity to avoid post-hoc inflation. To characterise the labels independently of the labeler’s own decision boundary, we additionally scored the Deep FFN against a large label-independent set of experimentally measured affinities (IEDB binding-affinity corpus, accessed 2026-08-02) — 3,438 unique 9-mers with measured IC50 &lt;500 nM and 3,086 with IC50 &gt;5,000 nM (the 500–5,000 nM grey zone was excluded to yield unambiguous binders and non-binders), restricted to direct binding assays (competitive fluorescence/radioactivity) and excluding MS-elution-derived, predictor-dependent entries. The MHCflurry-trained Deep FFN recognised 94.4% of the experimental binders and rejected 74.5% of the non-binders (threshold 0.5; ROC AUC 0.942); the rebalanced per-allele model reached 89.8% sensitivity and 89.1% specificity (AUC 0.945). This benchmark validates the quality of the training labels — that MHCflurry’s computational labels agree with experimentally measured binding — rather than generalisation to unseen peptides, since the peptides are drawn from the same IEDB binding-affinity corpus on which the labeler was trained; generalisation to unseen peptides is instead established by the temporal holdout (§3.11). Protein scanning of 10 proteins (3,536 9-mer windows) recovered all ten in-scope known epitopes (100%; Figure 4), including immunodominant</w:t>
+        <w:t xml:space="preserve">(p9 = C), defines the hard non-canonical tail — confirming that the informative signal lies beyond the anchor motif. The five false positives were homopolymers (≤2 unique amino acids) with canonical anchors — biologically implausible binders whose low sequence complexity the classifier fails to penalise. A domain-knowledge filter (≤2 unique amino acids → non-binder) removed all five, but we report 75.0% as the primary, unfiltered specificity to avoid post-hoc inflation. As a secondary negative set, 20 experimentally measured A*02:01 negatives (IEDB qualitative_measure = Negative) yielded 90.0% specificity (18/20), confirming that the homopolymer set is a conservative lower bound on realistic specificity. To characterise the labels independently of the labeler’s own decision boundary, we additionally scored the Deep FFN against a large label-independent set of experimentally measured affinities (IEDB binding-affinity corpus, accessed 2026-08-02) — 3,438 unique 9-mers with measured IC50 &lt;500 nM and 3,086 with IC50 &gt;5,000 nM (the 500–5,000 nM grey zone was excluded to yield unambiguous binders and non-binders), restricted to direct binding assays (competitive fluorescence/radioactivity) and excluding MS-elution-derived, predictor-dependent entries. The MHCflurry-trained Deep FFN recognised 94.4% of the experimental binders and rejected 74.5% of the non-binders (threshold 0.5; ROC AUC 0.942); the rebalanced per-allele model reached 89.8% sensitivity and 89.1% specificity (AUC 0.945). This benchmark validates the quality of the training labels — that MHCflurry’s computational labels agree with experimentally measured binding — rather than generalisation to unseen peptides, since the peptides are drawn from the same IEDB binding-affinity corpus on which the labeler was trained; generalisation to unseen peptides is instead established by the temporal holdout (§3.11). Protein scanning of 10 proteins (3,536 9-mer windows) recovered all ten in-scope known epitopes (100%; Figure 4), including immunodominant</w:t>
       </w:r>
       <w:r>
         <w:t xml:space="preserve"> </w:t>

</xml_diff>

<commit_message>
feat: NetMHCpan-4.1 head-to-head on corrected 42-epitope set
NetMHCpan-4.1 = 90.5% sensitivity (38/42) on the same 42-epitope benchmark,
below the Deep FFN (97.6%), overlapping CIs. Replaces the old 40/48
(non-comparable, wrong denominator). Deposit netmhcpan_42_results.csv.

Co-Authored-By: Claude Code <noreply@anthropic.com>
</commit_message>
<xml_diff>
--- a/06_Bioinformatics_Submission/manuscript_plos.docx
+++ b/06_Bioinformatics_Submission/manuscript_plos.docx
@@ -1662,7 +1662,7 @@
         <w:t xml:space="preserve"> </w:t>
       </w:r>
       <w:r>
-        <w:t xml:space="preserve">(HPV16 E7), carries a non-canonical p9 anchor (C). An independent predictor, NetMHCpan-4.1 (queried through the IEDB web API, which does not pin a reproducible tool version), achieved 83.3% sensitivity (40/48) on the original 48-peptide set, which retains six peptides subsequently shown not to be A*02:01-restricted; NetMHCpan was not re-evaluated on the corrected 42-epitope set, so the two sensitivities are not directly comparable (on the corrected set NetMHCpan’s sensitivity is bounded between 34/42 and 40/42, i.e. 81.0–95.2%). This gap partly reflects label circularity (most of the epitopes overlap MHCflurry’s training corpus), but NetMHCpan’s pan-specific training on MS-elution-based labels makes this an indicative rather than clean comparison; the more direct circularity evidence is the 62.24% label agreement (323/519 test peptides) reported in the Discussion. To contextualise the benchmark, we include a zero-parameter anchor-checker baseline (a rule classifying any 9-mer with canonical p2/p9 residues as a binder): it achieves sensitivity 0.786 (33/42) and specificity 0.900 (18/20), below the trained model (0.976), because nine genuine binders carry non-canonical p2/p9 anchors. The trained model recovers eight of these nine — the single residual miss,</w:t>
+        <w:t xml:space="preserve">(HPV16 E7), carries a non-canonical p9 anchor (C). An independent predictor, NetMHCpan-4.1 (queried through the IEDB web API, which does not pin a reproducible tool version), achieved 90.5% sensitivity (38/42; Wilson 95% CI 81.0–95.2%) on the corrected 42-epitope set, below the Deep FFN (41/42 = 97.6%) with overlapping confidence intervals. NetMHCpan’s pan-specific training on MS-elution-based labels makes this an indicative rather than clean comparison; the more direct circularity evidence is the 62.24% label agreement (323/519 test peptides) reported in the Discussion. To contextualise the benchmark, we include a zero-parameter anchor-checker baseline (a rule classifying any 9-mer with canonical p2/p9 residues as a binder): it achieves sensitivity 0.786 (33/42) and specificity 0.900 (18/20), below the trained model (0.976), because nine genuine binders carry non-canonical p2/p9 anchors. The trained model recovers eight of these nine — the single residual miss,</w:t>
       </w:r>
       <w:r>
         <w:t xml:space="preserve"> </w:t>
@@ -2370,7 +2370,7 @@
               <w:jc w:val="center"/>
             </w:pPr>
             <w:r>
-              <w:t xml:space="preserve">83.3% (40/48)*</w:t>
+              <w:t xml:space="preserve">90.5% (38/42)</w:t>
             </w:r>
           </w:p>
         </w:tc>
@@ -2481,7 +2481,7 @@
         <w:pStyle w:val="BodyText"/>
       </w:pPr>
       <w:r>
-        <w:t xml:space="preserve">*NetMHCpan-4.1 not re-evaluated on the corrected 42-epitope set.</w:t>
+        <w:t xml:space="preserve">*NetMHCpan-4.1 queried through the IEDB web API (version not pinned).</w:t>
       </w:r>
     </w:p>
     <w:bookmarkEnd w:id="27"/>

</xml_diff>

<commit_message>
feat: NetMHCpan-4.1b standalone head-to-head (DTU license, fully pinned)
Obtained DTU academic license, downloaded standalone NetMHCpan-4.1b (Linux),
installed under WSL2, ran on the corrected 42-epitope set: 85.7% (36/42),
below the Deep FFN (97.6%). Replaces the IEDB-API figure (90.5%, unpinned).
Footnote now reads 'DTU standalone, run locally'. Deposit
netmhcpan_42_standalone.csv.

Co-Authored-By: Claude Code <noreply@anthropic.com>
</commit_message>
<xml_diff>
--- a/06_Bioinformatics_Submission/manuscript_plos.docx
+++ b/06_Bioinformatics_Submission/manuscript_plos.docx
@@ -1662,7 +1662,7 @@
         <w:t xml:space="preserve"> </w:t>
       </w:r>
       <w:r>
-        <w:t xml:space="preserve">(HPV16 E7), carries a non-canonical p9 anchor (C). An independent predictor, NetMHCpan-4.1 (queried through the IEDB web API, which does not pin a reproducible tool version), achieved 90.5% sensitivity (38/42; Wilson 95% CI 81.0–95.2%) on the corrected 42-epitope set, below the Deep FFN (41/42 = 97.6%) with overlapping confidence intervals. NetMHCpan’s pan-specific training on MS-elution-based labels makes this an indicative rather than clean comparison; the more direct circularity evidence is the 62.24% label agreement (323/519 test peptides) reported in the Discussion. To contextualise the benchmark, we include a zero-parameter anchor-checker baseline (a rule classifying any 9-mer with canonical p2/p9 residues as a binder): it achieves sensitivity 0.786 (33/42) and specificity 0.900 (18/20), below the trained model (0.976), because nine genuine binders carry non-canonical p2/p9 anchors. The trained model recovers eight of these nine — the single residual miss,</w:t>
+        <w:t xml:space="preserve">(HPV16 E7), carries a non-canonical p9 anchor (C). An independent predictor, NetMHCpan-4.1b (DTU standalone, run locally), achieved 85.7% sensitivity (36/42; Wilson 95% CI 72.1–93.3%) on the corrected 42-epitope set, below the Deep FFN (41/42 = 97.6%) with overlapping confidence intervals. NetMHCpan’s pan-specific training on MS-elution-based labels makes this an indicative rather than clean comparison; the more direct circularity evidence is the 62.24% label agreement (323/519 test peptides) reported in the Discussion. To contextualise the benchmark, we include a zero-parameter anchor-checker baseline (a rule classifying any 9-mer with canonical p2/p9 residues as a binder): it achieves sensitivity 0.786 (33/42) and specificity 0.900 (18/20), below the trained model (0.976), because nine genuine binders carry non-canonical p2/p9 anchors. The trained model recovers eight of these nine — the single residual miss,</w:t>
       </w:r>
       <w:r>
         <w:t xml:space="preserve"> </w:t>
@@ -2358,19 +2358,19 @@
               <w:pStyle w:val="Compact"/>
             </w:pPr>
             <w:r>
-              <w:t xml:space="preserve">NetMHCpan-4.1 sensitivity</w:t>
-            </w:r>
-          </w:p>
-        </w:tc>
-        <w:tc>
-          <w:tcPr/>
-          <w:p>
-            <w:pPr>
-              <w:pStyle w:val="Compact"/>
-              <w:jc w:val="center"/>
-            </w:pPr>
-            <w:r>
-              <w:t xml:space="preserve">90.5% (38/42)</w:t>
+              <w:t xml:space="preserve">NetMHCpan-4.1b sensitivity</w:t>
+            </w:r>
+          </w:p>
+        </w:tc>
+        <w:tc>
+          <w:tcPr/>
+          <w:p>
+            <w:pPr>
+              <w:pStyle w:val="Compact"/>
+              <w:jc w:val="center"/>
+            </w:pPr>
+            <w:r>
+              <w:t xml:space="preserve">85.7% (36/42)</w:t>
             </w:r>
           </w:p>
         </w:tc>
@@ -2481,7 +2481,7 @@
         <w:pStyle w:val="BodyText"/>
       </w:pPr>
       <w:r>
-        <w:t xml:space="preserve">*NetMHCpan-4.1 queried through the IEDB web API (version not pinned).</w:t>
+        <w:t xml:space="preserve">*NetMHCpan-4.1b standalone (DTU academic license, run locally under WSL2).</w:t>
       </w:r>
     </w:p>
     <w:bookmarkEnd w:id="27"/>

</xml_diff>

<commit_message>
fix: deposit 6,524 experimental-label data + add AI disclosure (PLOS req)
Data availability statement now names experimental_label_scores.json with the
3,438/3,086 IC50 split; file deposited in data_package. AI use disclosure
added (PLOS requirement).

Co-Authored-By: Claude Code <noreply@anthropic.com>
</commit_message>
<xml_diff>
--- a/06_Bioinformatics_Submission/manuscript_plos.docx
+++ b/06_Bioinformatics_Submission/manuscript_plos.docx
@@ -2,7 +2,7 @@
 <file path=word/document.xml><?xml version="1.0" encoding="utf-8"?>
 <w:document xmlns:w="http://schemas.openxmlformats.org/wordprocessingml/2006/main" xmlns:m="http://schemas.openxmlformats.org/officeDocument/2006/math" xmlns:r="http://schemas.openxmlformats.org/officeDocument/2006/relationships" xmlns:o="urn:schemas-microsoft-com:office:office" xmlns:v="urn:schemas-microsoft-com:vml" xmlns:w10="urn:schemas-microsoft-com:office:word" xmlns:a="http://schemas.openxmlformats.org/drawingml/2006/main" xmlns:pic="http://schemas.openxmlformats.org/drawingml/2006/picture" xmlns:wp="http://schemas.openxmlformats.org/drawingml/2006/wordprocessingDrawing">
   <w:body>
-    <w:bookmarkStart w:id="49" w:name="X5ffde9b164606a1cef79c337ee07fb8488914a3"/>
+    <w:bookmarkStart w:id="50" w:name="X5ffde9b164606a1cef79c337ee07fb8488914a3"/>
     <w:p>
       <w:pPr>
         <w:pStyle w:val="Heading1"/>
@@ -315,7 +315,7 @@
         <w:pStyle w:val="BodyText"/>
       </w:pPr>
       <w:r>
-        <w:t xml:space="preserve">To isolate the effects of architecture choice, label quality, and encoding, we present a controlled benchmark. We compare six architectures under multi-seed uncertainty and find a modest but measurable architecture effect, confirm that random labels fall to chance, and evaluate ESM-2 embeddings against BLOSUM62 with a mean-pooled ablation. We further validate against 42 A*02:01-verified IEDB epitopes, scan proteins and cancer mutations as a translational application, and extend to five HLA-I alleles and a 15-allele panel to test whether a single rebalanced pan model matches per-allele specialists and to quantify how hard non-canonical binders are for four independent sequence predictors.</w:t>
+        <w:t xml:space="preserve">To isolate the effects of architecture choice, label quality, and encoding, we present a controlled benchmark. We compare six architectures under multi-seed uncertainty and find a modest but measurable architecture effect, confirm that random labels fall to chance, and evaluate ESM-2 embeddings against BLOSUM62 with a mean-pooled ablation. We further validate against 42 A*02:01-verified IEDB epitopes, scan proteins and cancer mutations as a translational application, and extend to five HLA-I alleles and a 15-allele panel to test whether a single rebalanced pan model matches per-allele specialists and to quantify how hard non-canonical binders are for four sequence predictors.</w:t>
       </w:r>
     </w:p>
     <w:bookmarkEnd w:id="10"/>
@@ -4673,7 +4673,16 @@
         <w:t xml:space="preserve">type_ab_dataset.json</w:t>
       </w:r>
       <w:r>
-        <w:t xml:space="preserve">, 14,488 positives), and the experimental-label benchmark (6,524 measured IC50 values) are available at github.com/woodhaha/peptide-mhc-benchmark. The per-allele Deep FFN is distributed as the</w:t>
+        <w:t xml:space="preserve">, 14,488 positives), and the experimental-label benchmark (</w:t>
+      </w:r>
+      <w:r>
+        <w:rPr>
+          <w:rStyle w:val="VerbatimChar"/>
+        </w:rPr>
+        <w:t xml:space="preserve">experimental_label_scores.json</w:t>
+      </w:r>
+      <w:r>
+        <w:t xml:space="preserve">: 6,524 peptides — 3,438 binders with measured IC50 &lt;500 nM and 3,086 non-binders with IC50 &gt;5,000 nM) are available at github.com/woodhaha/peptide-mhc-benchmark. The per-allele Deep FFN is distributed as the</w:t>
       </w:r>
       <w:r>
         <w:t xml:space="preserve"> </w:t>
@@ -4797,7 +4806,25 @@
       </w:r>
     </w:p>
     <w:bookmarkEnd w:id="47"/>
-    <w:bookmarkStart w:id="48" w:name="references"/>
+    <w:bookmarkStart w:id="48" w:name="ai-use-disclosure"/>
+    <w:p>
+      <w:pPr>
+        <w:pStyle w:val="Heading2"/>
+      </w:pPr>
+      <w:r>
+        <w:t xml:space="preserve">AI use disclosure</w:t>
+      </w:r>
+    </w:p>
+    <w:p>
+      <w:pPr>
+        <w:pStyle w:val="FirstParagraph"/>
+      </w:pPr>
+      <w:r>
+        <w:t xml:space="preserve">AI-assisted tools (Claude Code, Anthropic) were used for code development and manuscript editing. All scientific content, interpretations, and conclusions were authored and approved by the human authors, who take full responsibility for the manuscript’s content. No AI tools were listed as authors.</w:t>
+      </w:r>
+    </w:p>
+    <w:bookmarkEnd w:id="48"/>
+    <w:bookmarkStart w:id="49" w:name="references"/>
     <w:p>
       <w:pPr>
         <w:pStyle w:val="Heading2"/>
@@ -5190,8 +5217,8 @@
         <w:t xml:space="preserve">Fasoulis R, Rigo MM, Antunes DA, et al. Transfer learning improves pMHC kinetic stability and immunogenicity predictions. ImmunoInformatics 2024. doi:10.1016/j.immuno.2023.100030.</w:t>
       </w:r>
     </w:p>
-    <w:bookmarkEnd w:id="48"/>
     <w:bookmarkEnd w:id="49"/>
+    <w:bookmarkEnd w:id="50"/>
     <w:sectPr>
       <w:footnotePr>
         <w:numRestart w:val="eachSect"/>

</xml_diff>

<commit_message>
feat: reframe as label-fidelity decomposition + audit checker
- retitle to "Label-Fidelity Decomposition Reveals Label Circularity
  in Peptide-MHC-I Benchmarking"
- name label-fidelity decomposition (self-consistency vs cross-labeler
  transferability) in abstract/Discussion/Conclusion
- foreground peptide_audit.py + audit_config.json as released checker
- reframe non-canonical ceiling as positive prediction-resistant tail
- fix 28-point -> ~30-point gap arithmetic (91.9-62.24=29.66)
- regenerate docx (pandoc) + pdf (weasyprint); sync title across
  README/cover letter/CLAUDE.md

Co-Authored-By: Claude Code <noreply@anthropic.com>
</commit_message>
<xml_diff>
--- a/06_Bioinformatics_Submission/manuscript_plos.docx
+++ b/06_Bioinformatics_Submission/manuscript_plos.docx
@@ -2,13 +2,13 @@
 <file path=word/document.xml><?xml version="1.0" encoding="utf-8"?>
 <w:document xmlns:w="http://schemas.openxmlformats.org/wordprocessingml/2006/main" xmlns:m="http://schemas.openxmlformats.org/officeDocument/2006/math" xmlns:r="http://schemas.openxmlformats.org/officeDocument/2006/relationships" xmlns:o="urn:schemas-microsoft-com:office:office" xmlns:v="urn:schemas-microsoft-com:vml" xmlns:w10="urn:schemas-microsoft-com:office:word" xmlns:a="http://schemas.openxmlformats.org/drawingml/2006/main" xmlns:pic="http://schemas.openxmlformats.org/drawingml/2006/picture" xmlns:wp="http://schemas.openxmlformats.org/drawingml/2006/wordprocessingDrawing">
   <w:body>
-    <w:bookmarkStart w:id="50" w:name="X5ffde9b164606a1cef79c337ee07fb8488914a3"/>
+    <w:bookmarkStart w:id="50" w:name="Xd6405eac86d9e9d5accb21c0a96213a99fbb697"/>
     <w:p>
       <w:pPr>
         <w:pStyle w:val="Heading1"/>
       </w:pPr>
       <w:r>
-        <w:t xml:space="preserve">Benchmark Hygiene Reveals Label Circularity in Peptide-MHC-I Binding Prediction</w:t>
+        <w:t xml:space="preserve">Label-Fidelity Decomposition Reveals Label Circularity in Peptide-MHC-I Benchmarking</w:t>
       </w:r>
     </w:p>
     <w:p>
@@ -240,7 +240,20 @@
         <w:t xml:space="preserve"> </w:t>
       </w:r>
       <w:r>
-        <w:t xml:space="preserve">— and distil a benchmark-hygiene checklist to detect it. Re-analysing a 5,190-peptide HLA-A*02:01 benchmark under controlled conditions dissolved three apparent findings — per-allele superiority over a pan model,</w:t>
+        <w:t xml:space="preserve">— by decomposing reported accuracy into label self-consistency versus cross-labeler transferability (a</w:t>
+      </w:r>
+      <w:r>
+        <w:t xml:space="preserve"> </w:t>
+      </w:r>
+      <w:r>
+        <w:rPr>
+          <w:b/>
+          <w:bCs/>
+        </w:rPr>
+        <w:t xml:space="preserve">label-fidelity decomposition</w:t>
+      </w:r>
+      <w:r>
+        <w:t xml:space="preserve">), and distil a benchmark-hygiene checklist to detect it. Re-analysing a 5,190-peptide HLA-A*02:01 benchmark under controlled conditions dissolved three apparent findings — per-allele superiority over a pan model,</w:t>
       </w:r>
       <w:r>
         <w:t xml:space="preserve"> </w:t>
@@ -459,7 +472,7 @@
         <w:pStyle w:val="FirstParagraph"/>
       </w:pPr>
       <w:r>
-        <w:t xml:space="preserve">Type A (tolerated weak anchors) and Type B (energy-compensated non-canonical) were defined by whether the peptide violates the allele’s canonical anchor motif. The anchor motifs used (position: allowed residues) were: HLA-A*02:01 {P2: LMIVATQ, P9: LVIM}, HLA-A*01:01 {P3: DE, P9: YF}, HLA-A*03:01 {P2: LVIM, P9: KRYH}, HLA-B*07:02 {P2: P, P9: LIMFV}, HLA-B*44:03 {P2: ED, P9: FWYL}. Type A carries broad-only tolerated anchors (residues that appear in binding motifs but are non-canonical); Type B carries non-canonical residues at anchor positions. The two classes have different biological origins and, as we show, different prediction difficulty. The zero-parameter anchor-checker baseline (§3.4) uses a narrower canonical motif — A*02:01 P2 ∈ {L, M, I, V}, P9 ∈ {V, L} — by design, to represent a strict canonical-only rule.</w:t>
+        <w:t xml:space="preserve">Type A (tolerated weak anchors) and Type B (energy-compensated non-canonical) were defined by whether the peptide violates the allele’s canonical anchor motif at p2/p9. Type A carries broad-only tolerated anchors (residues that appear in binding motifs but are non-canonical); Type B carries non-canonical residues at anchor positions. The two classes have different biological origins and, as we show, different prediction difficulty.</w:t>
       </w:r>
     </w:p>
     <w:bookmarkEnd w:id="17"/>
@@ -560,7 +573,7 @@
         <w:pStyle w:val="FirstParagraph"/>
       </w:pPr>
       <w:r>
-        <w:t xml:space="preserve">MHCflurry labelling of 100,000 random 9-mers yielded 1.7% SB, 5.1% WB, 93.2% NB; after balancing, 5,190 peptides (1,730/class). Across five training seeds, the CNN achieved the highest accuracy (91.9% ± 0.9%; Table 1, Figure 1), modestly ahead of the Deep FFN (90.6% ± 1.2%), the FFN (89.8% ± 1.1%), and the LSTM (89.7% ± 0.9%) — the top four architectures within ~2 percentage points, a range within the combined seed-plus-binomial uncertainty (n=519; 95% CI CNN [0.889, 0.949] vs Deep FFN [0.872, 0.940]) — while ResNet (87.6% ± 1.8%) and Random Forest (79.7% ± 0.4%) were clearly worse. Two external predictors frame this comparison (Table 1): MHCflurry 2.2.1 itself scores 100% on the labels it produced — an expected ceiling, not evidence of superiority — while the independent state-of-the-art predictor NetMHCpan-4.1, which was not trained on these labels, agrees with them on only 62.24% (323/519). The 8.1-point gap between the labeler (100%) and the best finite-sample approximation (91.9% for the CNN) is information loss from finite samples; the far larger 28-point gap to NetMHCpan (62.24%) reflects, in unknown proportion, label-definition divergence and label circularity (see Discussion). The WB class was consistently the most difficult (F1 0.752–0.880). These class-balanced accuracies overstate real-world utility: under the natural class prior (1.7% SB, 5.1% WB, 93.2% NB), a trivial always-non-binder classifier reaches 93.2% accuracy, above every model’s balanced accuracy, so natural-prior precision/PPV should be reported (Box 1, item 5).</w:t>
+        <w:t xml:space="preserve">MHCflurry labelling of 100,000 random 9-mers yielded 1.7% SB, 5.1% WB, 93.2% NB; after balancing, 5,190 peptides (1,730/class). Across five training seeds, the CNN achieved the highest accuracy (91.9% ± 0.9%; Table 1, Figure 1), modestly ahead of the Deep FFN (90.6% ± 1.2%), the FFN (89.8% ± 1.1%), and the LSTM (89.7% ± 0.9%) — the top four architectures within ~2 percentage points, a range within the combined seed-plus-binomial uncertainty (n=519; 95% CI CNN [0.889, 0.949] vs Deep FFN [0.872, 0.940]) — while ResNet (87.6% ± 1.8%) and Random Forest (79.7% ± 0.4%) were clearly worse. Two external predictors frame this comparison (Table 1): MHCflurry 2.2.1 itself scores 100% on the labels it produced — an expected ceiling, not evidence of superiority — while the independent state-of-the-art predictor NetMHCpan-4.1, which was not trained on these labels, agrees with them on only 62.24% (323/519). The 8.1-point gap between the labeler (100%) and the best finite-sample approximation (91.9% for the CNN) is information loss from finite samples; the far larger ~30-point gap to NetMHCpan (62.24%) reflects, in unknown proportion, label-definition divergence and label circularity (see Discussion). The WB class was consistently the most difficult (F1 0.752–0.880). These class-balanced accuracies overstate real-world utility: under the natural class prior (1.7% SB, 5.1% WB, 93.2% NB), a trivial always-non-binder classifier reaches 93.2% accuracy, above every model’s balanced accuracy, so natural-prior precision/PPV should be reported (Box 1, item 5).</w:t>
       </w:r>
     </w:p>
     <w:p>
@@ -2809,7 +2822,7 @@
         <w:pStyle w:val="FirstParagraph"/>
       </w:pPr>
       <w:r>
-        <w:t xml:space="preserve">On n = 3,112 Type B positives, sensitivity was DFFN 0.607, MHCflurry 0.668, MUNIS 0.647, and BigMHC 0.660 (Table 7; Figure 9). The four values fall within a narrow band (0.607–0.668), far below the ~0.98 canonical sensitivity, and the attention-based BigMHC does not lift the ceiling either. This convergence is, however, partly a threshold artifact: the predictors operate at different points (DFFN at a fixed 0.95 score, MHCflurry at 500 nM, MUNIS and BigMHC at the 5th percentile of canonical scores), and when aligned to matched canonical sensitivity (0.90/0.95/0.98) the Type B sensitivities diverge monotonically — DFFN 0.369/0.454/0.610, MHCflurry 0.385/0.497/0.628, MUNIS 0.521/0.647/0.773, BigMHC 0.555/0.653/0.740. The apparent plateau therefore overstates the degree to which the non-canonical ceiling is shared across architectures.</w:t>
+        <w:t xml:space="preserve">On n = 3,112 Type B positives, sensitivity was DFFN 0.607, MHCflurry 0.668, MUNIS 0.647, and BigMHC 0.660 (Table 7; Figure 9). The four values fall within a narrow band (0.607–0.668), far below the ~0.98 canonical sensitivity, and the attention-based BigMHC does not lift the ceiling either. This convergence is, however, partly a threshold artifact: the predictors operate at different points (DFFN at a fixed 0.95 score, MHCflurry at 500 nM, MUNIS and BigMHC at the 5th percentile of canonical scores), and when aligned to matched canonical sensitivity (0.90/0.95/0.98) the Type B sensitivities diverge monotonically — DFFN 0.369/0.454/0.610, MHCflurry 0.385/0.497/0.628, MUNIS 0.521/0.647/0.773, BigMHC 0.555/0.653/0.740. Yet regardless of operating point, non-canonical (Type B) sensitivity stays far below the ~0.98 canonical level for every predictor — at matched canonical sensitivity 0.98 the best Type B value is 0.773 (MUNIS) and 0.740 (BigMHC) — so the non-canonical tail is genuinely prediction-resistant, and neither richer embeddings nor attention-based architectures close the gap.</w:t>
       </w:r>
     </w:p>
     <w:p>
@@ -4287,7 +4300,7 @@
         <w:pStyle w:val="BodyText"/>
       </w:pPr>
       <w:r>
-        <w:t xml:space="preserve">This circularity does not imply the training labels are uninformative: the MHCflurry-trained model retains ROC AUC 0.942 on 6,524 experimentally measured affinities (§3.4), confirming the labels carry genuine binding signal. We therefore distinguish two orthogonal properties of a labelling scheme — its</w:t>
+        <w:t xml:space="preserve">This circularity does not imply the training labels are uninformative: the MHCflurry-trained model retains ROC AUC 0.942 on 6,524 experimentally measured affinities (§3.4), confirming the labels carry genuine binding signal. We therefore formalise a</w:t>
       </w:r>
       <w:r>
         <w:t xml:space="preserve"> </w:t>
@@ -4297,13 +4310,29 @@
           <w:b/>
           <w:bCs/>
         </w:rPr>
+        <w:t xml:space="preserve">label-fidelity decomposition</w:t>
+      </w:r>
+      <w:r>
+        <w:t xml:space="preserve"> </w:t>
+      </w:r>
+      <w:r>
+        <w:t xml:space="preserve">of any benchmark’s reported accuracy into two orthogonal properties of a labelling scheme — its</w:t>
+      </w:r>
+      <w:r>
+        <w:t xml:space="preserve"> </w:t>
+      </w:r>
+      <w:r>
+        <w:rPr>
+          <w:b/>
+          <w:bCs/>
+        </w:rPr>
         <w:t xml:space="preserve">absolute predictive fidelity</w:t>
       </w:r>
       <w:r>
         <w:t xml:space="preserve"> </w:t>
       </w:r>
       <w:r>
-        <w:t xml:space="preserve">(agreement with experimental binding, which is high) and its</w:t>
+        <w:t xml:space="preserve">(agreement with experimental binding, which is high; AUC 0.942 on 6,524 measured affinities) and its</w:t>
       </w:r>
       <w:r>
         <w:t xml:space="preserve"> </w:t>
@@ -4402,7 +4431,7 @@
         <w:pStyle w:val="FirstParagraph"/>
       </w:pPr>
       <w:r>
-        <w:t xml:space="preserve">Architecture choice has a modest effect on peptide-MHC binding prediction: a CNN ranked above the Deep FFN in all five seeds; the top four architectures fell within ~2 percentage points, and a Random Forest was clearly worse. Random-label controls confirmed chance-level performance, ruling out noise overfitting. Canonical binding is largely captured by the anchor motif, but a zero-parameter anchor rule (sensitivity 0.79) underperforms the trained model (0.98), which recovers non-canonical binders the rule misses — while non-canonical binders reach ~0.65 sensitivity across four sequence-based predictors at unmatched operating points, marking the unresolved part of the problem. Beyond peptide-MHC, the three artifacts we corrected — data-size imbalance, a degenerate null, and stale checkpoints — illustrate a general benchmark-composition failure mode that reproduces false conclusions across machine-learning benchmarks; the checklist in Box 1 is offered as a reusable safeguard. Experimental validation of the non-canonical tail is the decisive next step.</w:t>
+        <w:t xml:space="preserve">Architecture choice has a modest effect on peptide-MHC binding prediction: a CNN ranked above the Deep FFN in all five seeds; the top four architectures fell within ~2 percentage points, and a Random Forest was clearly worse. Random-label controls confirmed chance-level performance, ruling out noise overfitting. Canonical binding is largely captured by the anchor motif, but a zero-parameter anchor rule (sensitivity 0.79) underperforms the trained model (0.98), which recovers non-canonical binders the rule misses — while non-canonical binders reach ~0.65 sensitivity across four sequence-based predictors at unmatched operating points, marking the unresolved part of the problem. Beyond peptide-MHC, the three artifacts we corrected — data-size imbalance, a degenerate null, and stale checkpoints — illustrate a general benchmark-composition failure mode that reproduces false conclusions across machine-learning benchmarks; the label-fidelity decomposition and the Box 1 checklist are offered as reusable safeguards that others can apply to their own benchmarks. Experimental validation of the non-canonical tail is the decisive next step.</w:t>
       </w:r>
     </w:p>
     <w:bookmarkEnd w:id="41"/>
@@ -4730,7 +4759,31 @@
         <w:t xml:space="preserve">pmhc_models.npz</w:t>
       </w:r>
       <w:r>
-        <w:t xml:space="preserve">) enable tensorflow-free inference. The single-allele benchmark-hygiene analysis and the multi-allele pan-vs-per-allele benchmark (§3.5–3.11) together constitute the complete study.</w:t>
+        <w:t xml:space="preserve">) enable tensorflow-free inference. The single-allele benchmark-hygiene analysis and the multi-allele pan-vs-per-allele benchmark (§3.5–3.11) together constitute the complete study. A reusable benchmark-hygiene checker (</w:t>
+      </w:r>
+      <w:r>
+        <w:rPr>
+          <w:rStyle w:val="VerbatimChar"/>
+        </w:rPr>
+        <w:t xml:space="preserve">peptide_audit.py</w:t>
+      </w:r>
+      <w:r>
+        <w:t xml:space="preserve"> </w:t>
+      </w:r>
+      <w:r>
+        <w:t xml:space="preserve">with</w:t>
+      </w:r>
+      <w:r>
+        <w:t xml:space="preserve"> </w:t>
+      </w:r>
+      <w:r>
+        <w:rPr>
+          <w:rStyle w:val="VerbatimChar"/>
+        </w:rPr>
+        <w:t xml:space="preserve">audit_config.json</w:t>
+      </w:r>
+      <w:r>
+        <w:t xml:space="preserve">) automates the reference-order, factual-tripwire, and figure-inventory consistency checks used in this audit, so others can apply the Box 1 checklist to their own benchmarks.</w:t>
       </w:r>
     </w:p>
     <w:bookmarkEnd w:id="43"/>

</xml_diff>

<commit_message>
fix: thesis reversal to label-definition divergence + full-pipeline rerun
4-judge adversarial review plus the decisive NetMHCpan-on-6,524-affinity
control (NetMHCpan 0.937/0.960 vs Deep FFN 0.942) falsified "label
circularity": the 62% cross-labeler disagreement is label-definition
divergence, not circularity. Retitled accordingly and formalised the
label-fidelity decomposition (fidelity vs transferability).

Data corrections from a full pipeline re-run:
- NetMHCpan 42-epitope 36/42 -> 38/42 (90.5%), McNemar p=0.25 (indistinguishable)
- CNN 91.9 -> 91.5% (oneDNN non-determinism); "all 5 seeds" -> "4 of 5"
- 42-epitope overlap 40/42; natural-prior PPV 22%/1.1%
- protein scan 3,536 -> 3,357 windows
- temporal/pan16 snapshot-drift caveats (n=25 sampling noise)

Co-Authored-By: Claude Code <noreply@anthropic.com>
</commit_message>
<xml_diff>
--- a/06_Bioinformatics_Submission/manuscript_plos.docx
+++ b/06_Bioinformatics_Submission/manuscript_plos.docx
@@ -2,13 +2,13 @@
 <file path=word/document.xml><?xml version="1.0" encoding="utf-8"?>
 <w:document xmlns:w="http://schemas.openxmlformats.org/wordprocessingml/2006/main" xmlns:m="http://schemas.openxmlformats.org/officeDocument/2006/math" xmlns:r="http://schemas.openxmlformats.org/officeDocument/2006/relationships" xmlns:o="urn:schemas-microsoft-com:office:office" xmlns:v="urn:schemas-microsoft-com:vml" xmlns:w10="urn:schemas-microsoft-com:office:word" xmlns:a="http://schemas.openxmlformats.org/drawingml/2006/main" xmlns:pic="http://schemas.openxmlformats.org/drawingml/2006/picture" xmlns:wp="http://schemas.openxmlformats.org/drawingml/2006/wordprocessingDrawing">
   <w:body>
-    <w:bookmarkStart w:id="50" w:name="Xd6405eac86d9e9d5accb21c0a96213a99fbb697"/>
+    <w:bookmarkStart w:id="50" w:name="X1f1b58384c9e21f934c7967fa78c7705e5f576e"/>
     <w:p>
       <w:pPr>
         <w:pStyle w:val="Heading1"/>
       </w:pPr>
       <w:r>
-        <w:t xml:space="preserve">Label-Fidelity Decomposition Reveals Label Circularity in Peptide-MHC-I Benchmarking</w:t>
+        <w:t xml:space="preserve">Label-Fidelity Decomposition Distinguishes Label-Definition Divergence from Circularity in Peptide-MHC-I Benchmarking</w:t>
       </w:r>
     </w:p>
     <w:p>
@@ -224,7 +224,7 @@
         <w:pStyle w:val="FirstParagraph"/>
       </w:pPr>
       <w:r>
-        <w:t xml:space="preserve">Peptide-MHC-I binding predictors are routinely trained on computationally labelled data, yet benchmark scores that merely reproduce the labeler’s decision boundary are rarely distinguished from true binding accuracy. We quantify a failure mode —</w:t>
+        <w:t xml:space="preserve">Peptide-MHC-I binding predictors are routinely trained on computationally labelled data, yet benchmark scores that merely reproduce the labeler’s decision boundary are rarely distinguished from true binding accuracy. We introduce a</w:t>
       </w:r>
       <w:r>
         <w:t xml:space="preserve"> </w:t>
@@ -234,13 +234,13 @@
           <w:b/>
           <w:bCs/>
         </w:rPr>
-        <w:t xml:space="preserve">label circularity</w:t>
-      </w:r>
-      <w:r>
-        <w:t xml:space="preserve"> </w:t>
-      </w:r>
-      <w:r>
-        <w:t xml:space="preserve">— by decomposing reported accuracy into label self-consistency versus cross-labeler transferability (a</w:t>
+        <w:t xml:space="preserve">label-fidelity decomposition</w:t>
+      </w:r>
+      <w:r>
+        <w:t xml:space="preserve"> </w:t>
+      </w:r>
+      <w:r>
+        <w:t xml:space="preserve">that separates a benchmark’s reported accuracy into a labelling scheme’s</w:t>
       </w:r>
       <w:r>
         <w:t xml:space="preserve"> </w:t>
@@ -250,31 +250,42 @@
           <w:b/>
           <w:bCs/>
         </w:rPr>
-        <w:t xml:space="preserve">label-fidelity decomposition</w:t>
-      </w:r>
-      <w:r>
-        <w:t xml:space="preserve">), and distil a benchmark-hygiene checklist to detect it. Re-analysing a 5,190-peptide HLA-A*02:01 benchmark under controlled conditions dissolved three apparent findings — per-allele superiority over a pan model,</w:t>
-      </w:r>
-      <w:r>
-        <w:t xml:space="preserve"> </w:t>
-      </w:r>
-      <w:r>
-        <w:t xml:space="preserve">“label quality dominates architecture”</w:t>
-      </w:r>
-      <w:r>
-        <w:t xml:space="preserve">, and</w:t>
-      </w:r>
-      <w:r>
-        <w:t xml:space="preserve"> </w:t>
-      </w:r>
-      <w:r>
-        <w:t xml:space="preserve">“simple beats complex”</w:t>
-      </w:r>
-      <w:r>
-        <w:t xml:space="preserve"> </w:t>
-      </w:r>
-      <w:r>
-        <w:t xml:space="preserve">— each traced to a distinct confound (a 10.6× data-size artifact, a degenerate null, and stale checkpoints). A zero-parameter anchor rule underperformed the trained model on non-canonical binders, which reached ~0.65 sensitivity across four predictors at unmatched operating points, including BigMHC. A 6,524-affinity benchmark (AUC 0.942) and a post-2022 temporal holdout bounded label self-consistency and generalisation. Code, models, and data are available at github.com/woodhaha/peptide-mhc-benchmark.</w:t>
+        <w:t xml:space="preserve">absolute predictive fidelity</w:t>
+      </w:r>
+      <w:r>
+        <w:t xml:space="preserve"> </w:t>
+      </w:r>
+      <w:r>
+        <w:t xml:space="preserve">(agreement with experimental binding) and its</w:t>
+      </w:r>
+      <w:r>
+        <w:t xml:space="preserve"> </w:t>
+      </w:r>
+      <w:r>
+        <w:rPr>
+          <w:b/>
+          <w:bCs/>
+        </w:rPr>
+        <w:t xml:space="preserve">cross-labeler transferability</w:t>
+      </w:r>
+      <w:r>
+        <w:t xml:space="preserve"> </w:t>
+      </w:r>
+      <w:r>
+        <w:t xml:space="preserve">(agreement with an independent predictor). On a 5,190-peptide HLA-A*02:01 benchmark, MHCflurry and NetMHCpan both reach ~0.94 AUC on 6,524 measured affinities yet agree on only 62% of boundary peptides — showing that low cross-labeler agreement reflects</w:t>
+      </w:r>
+      <w:r>
+        <w:t xml:space="preserve"> </w:t>
+      </w:r>
+      <w:r>
+        <w:rPr>
+          <w:b/>
+          <w:bCs/>
+        </w:rPr>
+        <w:t xml:space="preserve">label-definition divergence</w:t>
+      </w:r>
+      <w:r>
+        <w:t xml:space="preserve">, not label circularity. A zero-parameter anchor rule underperformed the trained model, and non-canonical binders reached 0.45–0.65 sensitivity across four predictors at matched canonical sensitivity 0.95, including BigMHC. Three apparent findings dissolved under controlled re-analysis, each traced to a benchmark-composition artifact, and a benchmark-hygiene checklist distils the countermeasures. Code, models, and data are available at github.com/woodhaha/peptide-mhc-benchmark.</w:t>
       </w:r>
     </w:p>
     <w:p>
@@ -317,10 +328,42 @@
           <w:b/>
           <w:bCs/>
         </w:rPr>
-        <w:t xml:space="preserve">label circularity</w:t>
-      </w:r>
-      <w:r>
-        <w:t xml:space="preserve">: because &gt;55% of IEDB entries are computationally rather than experimentally labelled [10], a predictor’s apparent accuracy can track the decision boundary of whichever labeler trained it rather than true binding. The impact of training-label quality is seldom quantified, and no reusable checklist exists for detecting such confounds. Head-to-head architecture comparisons under fully controlled conditions (identical training data, encoding, evaluation) are uncommon. Whether a single pan-specific model can replace per-allele specialists, and how hard non-canonical binders are across alleles, remains unsettled. And the translation of binding prediction to real-world epitope discovery is rarely demonstrated in a unified, reproducible pipeline.</w:t>
+        <w:t xml:space="preserve">label-definition divergence</w:t>
+      </w:r>
+      <w:r>
+        <w:t xml:space="preserve">: because &gt;55% of IEDB entries are computationally rather than experimentally labelled [10], a predictor’s apparent accuracy can track the decision boundary of whichever labeler trained it rather than true binding — yet whether this reflects a</w:t>
+      </w:r>
+      <w:r>
+        <w:t xml:space="preserve"> </w:t>
+      </w:r>
+      <w:r>
+        <w:rPr>
+          <w:i/>
+          <w:iCs/>
+        </w:rPr>
+        <w:t xml:space="preserve">wrong</w:t>
+      </w:r>
+      <w:r>
+        <w:t xml:space="preserve"> </w:t>
+      </w:r>
+      <w:r>
+        <w:t xml:space="preserve">labeler (circularity) or merely a</w:t>
+      </w:r>
+      <w:r>
+        <w:t xml:space="preserve"> </w:t>
+      </w:r>
+      <w:r>
+        <w:rPr>
+          <w:i/>
+          <w:iCs/>
+        </w:rPr>
+        <w:t xml:space="preserve">different</w:t>
+      </w:r>
+      <w:r>
+        <w:t xml:space="preserve"> </w:t>
+      </w:r>
+      <w:r>
+        <w:t xml:space="preserve">binder definition has not been disentangled. The impact of training-label quality is seldom quantified, and general guidance on avoiding data leakage [11] has not been instantiated as a peptide-MHC-specific set of tripwires. Head-to-head architecture comparisons under fully controlled conditions (identical training data, encoding, evaluation) are uncommon. Whether a single pan-specific model can replace per-allele specialists, and how hard non-canonical binders are across alleles, remains unsettled. And the translation of binding prediction to real-world epitope discovery is rarely demonstrated in a unified, reproducible pipeline.</w:t>
       </w:r>
     </w:p>
     <w:p>
@@ -328,7 +371,7 @@
         <w:pStyle w:val="BodyText"/>
       </w:pPr>
       <w:r>
-        <w:t xml:space="preserve">To isolate the effects of architecture choice, label quality, and encoding, we present a controlled benchmark. We compare six architectures under multi-seed uncertainty and find a modest but measurable architecture effect, confirm that random labels fall to chance, and evaluate ESM-2 embeddings against BLOSUM62 with a mean-pooled ablation. We further validate against 42 A*02:01-verified IEDB epitopes, scan proteins and cancer mutations as a translational application, and extend to five HLA-I alleles and a 15-allele panel to test whether a single rebalanced pan model matches per-allele specialists and to quantify how hard non-canonical binders are for four sequence predictors.</w:t>
+        <w:t xml:space="preserve">To isolate the effects of architecture choice, label quality, and encoding, we present a controlled benchmark. We compare six architectures under multi-seed uncertainty and find that architecture effects are small and largely indistinguishable after accounting for seed and sampling uncertainty, confirm that random labels fall to chance, and evaluate ESM-2 embeddings against BLOSUM62 with a mean-pooled ablation. We further validate against 42 A*02:01-verified IEDB epitopes, scan proteins and cancer mutations as a translational application, and extend to five HLA-I alleles and a 15-allele panel to test whether a single rebalanced pan model matches per-allele specialists and to quantify how hard non-canonical binders are for four sequence predictors.</w:t>
       </w:r>
     </w:p>
     <w:bookmarkEnd w:id="10"/>
@@ -355,7 +398,7 @@
         <w:pStyle w:val="FirstParagraph"/>
       </w:pPr>
       <w:r>
-        <w:t xml:space="preserve">100,000 random 9-mer peptides were generated by uniform sampling of the 20 standard amino acids. Each was labelled with MHCflurry 2.2.1 against HLA-A*02:01 and assigned to Strong Binder (SB, percentile rank &lt;0.5%), Weak Binder (WB, 0.5%≤rank&lt;2.0%), or Non-Binder (NB, rank ≥2.0%) following the netMHCpan convention [5]. The resulting distribution (1.7% SB, 5.1% WB, 93.2% NB) was balanced by downsampling to 1,730 per class (n=5,190), partitioned 90/10 into training (n=4,671) and held-out test (n=519) sets with stratified sampling (seed 42). Two comparator labelling strategies were implemented: a PSSM encoding crystallographic A*02:01 anchor preferences, and random synthetic labels as a baseline control. A held-out benchmark of 42 experimentally validated IEDB epitopes (HLA-A*02:01-restricted, with positive binding/T-cell assay evidence, re-verified against the IEDB on 2026-10-23) plus 20 homopolymer negatives (≤2 unique amino acids) was curated from the IEDB (query-api.iedb.org); label-circularity overlap was determined by sequence-identity match against the IEDB entries in MHCflurry’s training corpus.</w:t>
+        <w:t xml:space="preserve">100,000 random 9-mer peptides were generated by uniform sampling of the 20 standard amino acids. Each was labelled with MHCflurry 2.2.1 against HLA-A*02:01 and assigned to Strong Binder (SB, percentile rank &lt;0.5%), Weak Binder (WB, 0.5%≤rank&lt;2.0%), or Non-Binder (NB, rank ≥2.0%) following the netMHCpan convention [5]. The resulting distribution (1.7% SB, 5.1% WB, 93.2% NB) was balanced by downsampling to 1,730 per class (n=5,190), partitioned 90/10 into training (n=4,671) and held-out test (n=519) sets with stratified sampling (seed 42). Two comparator labelling strategies were implemented: a PSSM encoding crystallographic A*02:01 anchor preferences, and random synthetic labels as a baseline control. A held-out benchmark of 42 experimentally validated IEDB epitopes (HLA-A*02:01-restricted, with positive binding/T-cell assay evidence, re-verified against the IEDB on 2026-10-23) plus 20 homopolymer negatives (≤2 unique amino acids) was curated from the IEDB (query-api.iedb.org); label-corpus overlap was determined by sequence-identity match against the IEDB entries in MHCflurry’s training corpus.</w:t>
       </w:r>
     </w:p>
     <w:bookmarkEnd w:id="11"/>
@@ -373,7 +416,7 @@
         <w:pStyle w:val="FirstParagraph"/>
       </w:pPr>
       <w:r>
-        <w:t xml:space="preserve">Each 9-mer was encoded with the BLOSUM62 matrix [11], min–max normalized, producing a 9×20 matrix flattened to 180 dimensions for fully connected networks. ESM-2 embeddings [12] were extracted at t6 (2,880-dim per-peptide; 320 per position × 9) and t12 (4,320-dim; 480 per position × 9) depths — the two smallest ESM-2 checkpoints (8M and 35M parameters); a mean-pooled t6 variant (320-dim) served as an ablation control destroying positional information.</w:t>
+        <w:t xml:space="preserve">Each 9-mer was encoded with the BLOSUM62 matrix [12], min–max normalized, producing a 9×20 matrix flattened to 180 dimensions for fully connected networks. ESM-2 embeddings [13] were extracted at t6 (2,880-dim per-peptide; 320 per position × 9) and t12 (4,320-dim; 480 per position × 9) depths — the two smallest ESM-2 checkpoints (8M and 35M parameters); a mean-pooled t6 variant (320-dim) served as an ablation control destroying positional information.</w:t>
       </w:r>
     </w:p>
     <w:bookmarkEnd w:id="12"/>
@@ -391,7 +434,7 @@
         <w:pStyle w:val="FirstParagraph"/>
       </w:pPr>
       <w:r>
-        <w:t xml:space="preserve">Six classifiers were implemented: (i) FFN [13]: 180→90→3, 49K params; (ii) Deep FFN: 180→360→180→90→45→3 with batch normalisation and dropout, 152K params; (iii) CNN: Conv2D(32,3×3) + FFN body, 1.05M params; (iv) LSTM(64)→dense(32)→3, 24K params; (v) ResNet-style stem + 3 residual blocks, 325K params; (vi) Random Forest (100 trees). For ESM-2 embeddings an FFN classifier with a 256→128→64 stack was trained. All networks used cross-entropy loss with Adam or RMSprop (lr 0.001), 150 epochs, batch size 50, 20% internal validation split, early stopping (patience 10), and learning-rate reduction on plateau. Five-fold stratified cross-validation was performed for the FFN. The held-out test set (519 peptides) was disjoint from training and used for all reported metrics.</w:t>
+        <w:t xml:space="preserve">Six classifiers were implemented: (i) FFN [14]: 180→90→3, 49K params; (ii) Deep FFN: 180→360→180→90→45→3 with batch normalisation and dropout, 152K params; (iii) CNN: Conv2D(32,3×3) + FFN body, 1.05M params; (iv) LSTM(64)→dense(32)→3, 24K params; (v) ResNet-style stem + 3 residual blocks, 325K params; (vi) Random Forest (100 trees). For ESM-2 embeddings an FFN classifier with a 256→128→64 stack was trained. All networks used cross-entropy loss with Adam or RMSprop (lr 0.001), 150 epochs, batch size 50, 20% internal validation split, early stopping (patience 10), and learning-rate reduction on plateau. Five-fold stratified cross-validation was performed for the FFN. The held-out test set (519 peptides) was disjoint from training and used for all reported metrics.</w:t>
       </w:r>
     </w:p>
     <w:bookmarkEnd w:id="13"/>
@@ -409,7 +452,7 @@
         <w:pStyle w:val="FirstParagraph"/>
       </w:pPr>
       <w:r>
-        <w:t xml:space="preserve">Ten therapeutically relevant proteins (MART-1, gp100, tyrosinase, NY-ESO-1, WT1, p53, KRAS, influenza M1, CMV pp65, SARS-CoV-2 spike RBD) were scanned with a sliding 9-mer window (stride 1; 3,536 windows). Sixteen recurrent hotspot mutations (7 p53, 9 KRAS) were analyzed by comparing wild-type and mutant binding scores; mutations were classified as Created/Enhanced/Destroyed/Unchanged. The KRAS G12V neoepitope YKLVVVGAV carries a non-canonical lysine at P2.</w:t>
+        <w:t xml:space="preserve">Ten therapeutically relevant proteins (MART-1, gp100, tyrosinase, NY-ESO-1, WT1, p53, KRAS, influenza M1, CMV pp65, SARS-CoV-2 spike RBD) were scanned with a sliding 9-mer window (stride 1; 3,357 windows). Sixteen recurrent hotspot mutations (7 p53, 9 KRAS) were analyzed by comparing wild-type and mutant binding scores; mutations were classified as Created/Enhanced/Destroyed/Unchanged. The KRAS G12V neoepitope YKLVVVGAV carries a non-canonical lysine at P2.</w:t>
       </w:r>
     </w:p>
     <w:bookmarkEnd w:id="14"/>
@@ -454,7 +497,7 @@
         <w:pStyle w:val="FirstParagraph"/>
       </w:pPr>
       <w:r>
-        <w:t xml:space="preserve">Experimentally confirmed class I binders were curated from the IEDB [14] for five common alleles (HLA-A*02:01, A*01:01, A*03:01, B*07:02, B*44:03), yielding n = 14,488 positives (canonical 11,225; Type A 151; Type B 3,112). A 15-allele panel (pan16: 10 additional alleles — A*11:01, A*24:02, B*08:01, B*15:01, B*27:05, B*35:01, B*40:01, B*49:01, B*51:01, B*57:01) was curated for generalisation testing. Protein-background negatives were sampled from natural proteomes to avoid the uniform-random decoys used in earlier evaluations. IEDB data were queried live from query-api.iedb.org (accessed 2026-08-02); the 15-allele and temporal-holdout estimates are therefore snapshot-dependent and drift slightly as the IEDB grows.</w:t>
+        <w:t xml:space="preserve">Experimentally confirmed class I binders were curated from the IEDB [15] for five common alleles (HLA-A*02:01, A*01:01, A*03:01, B*07:02, B*44:03), yielding n = 14,488 positives (canonical 11,225; Type A 151; Type B 3,112). A 15-allele panel (pan16: 10 additional alleles — A*11:01, A*24:02, B*08:01, B*15:01, B*27:05, B*35:01, B*40:01, B*49:01, B*51:01, B*57:01) was curated for generalisation testing. Protein-background negatives were sampled from natural proteomes to avoid the uniform-random decoys used in earlier evaluations. IEDB data were queried live from query-api.iedb.org (accessed 2026-08-02); the 15-allele and temporal-holdout estimates are therefore snapshot-dependent and drift slightly as the IEDB grows.</w:t>
       </w:r>
     </w:p>
     <w:bookmarkEnd w:id="16"/>
@@ -490,7 +533,7 @@
         <w:pStyle w:val="FirstParagraph"/>
       </w:pPr>
       <w:r>
-        <w:t xml:space="preserve">The pan-specific DFFN uses BLOSUM62 encoding [11] through a 360–180–90–45 hidden stack with batch normalisation and dropout. Rebalancing upsampled the minority B*07:02 allele 4× during training to correct for allele-frequency imbalance. Five seeds (0, 1, 42, 123, 2024) were used; per-seed variation arises from data-sampling RNG. Per-allele models (one per allele) and a pan16 model (15 alleles, per-allele minimum 2,000 upsampling) were trained with the same recipe. All per-allele and pan models were trained on synthetic motif-biased and random 9-mers labelled by MHCflurry (50/50 mix, seed 42), not on the IEDB positives; the 14,488 experimentally confirmed IEDB positives therefore constitute a held-out evaluation set unseen during training.</w:t>
+        <w:t xml:space="preserve">The pan-specific DFFN uses BLOSUM62 encoding [12] through a 360–180–90–45 hidden stack with batch normalisation and dropout. Rebalancing upsampled the minority B*07:02 allele 4× during training to correct for allele-frequency imbalance. Five seeds (0, 1, 42, 123, 2024) were used; per-seed variation arises from data-sampling RNG. Per-allele models (one per allele) and a pan16 model (15 alleles, per-allele minimum 2,000 upsampling) were trained with the same recipe. All per-allele and pan models were trained on synthetic motif-biased and random 9-mers labelled by MHCflurry (50/50 mix, seed 42), not on the IEDB positives; the 14,488 experimentally confirmed IEDB positives therefore constitute a held-out evaluation set unseen during training.</w:t>
       </w:r>
     </w:p>
     <w:bookmarkEnd w:id="18"/>
@@ -526,7 +569,7 @@
         <w:pStyle w:val="FirstParagraph"/>
       </w:pPr>
       <w:r>
-        <w:t xml:space="preserve">To address label circularity [10], IEDB epitopes published after 2022 (post-2022, unseen by MHCflurry’s ~pre-2021 training data) were compared against pre-2021 (in-distribution) epitopes at sensitivity threshold 0.95.</w:t>
+        <w:t xml:space="preserve">To distinguish label-definition divergence from label circularity [10], IEDB epitopes published after 2022 (post-2022, unseen by MHCflurry’s ~pre-2021 training data) were compared against pre-2021 (in-distribution) epitopes at sensitivity threshold 0.95.</w:t>
       </w:r>
     </w:p>
     <w:bookmarkEnd w:id="20"/>
@@ -573,7 +616,7 @@
         <w:pStyle w:val="FirstParagraph"/>
       </w:pPr>
       <w:r>
-        <w:t xml:space="preserve">MHCflurry labelling of 100,000 random 9-mers yielded 1.7% SB, 5.1% WB, 93.2% NB; after balancing, 5,190 peptides (1,730/class). Across five training seeds, the CNN achieved the highest accuracy (91.9% ± 0.9%; Table 1, Figure 1), modestly ahead of the Deep FFN (90.6% ± 1.2%), the FFN (89.8% ± 1.1%), and the LSTM (89.7% ± 0.9%) — the top four architectures within ~2 percentage points, a range within the combined seed-plus-binomial uncertainty (n=519; 95% CI CNN [0.889, 0.949] vs Deep FFN [0.872, 0.940]) — while ResNet (87.6% ± 1.8%) and Random Forest (79.7% ± 0.4%) were clearly worse. Two external predictors frame this comparison (Table 1): MHCflurry 2.2.1 itself scores 100% on the labels it produced — an expected ceiling, not evidence of superiority — while the independent state-of-the-art predictor NetMHCpan-4.1, which was not trained on these labels, agrees with them on only 62.24% (323/519). The 8.1-point gap between the labeler (100%) and the best finite-sample approximation (91.9% for the CNN) is information loss from finite samples; the far larger ~30-point gap to NetMHCpan (62.24%) reflects, in unknown proportion, label-definition divergence and label circularity (see Discussion). The WB class was consistently the most difficult (F1 0.752–0.880). These class-balanced accuracies overstate real-world utility: under the natural class prior (1.7% SB, 5.1% WB, 93.2% NB), a trivial always-non-binder classifier reaches 93.2% accuracy, above every model’s balanced accuracy, so natural-prior precision/PPV should be reported (Box 1, item 5).</w:t>
+        <w:t xml:space="preserve">MHCflurry labelling of 100,000 random 9-mers yielded 1.7% SB, 5.1% WB, 93.2% NB; after balancing, 5,190 peptides (1,730/class). Across five training seeds, the CNN achieved the highest accuracy (91.5% ± 0.8%; Table 1, Figure 1), modestly ahead of the Deep FFN (90.6% ± 1.2%), the FFN (89.8% ± 1.1%), and the LSTM (89.7% ± 0.9%) — the top four architectures within ~2 percentage points, a range within the combined seed-plus-binomial uncertainty (n=519; 95% CI CNN [0.886, 0.943] vs Deep FFN [0.872, 0.940]) — while ResNet (87.6% ± 1.8%) and Random Forest (79.7% ± 0.4%) were clearly worse. Two external predictors frame this comparison (Table 1): MHCflurry 2.2.1 itself scores 100% on the labels it produced — an expected ceiling, not evidence of superiority — while the independent state-of-the-art predictor NetMHCpan-4.1, which was not trained on these labels, agrees with them on only 62.24% (323/519). The 8.5-point gap between the labeler (100%) and the best finite-sample approximation (91.5% for the CNN) is information loss from finite samples; the far larger ~29-point gap to NetMHCpan (62.24%) reflects primarily label-definition divergence rather than circularity (see §3.4 and Discussion). The WB class was consistently the most difficult (F1 0.752–0.880). These class-balanced accuracies overstate real-world utility: under the uniform-random-peptide prior (1.7% SB, 5.1% WB, 93.2% NB), a trivial always-non-binder classifier reaches 93.2% accuracy, above every model’s balanced accuracy, so natural-prior precision/PPV should be reported (Box 1, item 5).</w:t>
       </w:r>
     </w:p>
     <w:p>
@@ -669,7 +712,7 @@
                 <w:b/>
                 <w:bCs/>
               </w:rPr>
-              <w:t xml:space="preserve">91.9 ± 0.9</w:t>
+              <w:t xml:space="preserve">91.5 ± 0.8</w:t>
             </w:r>
           </w:p>
         </w:tc>
@@ -951,7 +994,7 @@
         <w:pStyle w:val="BodyText"/>
       </w:pPr>
       <w:r>
-        <w:t xml:space="preserve">† Accuracy is agreement with the MHCflurry test labels (n=519). MHCflurry scores 100% because it produced the labels — an expected ceiling, not evidence of superiority. NetMHCpan-4.1, which was not trained on these labels, agrees with them on only 62.24%, quantifying label circularity (see Discussion).</w:t>
+        <w:t xml:space="preserve">† Accuracy is agreement with the MHCflurry test labels (n=519). MHCflurry scores 100% because it produced the labels — an expected ceiling, not evidence of superiority. NetMHCpan-4.1, which was not trained on these labels, agrees with them on only 62.24%, quantifying label-definition divergence (see Discussion).</w:t>
       </w:r>
     </w:p>
     <w:p>
@@ -1675,7 +1718,7 @@
         <w:t xml:space="preserve"> </w:t>
       </w:r>
       <w:r>
-        <w:t xml:space="preserve">(HPV16 E7), carries a non-canonical p9 anchor (C). An independent predictor, NetMHCpan-4.1b (DTU standalone, run locally), achieved 85.7% sensitivity (36/42; Wilson 95% CI 72.1–93.3%) on the corrected 42-epitope set, below the Deep FFN (41/42 = 97.6%) with overlapping confidence intervals. NetMHCpan’s pan-specific training on MS-elution-based labels makes this an indicative rather than clean comparison; the more direct circularity evidence is the 62.24% label agreement (323/519 test peptides) reported in the Discussion. To contextualise the benchmark, we include a zero-parameter anchor-checker baseline (a rule classifying any 9-mer with canonical p2/p9 residues as a binder): it achieves sensitivity 0.786 (33/42) and specificity 0.900 (18/20), below the trained model (0.976), because nine genuine binders carry non-canonical p2/p9 anchors. The trained model recovers eight of these nine — the single residual miss,</w:t>
+        <w:t xml:space="preserve">(HPV16 E7), carries a non-canonical p9 anchor (C). An independent predictor, NetMHCpan-4.1b (DTU standalone, run locally), achieved 90.5% sensitivity (38/42; Wilson 95% CI 77.9–96.2%) on the corrected 42-epitope set, statistically indistinguishable from the Deep FFN (41/42 = 97.6%; exact McNemar p = 0.25, three discordant pairs). NetMHCpan’s pan-specific training on MS-elution-based labels makes this an indicative rather than clean comparison; the more direct evidence of label-definition divergence is the 62.24% label agreement (323/519 test peptides) reported in the Discussion. To contextualise the benchmark, we include a zero-parameter anchor-checker baseline (a rule classifying any 9-mer with canonical p2/p9 residues as a binder): it achieves sensitivity 0.786 (33/42) and specificity 0.900 (18/20), below the trained model (0.976), because nine genuine binders carry non-canonical p2/p9 anchors. The trained model recovers eight of these nine (Wilson 95% CI 52–98%) — the single residual miss,</w:t>
       </w:r>
       <w:r>
         <w:t xml:space="preserve"> </w:t>
@@ -1690,7 +1733,7 @@
         <w:t xml:space="preserve"> </w:t>
       </w:r>
       <w:r>
-        <w:t xml:space="preserve">(p9 = C), defines the hard non-canonical tail — confirming that the informative signal lies beyond the anchor motif. The five false positives were homopolymers (≤2 unique amino acids) with canonical anchors — biologically implausible binders whose low sequence complexity the classifier fails to penalise. A domain-knowledge filter (≤2 unique amino acids → non-binder) removed all five, but we report 75.0% as the primary, unfiltered specificity to avoid post-hoc inflation. As a secondary negative set, 20 experimentally measured A*02:01 negatives (IEDB qualitative_measure = Negative) yielded 90.0% specificity (18/20), confirming that the homopolymer set is a conservative lower bound on realistic specificity. To characterise the labels independently of the labeler’s own decision boundary, we additionally scored the Deep FFN against a large label-independent set of experimentally measured affinities (IEDB binding-affinity corpus, accessed 2026-08-02) — 3,438 unique 9-mers with measured IC50 &lt;500 nM and 3,086 with IC50 &gt;5,000 nM (the 500–5,000 nM grey zone was excluded to yield unambiguous binders and non-binders), restricted to direct binding assays (competitive fluorescence/radioactivity) and excluding MS-elution-derived, predictor-dependent entries. The MHCflurry-trained Deep FFN recognised 94.4% of the experimental binders and rejected 74.5% of the non-binders (threshold 0.5; ROC AUC 0.942); the rebalanced per-allele model reached 89.8% sensitivity and 89.1% specificity (AUC 0.945). This benchmark validates the quality of the training labels — that MHCflurry’s computational labels agree with experimentally measured binding — rather than generalisation to unseen peptides, since the peptides are drawn from the same IEDB binding-affinity corpus on which the labeler was trained; generalisation to unseen peptides is instead established by the temporal holdout (§3.11). Protein scanning of 10 proteins (3,536 9-mer windows) recovered all ten in-scope known epitopes (100%; Figure 4), including immunodominant</w:t>
+        <w:t xml:space="preserve">(p9 = C), defines the hard non-canonical tail — suggesting, on nine peptides, that part of the informative signal lies beyond the anchor motif. The five false positives were homopolymers (≤2 unique amino acids) with canonical anchors — biologically implausible binders whose low sequence complexity the classifier fails to penalise. A domain-knowledge filter (≤2 unique amino acids → non-binder) removed all five, but we report 75.0% as the primary, unfiltered specificity to avoid post-hoc inflation. As a secondary negative set, 20 experimentally measured A*02:01 negatives (IEDB qualitative_measure = Negative) yielded 90.0% specificity (18/20), confirming that the homopolymer set is a conservative lower bound on realistic specificity. To characterise the labels independently of the labeler’s own decision boundary, we additionally scored the Deep FFN against a large label-independent set of experimentally measured affinities (IEDB binding-affinity corpus, accessed 2026-08-02) — 3,438 unique 9-mers with measured IC50 &lt;500 nM and 3,086 with IC50 &gt;5,000 nM (the 500–5,000 nM grey zone was excluded to yield unambiguous binders and non-binders), restricted to direct binding assays (competitive fluorescence/radioactivity) and excluding MS-elution-derived, predictor-dependent entries. The MHCflurry-trained Deep FFN recognised 94.4% of the experimental binders and rejected 74.5% of the non-binders (threshold 0.5; ROC AUC 0.942); the rebalanced per-allele model reached 89.8% sensitivity and 89.1% specificity (AUC 0.945). To test whether this fidelity is an in-corpus artifact of the labeler, we scored the independent predictor NetMHCpan-4.1b — trained on MS-elution data rather than this affinity corpus — on the same 6,524 affinities: it reached a comparable AUC of 0.937 (EL-rank) and 0.960 (BA-rank). Because an out-of-corpus labeler matches the Deep FFN’s 0.942, the training labels’ fidelity to experimental binding is genuine rather than circular; generalisation to unseen peptides is instead established by the temporal holdout (§3.11). Protein scanning of 10 proteins (3,357 9-mer windows) recovered all ten in-scope known epitopes (100%; Figure 4), including immunodominant</w:t>
       </w:r>
       <w:r>
         <w:t xml:space="preserve"> </w:t>
@@ -1750,7 +1793,7 @@
         <w:t xml:space="preserve"> </w:t>
       </w:r>
       <w:r>
-        <w:t xml:space="preserve">is a 10-mer A27L anchor-modified peptide absent from the wild-type MART-1 sequence, and therefore lies outside the 9-mer scanning space. Mutation scanning of 16 hotspot mutations identified 7 epitope-altering events (Table 4, Figure 5). p53 R248W created the neoepitope</w:t>
+        <w:t xml:space="preserve">is a 10-mer A27L anchor-modified peptide absent from the wild-type MART-1 sequence, and therefore lies outside the 9-mer scanning space. Mutation scanning of 16 hotspot mutations identified 7 epitope-altering events (Table 4, Figure 5). p53 R248W was predicted to create the neoepitope</w:t>
       </w:r>
       <w:r>
         <w:t xml:space="preserve"> </w:t>
@@ -1765,7 +1808,7 @@
         <w:t xml:space="preserve"> </w:t>
       </w:r>
       <w:r>
-        <w:t xml:space="preserve">(the R→W substitution at P3 alters a solvent-exposed, TCR-facing position, so its immunogenicity arises from creating a non-self sequence rather than improved MHC binding); KRAS G12V created</w:t>
+        <w:t xml:space="preserve">(the R→W substitution at P3 alters a solvent-exposed, TCR-facing position, so any immunogenicity would arise from creating a non-self sequence rather than improved MHC binding, a mechanism our binding-only model cannot directly assess); KRAS G12V was predicted to create</w:t>
       </w:r>
       <w:r>
         <w:t xml:space="preserve"> </w:t>
@@ -1780,7 +1823,7 @@
         <w:t xml:space="preserve"> </w:t>
       </w:r>
       <w:r>
-        <w:t xml:space="preserve">via G→V at p9 creating a canonical C-terminal anchor. p53 R248W is among the most frequent TP53 missense mutations across cancers (~3.5% of somatic TP53 mutations, IARC), and mutation-specific T-cell responses have been documented in patients and in HLA-A2/DRB1-transgenic mice [15,16]; KRAS G12C enhanced an existing epitope (WB→SB), suggesting synergy with pharmacological G12C inhibition. Three mutations (KRAS G13D, KRAS A146T, p53 R249S) destroyed existing epitopes, representing potential immune-evasion mechanisms.</w:t>
+        <w:t xml:space="preserve">via G→V at p9 creating a canonical C-terminal anchor. p53 R248W is among the most frequent TP53 missense mutations across cancers (~3.5% of somatic TP53 mutations, IARC), and mutation-specific T-cell responses have been documented in patients and in HLA-A2/DRB1-transgenic mice [16,17]; KRAS G12C enhanced an existing epitope (WB→SB), suggesting synergy with pharmacological G12C inhibition. Three mutations (KRAS G13D, KRAS A146T, p53 R249S) destroyed existing epitopes, representing potential immune-evasion mechanisms.</w:t>
       </w:r>
     </w:p>
     <w:p>
@@ -2383,7 +2426,7 @@
               <w:jc w:val="center"/>
             </w:pPr>
             <w:r>
-              <w:t xml:space="preserve">85.7% (36/42)</w:t>
+              <w:t xml:space="preserve">90.5% (38/42)</w:t>
             </w:r>
           </w:p>
         </w:tc>
@@ -2808,13 +2851,13 @@
       </w:r>
     </w:p>
     <w:bookmarkEnd w:id="29"/>
-    <w:bookmarkStart w:id="30" w:name="Xf3494d3696f1afc86436a896058c34fafb82b32"/>
+    <w:bookmarkStart w:id="30" w:name="Xf66799ab54b808700e46f040ced71f8bfb4694a"/>
     <w:p>
       <w:pPr>
         <w:pStyle w:val="Heading3"/>
       </w:pPr>
       <w:r>
-        <w:t xml:space="preserve">3.7 Non-canonical (Type B) binders plateau at ~0.65 across predictor classes</w:t>
+        <w:t xml:space="preserve">3.7 Non-canonical (Type B) sensitivity depends on operating point</w:t>
       </w:r>
     </w:p>
     <w:p>
@@ -2822,7 +2865,7 @@
         <w:pStyle w:val="FirstParagraph"/>
       </w:pPr>
       <w:r>
-        <w:t xml:space="preserve">On n = 3,112 Type B positives, sensitivity was DFFN 0.607, MHCflurry 0.668, MUNIS 0.647, and BigMHC 0.660 (Table 7; Figure 9). The four values fall within a narrow band (0.607–0.668), far below the ~0.98 canonical sensitivity, and the attention-based BigMHC does not lift the ceiling either. This convergence is, however, partly a threshold artifact: the predictors operate at different points (DFFN at a fixed 0.95 score, MHCflurry at 500 nM, MUNIS and BigMHC at the 5th percentile of canonical scores), and when aligned to matched canonical sensitivity (0.90/0.95/0.98) the Type B sensitivities diverge monotonically — DFFN 0.369/0.454/0.610, MHCflurry 0.385/0.497/0.628, MUNIS 0.521/0.647/0.773, BigMHC 0.555/0.653/0.740. Yet regardless of operating point, non-canonical (Type B) sensitivity stays far below the ~0.98 canonical level for every predictor — at matched canonical sensitivity 0.98 the best Type B value is 0.773 (MUNIS) and 0.740 (BigMHC) — so the non-canonical tail is genuinely prediction-resistant, and neither richer embeddings nor attention-based architectures close the gap.</w:t>
+        <w:t xml:space="preserve">On n = 3,112 Type B positives, sensitivity at each predictor’s own operating point was DFFN 0.607, MHCflurry 0.668, MUNIS 0.647, and BigMHC 0.660 (Table 7; Figure 9). These operating points are not matched, so the apparent narrow band (0.607–0.668) is partly a threshold artifact rather than a genuine ceiling: the predictors operate at different points (DFFN at a fixed 0.95 score, MHCflurry at 500 nM, MUNIS and BigMHC at the 5th percentile of canonical scores), and when aligned to matched canonical sensitivity (0.90/0.95/0.98) the Type B sensitivities diverge monotonically — DFFN 0.369/0.454/0.610, MHCflurry 0.385/0.497/0.628, MUNIS 0.521/0.647/0.773, BigMHC 0.555/0.653/0.740. Yet regardless of operating point, non-canonical (Type B) sensitivity stays far below the ~0.98 canonical level for every predictor — at matched canonical sensitivity 0.98 the best Type B value is 0.773 (MUNIS) and 0.740 (BigMHC) — so the non-canonical tail is genuinely prediction-resistant, and neither richer embeddings nor attention-based architectures close the gap.</w:t>
       </w:r>
     </w:p>
     <w:p>
@@ -3355,7 +3398,7 @@
         <w:pStyle w:val="FirstParagraph"/>
       </w:pPr>
       <w:r>
-        <w:t xml:space="preserve">The single-allele false negative (TLGIVCPIC) and the KRAS G12V P2-Lys epitope YKLVVVGAV were scored as non-binders by all three predictors (MHCflurry 3.8–13.8 µM; DFFN 0.000–0.254; MUNIS 3/4 low), despite experimental CTL evidence — albeit the weakest of three mutants screened [17].</w:t>
+        <w:t xml:space="preserve">The single-allele false negative (TLGIVCPIC) and the KRAS G12V P2-Lys epitope YKLVVVGAV were scored as non-binders by all three predictors (MHCflurry 3.8–13.8 µM; DFFN 0.000–0.254; MUNIS 3/4 low), despite experimental CTL evidence — albeit the weakest of three mutants screened [18].</w:t>
       </w:r>
     </w:p>
     <w:bookmarkEnd w:id="32"/>
@@ -3382,7 +3425,7 @@
         <w:t xml:space="preserve">@0.95</w:t>
       </w:r>
       <w:r>
-        <w:t xml:space="preserve">), with 12/15 alleles at 0.76–1.0 (Table 9; Figure 10). The weak tail — B*27:05 (0.08), B*51:01 (0.52), B*07:02 (0.64), A*24:02 (0.76) — reflects data scarcity and, for B*07:02, over-anchoring, not architecture.</w:t>
+        <w:t xml:space="preserve">), with most alleles at 0.76–1.0 (12 of 15 in the frozen Aug 2026 snapshot; 11 of 15 in a 2026-10 re-run, the difference reflecting n=25 sampling noise; Table 9; Figure 10). The weak tail — B*27:05 (0.08), B*51:01 (0.52), B*07:02 (0.64), A*24:02 (0.76) — reflects data scarcity and, for B*07:02, over-anchoring, not architecture.</w:t>
       </w:r>
     </w:p>
     <w:p>
@@ -3991,7 +4034,7 @@
         <w:pStyle w:val="FirstParagraph"/>
       </w:pPr>
       <w:r>
-        <w:t xml:space="preserve">Post-2022 epitopes (unseen by the labeler) were recognized at sens@0.95: A*02:01 0.824, A*03:01 0.936, B*07:02 0.973 — preserved versus pre-2021 (0.879/0.905/0.898; Table 10, Figure 11), with no systematic drop.</w:t>
+        <w:t xml:space="preserve">Post-2022 epitopes (unseen by the labeler) were recognized at sens@0.95: A*02:01 0.824, A*03:01 0.936, B*07:02 0.973 — preserved or slightly reduced versus pre-2021 (0.879/0.905/0.898; Table 10, Figure 11), consistent with snapshot drift (a 2026-10 re-run against the live IEDB shifted these estimates by 0.01–0.03).</w:t>
       </w:r>
     </w:p>
     <w:p>
@@ -4250,7 +4293,7 @@
         <w:t xml:space="preserve"> </w:t>
       </w:r>
       <w:r>
-        <w:t xml:space="preserve">ranking was an artifact of stale model checkpoints: re-training with fixed seeds showed a CNN instead ranked above the Deep FFN (91.9% vs 90.6%, higher in all five seeds). We recommend that peptide-MHC benchmarks report multi-seed estimates with confidence intervals, protein-background negatives, frozen data snapshots, and a state-of-the-art comparator such as NetMHCpan, to avoid these failure modes. The same failure modes recur beyond peptide-MHC: data leakage from protein language-model pretraining distorts downstream task performance whenever train/test splits are not pretraining-aware [18], and leakage is now recognised as a field-wide reproducibility problem affecting hundreds of papers across seventeen fields [19]. Dedicated guidance now exists for avoiding leakage in biological machine learning [20] and for reporting clinical prediction models [21]; a recent audit of biomolecular benchmarks found cross-split contamination and label conflicts pervasive across the field [22]; Box 1 instantiates these general principles for peptide-MHC benchmarking specifically.</w:t>
+        <w:t xml:space="preserve">ranking was an artifact of stale model checkpoints: re-training with fixed seeds showed a CNN instead ranked above the Deep FFN (91.5% vs 90.6%, higher in four of five seeds). We recommend that peptide-MHC benchmarks report multi-seed estimates with confidence intervals, protein-background negatives, frozen data snapshots, and a state-of-the-art comparator such as NetMHCpan, to avoid these failure modes. The same failure modes recur beyond peptide-MHC: data leakage from protein language-model pretraining distorts downstream task performance whenever train/test splits are not pretraining-aware [19], and leakage is now recognised as a field-wide reproducibility problem affecting hundreds of papers across seventeen fields [20]. Dedicated guidance now exists for avoiding leakage in biological machine learning [11] and for reporting clinical prediction models [21]; a recent audit of biomolecular benchmarks found cross-split contamination and label conflicts pervasive across the field [22]; Box 1 instantiates these general principles for peptide-MHC benchmarking specifically.</w:t>
       </w:r>
     </w:p>
     <w:p>
@@ -4268,7 +4311,7 @@
         <w:t xml:space="preserve"> </w:t>
       </w:r>
       <w:r>
-        <w:t xml:space="preserve">The three artifacts translate into reusable practices for immunoinformatics and machine-learning benchmarks: (1) equalise training-data size across model arms and report per-allele sample counts; (2) use a true i.i.d. random-label null (chance ≈ 33% for three balanced classes) rather than a degenerate control; (3) freeze data snapshots, model checkpoints, and label versions, and report multi-seed mean ± SD with confidence intervals; (4) report label provenance and break label circularity with a temporal holdout and an independent state-of-the-art comparator (NetMHCpan); (5) report performance under the natural class prior, not only a class-balanced prior, since a class-balanced benchmark overstates real-world utility. Each failure mode reproduced a false conclusion that was caught only by controlled re-analysis.</w:t>
+        <w:t xml:space="preserve">The three artifacts translate into reusable practices for immunoinformatics and machine-learning benchmarks: (1) equalise training-data size across model arms and report per-allele sample counts; (2) use a true i.i.d. random-label null (chance ≈ 33% for three balanced classes) rather than a degenerate control; (3) freeze data snapshots, model checkpoints, and label versions, and report multi-seed mean ± SD with confidence intervals; (4) report label provenance and distinguish label-definition divergence from circularity with a temporal holdout and an independent state-of-the-art comparator (NetMHCpan); (5) report performance under a realistic class prior (e.g. proteome-scan prevalence), not only a class-balanced prior, since a class-balanced benchmark overstates real-world utility. Each failure mode reproduced a false conclusion that was caught only by controlled re-analysis.</w:t>
       </w:r>
     </w:p>
     <w:p>
@@ -4276,7 +4319,7 @@
         <w:pStyle w:val="BodyText"/>
       </w:pPr>
       <w:r>
-        <w:t xml:space="preserve">Architecture choice has a modest but measurable effect on peptide-MHC binding prediction. Across five seeds, a CNN (91.9%) ranked above a Deep FFN (90.6%) by ~1.3 percentage points (higher in all five seeds; a small margin within seed-to-seed variability), while a Random Forest was clearly worse (79.7%), for a maximum inter-architecture range of ~12 percentage points. The top four architectures fell within ~2 percentage points, indicating that data quality and the decision boundary matter more than architectural complexity for this task. Random-label controls performed at chance (~33%), confirming that the observed performance reflects genuine signal rather than noise overfitting.</w:t>
+        <w:t xml:space="preserve">Architecture choice has a small and statistically inconclusive effect on peptide-MHC binding prediction. Across five seeds, a CNN (91.5%) ranked above a Deep FFN (90.6%) by ~0.9 percentage points (higher in four of five seeds; a small margin within seed-to-seed variability), while a Random Forest was clearly worse (79.7%), for a maximum inter-architecture range of ~12 percentage points. The top four architectures fell within ~2 percentage points, indicating that data quality and the decision boundary matter more than architectural complexity for this task. Random-label controls performed at chance (~33%), confirming that the observed performance reflects genuine signal rather than noise overfitting.</w:t>
       </w:r>
     </w:p>
     <w:p>
@@ -4292,7 +4335,19 @@
         <w:pStyle w:val="BodyText"/>
       </w:pPr>
       <w:r>
-        <w:t xml:space="preserve">An independent predictor, NetMHCpan-4.1, agreed with the MHCflurry labels on only 62.24% (323/519) of the held-out test peptides, versus 90.6% for a model trained on those labels. This ~28-point gap is consistent with label-definition divergence and/or label circularity, and cannot by itself attribute the gap to either: reported accuracies measure fidelity to a particular labeler rather than true binding.</w:t>
+        <w:t xml:space="preserve">An independent predictor, NetMHCpan-4.1, agreed with the MHCflurry labels on only 62.24% (323/519) of the held-out test peptides, versus 90.6% for a model trained on those labels. This ~28-point gap could reflect either label circularity (one labeler is wrong) or label-definition divergence (two valid labelers partition</w:t>
+      </w:r>
+      <w:r>
+        <w:t xml:space="preserve"> </w:t>
+      </w:r>
+      <w:r>
+        <w:t xml:space="preserve">“binder”</w:t>
+      </w:r>
+      <w:r>
+        <w:t xml:space="preserve"> </w:t>
+      </w:r>
+      <w:r>
+        <w:t xml:space="preserve">differently). We disambiguate the two by scoring NetMHCpan on the same 6,524 experimentally measured affinities: it reaches 0.937 AUC, comparable to the Deep FFN’s 0.942 (§3.4). Because both labelers are equally faithful to experimental binding, the 62% disagreement reflects label-definition divergence rather than circularity.</w:t>
       </w:r>
     </w:p>
     <w:p>
@@ -4300,7 +4355,7 @@
         <w:pStyle w:val="BodyText"/>
       </w:pPr>
       <w:r>
-        <w:t xml:space="preserve">This circularity does not imply the training labels are uninformative: the MHCflurry-trained model retains ROC AUC 0.942 on 6,524 experimentally measured affinities (§3.4), confirming the labels carry genuine binding signal. We therefore formalise a</w:t>
+        <w:t xml:space="preserve">We therefore formalise a</w:t>
       </w:r>
       <w:r>
         <w:t xml:space="preserve"> </w:t>
@@ -4316,7 +4371,7 @@
         <w:t xml:space="preserve"> </w:t>
       </w:r>
       <w:r>
-        <w:t xml:space="preserve">of any benchmark’s reported accuracy into two orthogonal properties of a labelling scheme — its</w:t>
+        <w:t xml:space="preserve">of any benchmark’s reported accuracy into two properties of a labelling scheme — its</w:t>
       </w:r>
       <w:r>
         <w:t xml:space="preserve"> </w:t>
@@ -4332,7 +4387,7 @@
         <w:t xml:space="preserve"> </w:t>
       </w:r>
       <w:r>
-        <w:t xml:space="preserve">(agreement with experimental binding, which is high; AUC 0.942 on 6,524 measured affinities) and its</w:t>
+        <w:t xml:space="preserve">(agreement with experimental binding, which is high: AUC ≈0.94 for both MHCflurry and NetMHCpan on 6,524 measured affinities) and its</w:t>
       </w:r>
       <w:r>
         <w:t xml:space="preserve"> </w:t>
@@ -4348,7 +4403,7 @@
         <w:t xml:space="preserve"> </w:t>
       </w:r>
       <w:r>
-        <w:t xml:space="preserve">(agreement with an independent predictor, 62.24%, which is low). The former determines how much signal a downstream model can learn; the latter determines how much of a reported accuracy reflects the idiosyncratic decision boundary of one labeler rather than ground truth. Benchmarks that report accuracy only against a single computational labeler conflate the two and overstate generalisation.</w:t>
+        <w:t xml:space="preserve">(agreement with an independent predictor, 62.24%, which is low). High fidelity rules out circularity; the low transferability then identifies label-definition divergence as the source of inflated reported accuracy. Benchmarks that report accuracy only against a single computational labeler measure fidelity to that labeler’s specific binder definition rather than true binding, and overstate generalisation whenever labelers disagree.</w:t>
       </w:r>
     </w:p>
     <w:p>
@@ -4364,7 +4419,7 @@
         <w:pStyle w:val="BodyText"/>
       </w:pPr>
       <w:r>
-        <w:t xml:space="preserve">The multi-allele extension shows the recipe is portable: one rebalanced pan model matches per-allele specialists on four of five alleles (B*07:02 excepted) and reaches 0.819 pooled sensitivity on 15 alleles, approximating NetMHCpan’s practical value with a simple DFFN. This is consistent with the pan-specific paradigm established by mono-allelic immunopeptidomics [24], now exemplified by MixMHCpred v3.0’s pan-allele model, which outperforms state-of-the-art MHC-I ligand predictors across alleles and species [25]. Yet non-canonical (motif-failing) binders plateau at ~0.65 sensitivity across four sequence-based predictors: our Deep FFN (0.607), MHCflurry (0.668), the ESM-2-based MUNIS (0.647), and BigMHC (0.660) fall within a narrow band (0.61–0.67), far below the ~0.98 canonical sensitivity. This convergence is partly a threshold artifact — the predictors operate at unmatched points, and aligned to matched canonical sensitivity the values diverge (DFFN 0.454, MHCflurry 0.497, MUNIS 0.647, BigMHC 0.653) — so the shared ceiling is weaker than the raw band suggests, though it remains far below canonical performance for every predictor. The energy-compensated tail is prediction-resistant to all four. Canonical binding is solved across methods; the non-canonical tail is where current predictors still fall short. This frontier extends beyond anchor-motif violations to non-coding, fusion-derived, and post-translationally modified peptides, for which current predictors remain under-powered [26]. A new wave of transformer- and PLM-based predictors continues to improve canonical prediction [27,28], but whether any of them lifts the non-canonical plateau remains to be seen.</w:t>
+        <w:t xml:space="preserve">The multi-allele extension shows the recipe is portable: one rebalanced pan model matches per-allele specialists on four of five alleles (B*07:02 excepted) and reaches 0.819 pooled sensitivity on 15 alleles, approximating NetMHCpan’s practical value with a simple DFFN. This is consistent with the pan-specific paradigm established by mono-allelic immunopeptidomics [24], now exemplified by MixMHCpred v3.0’s pan-allele model, which outperforms state-of-the-art MHC-I ligand predictors across alleles and species [25]. Yet non-canonical (motif-failing) binders remain far below canonical performance across four sequence-based predictors: our Deep FFN (0.607), MHCflurry (0.668), the ESM-2-based MUNIS (0.647), and BigMHC (0.660) report 0.61–0.67 at their own (unmatched) operating points. This convergence is partly a threshold artifact — the predictors operate at unmatched points, and aligned to matched canonical sensitivity the values diverge (DFFN 0.454, MHCflurry 0.497, MUNIS 0.647, BigMHC 0.653) — so the shared ceiling is weaker than the raw band suggests, though it remains far below canonical performance for every predictor. The energy-compensated tail is prediction-resistant to all four. Canonical binding is solved across methods; the non-canonical tail is where current predictors still fall short. This frontier extends beyond anchor-motif violations to non-coding, fusion-derived, and post-translationally modified peptides, for which current predictors remain under-powered [26]. A new wave of transformer- and PLM-based predictors continues to improve canonical prediction [27,28], but whether any of them lifts the non-canonical plateau remains to be seen.</w:t>
       </w:r>
     </w:p>
     <w:bookmarkEnd w:id="37"/>
@@ -4412,7 +4467,28 @@
         <w:pStyle w:val="FirstParagraph"/>
       </w:pPr>
       <w:r>
-        <w:t xml:space="preserve">Training labels are MHCflurry-derived rather than experimental affinities, so our single-allele benchmark is itself subject to the label circularity we describe; we quantify this by cross-referencing the 42 A*02:01-verified IEDB epitopes against MHCflurry’s training corpus; the large majority overlapped, and the few non-overlapping epitopes were nonetheless correctly classified, providing limited evidence of generalisation beyond the training distribution. Similarly, the temporal holdout (§3.11) shows that post-2022 epitopes are recognised without a detectable drop, but the evaluated model’s training snapshot was not time-truncated to pre-2022, so this result bounds labeler-level circularity rather than formally excluding leakage of post-2022 peptides into the model’s training data. The single-allele design was deliberate — holding the allele constant isolates label-source variation from allele-driven confounds — but the multi-allele extension addresses the generalisability question directly. The multi-allele estimates rest on IEDB-derived positives; experimental (non-IEDB) validation of the extreme tail is outstanding, and a pMHC-fine-tuned structure model (beyond generic AlphaFold-Multimer) might lift the Type B plateau. All translational predictions and the cancer neoepitope candidates require experimental confirmation (e.g., IFN-γ ELISpot or tetramer staining). Antigen-processing steps (proteasomal cleavage, TAP transport) are not modelled.</w:t>
+        <w:t xml:space="preserve">Training labels are MHCflurry-derived rather than experimental affinities, so our single-allele benchmark is itself subject to the label-definition divergence we describe; we quantify this by cross-referencing the 42 A*02:01-verified IEDB epitopes against MHCflurry’s training corpus; 40 of the 42 overlapped with MHCflurry’s training corpus, and the two non-overlapping epitopes (</w:t>
+      </w:r>
+      <w:r>
+        <w:rPr>
+          <w:rStyle w:val="VerbatimChar"/>
+        </w:rPr>
+        <w:t xml:space="preserve">YILEETSVM</w:t>
+      </w:r>
+      <w:r>
+        <w:t xml:space="preserve">,</w:t>
+      </w:r>
+      <w:r>
+        <w:t xml:space="preserve"> </w:t>
+      </w:r>
+      <w:r>
+        <w:rPr>
+          <w:rStyle w:val="VerbatimChar"/>
+        </w:rPr>
+        <w:t xml:space="preserve">YLQPRTFLL</w:t>
+      </w:r>
+      <w:r>
+        <w:t xml:space="preserve">) were nonetheless correctly classified, providing limited evidence of generalisation beyond the training distribution. Similarly, the temporal holdout (§3.11) shows that post-2022 epitopes are recognised without a detectable drop, but the evaluated model’s training snapshot was not time-truncated to pre-2022, so this result bounds labeler-level circularity rather than formally excluding leakage of post-2022 peptides into the model’s training data. The single-allele design was deliberate — holding the allele constant isolates label-source variation from allele-driven confounds — but the multi-allele extension addresses the generalisability question directly. The multi-allele estimates rest on IEDB-derived positives; experimental (non-IEDB) validation of the extreme tail is outstanding, and a pMHC-fine-tuned structure model (beyond generic AlphaFold-Multimer) might lift the Type B plateau. All translational predictions and the cancer neoepitope candidates require experimental confirmation (e.g., IFN-γ ELISpot or tetramer staining). Antigen-processing steps (proteasomal cleavage, TAP transport) are not modelled.</w:t>
       </w:r>
     </w:p>
     <w:bookmarkEnd w:id="39"/>
@@ -4431,7 +4507,7 @@
         <w:pStyle w:val="FirstParagraph"/>
       </w:pPr>
       <w:r>
-        <w:t xml:space="preserve">Architecture choice has a modest effect on peptide-MHC binding prediction: a CNN ranked above the Deep FFN in all five seeds; the top four architectures fell within ~2 percentage points, and a Random Forest was clearly worse. Random-label controls confirmed chance-level performance, ruling out noise overfitting. Canonical binding is largely captured by the anchor motif, but a zero-parameter anchor rule (sensitivity 0.79) underperforms the trained model (0.98), which recovers non-canonical binders the rule misses — while non-canonical binders reach ~0.65 sensitivity across four sequence-based predictors at unmatched operating points, marking the unresolved part of the problem. Beyond peptide-MHC, the three artifacts we corrected — data-size imbalance, a degenerate null, and stale checkpoints — illustrate a general benchmark-composition failure mode that reproduces false conclusions across machine-learning benchmarks; the label-fidelity decomposition and the Box 1 checklist are offered as reusable safeguards that others can apply to their own benchmarks. Experimental validation of the non-canonical tail is the decisive next step.</w:t>
+        <w:t xml:space="preserve">Architecture choice has a small effect on peptide-MHC binding prediction: a CNN ranked above the Deep FFN in four of five seeds (a difference within seed-to-seed variability); the top four architectures fell within ~2 percentage points, and a Random Forest was clearly worse. Random-label controls confirmed chance-level performance, ruling out noise overfitting. Canonical binding is largely captured by the anchor motif, but a zero-parameter anchor rule (sensitivity 0.79) underperforms the trained model (0.98), which recovers non-canonical binders the rule misses — while non-canonical binders reach 0.45–0.65 sensitivity across four sequence-based predictors at matched canonical sensitivity 0.95, marking the unresolved part of the problem. Beyond peptide-MHC, the three artifacts we corrected — data-size imbalance, a degenerate null, and stale checkpoints — illustrate a general benchmark-composition failure mode that reproduces false conclusions across machine-learning benchmarks. The label-fidelity decomposition distinguishes label-definition divergence from circularity — two equally faithful labelers (~0.94 AUC) that agree on only 62% of the boundary — and, with the Box 1 checklist, is offered as a reusable safeguard that others can apply to their own benchmarks. Experimental validation of the non-canonical tail is the decisive next step.</w:t>
       </w:r>
     </w:p>
     <w:bookmarkEnd w:id="41"/>
@@ -4603,7 +4679,7 @@
         <w:t xml:space="preserve"> </w:t>
       </w:r>
       <w:r>
-        <w:t xml:space="preserve">Predictor plateau: canonical versus Type B (non-canonical) sensitivity for Deep FFN, MHCflurry, MUNIS, and BigMHC (sequence); dashed line marks the ~0.65 Type B plateau.</w:t>
+        <w:t xml:space="preserve">Predictor sensitivity for Deep FFN, MHCflurry, MUNIS, and BigMHC (sequence): canonical versus Type B (non-canonical) sensitivity, shown at matched canonical operating points (0.90/0.95/0.98).</w:t>
       </w:r>
     </w:p>
     <w:p>
@@ -5015,7 +5091,7 @@
         </w:numPr>
       </w:pPr>
       <w:r>
-        <w:t xml:space="preserve">Henikoff S, Henikoff JG. Amino acid substitution matrices from protein blocks. Proc Natl Acad Sci USA 1992;89:10915-10919.</w:t>
+        <w:t xml:space="preserve">Bernett J, Blumenthal DB, Grimm DG, et al. Guiding questions to avoid data leakage in biological machine learning applications. Nat Methods 2024. doi:10.1038/s41592-024-02362-y.</w:t>
       </w:r>
     </w:p>
     <w:p>
@@ -5027,7 +5103,7 @@
         </w:numPr>
       </w:pPr>
       <w:r>
-        <w:t xml:space="preserve">Lin Z, Akin H, Rao R, et al. Evolutionary-scale prediction of atomic-level protein structure with a language model. Science 2023;379:1123-1130.</w:t>
+        <w:t xml:space="preserve">Henikoff S, Henikoff JG. Amino acid substitution matrices from protein blocks. Proc Natl Acad Sci USA 1992;89:10915-10919.</w:t>
       </w:r>
     </w:p>
     <w:p>
@@ -5039,7 +5115,7 @@
         </w:numPr>
       </w:pPr>
       <w:r>
-        <w:t xml:space="preserve">Nielsen M, Lundegaard C, Worning P, et al. Reliable prediction of T-cell epitopes using neural networks with novel sequence representations. Protein Sci 2003;12:1007-1017.</w:t>
+        <w:t xml:space="preserve">Lin Z, Akin H, Rao R, et al. Evolutionary-scale prediction of atomic-level protein structure with a language model. Science 2023;379:1123-1130.</w:t>
       </w:r>
     </w:p>
     <w:p>
@@ -5051,7 +5127,7 @@
         </w:numPr>
       </w:pPr>
       <w:r>
-        <w:t xml:space="preserve">Vita R, Mahajan S, Overton JA, et al. The Immune Epitope Database (IEDB): 2018 update. Nucleic Acids Res 2019;47:D339-D343.</w:t>
+        <w:t xml:space="preserve">Nielsen M, Lundegaard C, Worning P, et al. Reliable prediction of T-cell epitopes using neural networks with novel sequence representations. Protein Sci 2003;12:1007-1017.</w:t>
       </w:r>
     </w:p>
     <w:p>
@@ -5063,7 +5139,7 @@
         </w:numPr>
       </w:pPr>
       <w:r>
-        <w:t xml:space="preserve">Malekzadeh P, Yossef R, Cafri G, et al. Antigen experienced T cells from peripheral blood recognize p53 neoantigens. Clin Cancer Res 2020. doi:10.1158/1078-0432.CCR-19-1874.</w:t>
+        <w:t xml:space="preserve">Vita R, Mahajan S, Overton JA, et al. The Immune Epitope Database (IEDB): 2018 update. Nucleic Acids Res 2019;47:D339-D343.</w:t>
       </w:r>
     </w:p>
     <w:p>
@@ -5075,7 +5151,7 @@
         </w:numPr>
       </w:pPr>
       <w:r>
-        <w:t xml:space="preserve">Quandt J, Schlude C, Bartoschek M, et al. Long-peptide vaccination with driver gene mutations in p53 and Kras induces cancer mutation-specific effector as well as regulatory T cell responses. Oncoimmunology 2018;7:e1500671.</w:t>
+        <w:t xml:space="preserve">Malekzadeh P, Yossef R, Cafri G, et al. Antigen experienced T cells from peripheral blood recognize p53 neoantigens. Clin Cancer Res 2020. doi:10.1158/1078-0432.CCR-19-1874.</w:t>
       </w:r>
     </w:p>
     <w:p>
@@ -5087,7 +5163,7 @@
         </w:numPr>
       </w:pPr>
       <w:r>
-        <w:t xml:space="preserve">Wu W, Chen Y, Huang L, et al. Point mutation screening of tumor neoantigens and peptide-induced specific cytotoxic T lymphocytes using The Cancer Genome Atlas database. Oncol Lett 2020;20:11986.</w:t>
+        <w:t xml:space="preserve">Quandt J, Schlude C, Bartoschek M, et al. Long-peptide vaccination with driver gene mutations in p53 and Kras induces cancer mutation-specific effector as well as regulatory T cell responses. Oncoimmunology 2018;7:e1500671.</w:t>
       </w:r>
     </w:p>
     <w:p>
@@ -5099,7 +5175,7 @@
         </w:numPr>
       </w:pPr>
       <w:r>
-        <w:t xml:space="preserve">Hermann L, Fiedler T, Nguyen HA, et al. Beware of data leakage from protein LLM pretraining. Proc Mach Learn Res 2024;261:106-116.</w:t>
+        <w:t xml:space="preserve">Wu W, Chen Y, Huang L, et al. Point mutation screening of tumor neoantigens and peptide-induced specific cytotoxic T lymphocytes using The Cancer Genome Atlas database. Oncol Lett 2020;20:11986.</w:t>
       </w:r>
     </w:p>
     <w:p>
@@ -5111,7 +5187,7 @@
         </w:numPr>
       </w:pPr>
       <w:r>
-        <w:t xml:space="preserve">Kapoor S, Narayanan A. Leakage and the reproducibility crisis in machine-learning-based science. Patterns 2023;4:100804.</w:t>
+        <w:t xml:space="preserve">Hermann L, Fiedler T, Nguyen HA, et al. Beware of data leakage from protein LLM pretraining. Proc Mach Learn Res 2024;261:106-116.</w:t>
       </w:r>
     </w:p>
     <w:p>
@@ -5123,7 +5199,7 @@
         </w:numPr>
       </w:pPr>
       <w:r>
-        <w:t xml:space="preserve">Bernett J, Blumenthal DB, Grimm DG, et al. Guiding questions to avoid data leakage in biological machine learning applications. Nat Methods 2024. doi:10.1038/s41592-024-02362-y.</w:t>
+        <w:t xml:space="preserve">Kapoor S, Narayanan A. Leakage and the reproducibility crisis in machine-learning-based science. Patterns 2023;4:100804.</w:t>
       </w:r>
     </w:p>
     <w:p>

</xml_diff>

<commit_message>
docs: finalize single-allele benchmark manuscript for PLOS CB submission
- honest single-allele scope in Limitations (A*01:01/A*03:01 probe: rank
  agreement drops to rho=0.73/0.82 vs 0.96; ~4-fold offset does not transfer)
- cover letter: add point 4 (single-allele as methodological choice), add
  BigMHC to criterion 2, unify Spearman to 0.96
- full 7-author ORCID list (Xiangyang Xue verified via ORCID API)
- one-command reproducibility build (build_release.py) + figure regen scripts
- consistency audit + author-year-to-numbered citation conversion

Co-Authored-By: Claude Code <noreply@anthropic.com>
</commit_message>
<xml_diff>
--- a/06_Bioinformatics_Submission/manuscript_plos.docx
+++ b/06_Bioinformatics_Submission/manuscript_plos.docx
@@ -2,13 +2,13 @@
 <file path=word/document.xml><?xml version="1.0" encoding="utf-8"?>
 <w:document xmlns:w="http://schemas.openxmlformats.org/wordprocessingml/2006/main" xmlns:m="http://schemas.openxmlformats.org/officeDocument/2006/math" xmlns:r="http://schemas.openxmlformats.org/officeDocument/2006/relationships" xmlns:o="urn:schemas-microsoft-com:office:office" xmlns:v="urn:schemas-microsoft-com:vml" xmlns:w10="urn:schemas-microsoft-com:office:word" xmlns:a="http://schemas.openxmlformats.org/drawingml/2006/main" xmlns:pic="http://schemas.openxmlformats.org/drawingml/2006/picture" xmlns:wp="http://schemas.openxmlformats.org/drawingml/2006/wordprocessingDrawing">
   <w:body>
-    <w:bookmarkStart w:id="50" w:name="X1f1b58384c9e21f934c7967fa78c7705e5f576e"/>
+    <w:bookmarkStart w:id="37" w:name="X9e5fcdec263207596ea0c9145201f0120d49339"/>
     <w:p>
       <w:pPr>
         <w:pStyle w:val="Heading1"/>
       </w:pPr>
       <w:r>
-        <w:t xml:space="preserve">Label-Fidelity Decomposition Distinguishes Label-Definition Divergence from Circularity in Peptide-MHC-I Benchmarking</w:t>
+        <w:t xml:space="preserve">Benchmark Hygiene Reveals the Non-Canonical Frontier of Peptide-MHC-I Binding Prediction</w:t>
       </w:r>
     </w:p>
     <w:p>
@@ -85,7 +85,7 @@
         <w:t xml:space="preserve">Word count</w:t>
       </w:r>
       <w:r>
-        <w:t xml:space="preserve">: ~4,700 (main text) |</w:t>
+        <w:t xml:space="preserve">: ~3,000 (main text) |</w:t>
       </w:r>
       <w:r>
         <w:t xml:space="preserve"> </w:t>
@@ -98,7 +98,7 @@
         <w:t xml:space="preserve">Tables</w:t>
       </w:r>
       <w:r>
-        <w:t xml:space="preserve">: 10 |</w:t>
+        <w:t xml:space="preserve">: 5 |</w:t>
       </w:r>
       <w:r>
         <w:t xml:space="preserve"> </w:t>
@@ -111,7 +111,7 @@
         <w:t xml:space="preserve">Figures</w:t>
       </w:r>
       <w:r>
-        <w:t xml:space="preserve">: 11</w:t>
+        <w:t xml:space="preserve">: 9</w:t>
       </w:r>
     </w:p>
     <w:p>
@@ -204,43 +204,105 @@
       </w:r>
     </w:p>
     <w:p>
-      <w:r>
-        <w:pict>
-          <v:rect style="width:0;height:1.5pt" o:hralign="center" o:hrstd="t" o:hr="t"/>
-        </w:pict>
-      </w:r>
-    </w:p>
-    <w:bookmarkStart w:id="9" w:name="abstract"/>
-    <w:p>
-      <w:pPr>
-        <w:pStyle w:val="Heading2"/>
-      </w:pPr>
-      <w:r>
-        <w:t xml:space="preserve">Abstract</w:t>
-      </w:r>
-    </w:p>
-    <w:p>
-      <w:pPr>
-        <w:pStyle w:val="FirstParagraph"/>
-      </w:pPr>
-      <w:r>
-        <w:t xml:space="preserve">Peptide-MHC-I binding predictors are routinely trained on computationally labelled data, yet benchmark scores that merely reproduce the labeler’s decision boundary are rarely distinguished from true binding accuracy. We introduce a</w:t>
-      </w:r>
-      <w:r>
-        <w:t xml:space="preserve"> </w:t>
-      </w:r>
+      <w:pPr>
+        <w:pStyle w:val="BodyText"/>
+      </w:pPr>
       <w:r>
         <w:rPr>
           <w:b/>
           <w:bCs/>
         </w:rPr>
-        <w:t xml:space="preserve">label-fidelity decomposition</w:t>
-      </w:r>
-      <w:r>
-        <w:t xml:space="preserve"> </w:t>
-      </w:r>
-      <w:r>
-        <w:t xml:space="preserve">that separates a benchmark’s reported accuracy into a labelling scheme’s</w:t>
+        <w:t xml:space="preserve">ORCIDs</w:t>
+      </w:r>
+      <w:r>
+        <w:t xml:space="preserve">: Yunshi Huang 0009-0009-8852-1479; Weisheng Chen 0000-0002-5367-9446; Yiqi Cai 0000-0002-4014-6544; Xiaopeng Zhuang 0009-0003-4289-0734; Zhuxian Zhou 0000-0002-7104-9915; Xiangyang Xue 0000-0002-8670-2016; Zhuha Zhou 0009-0005-1818-4789.</w:t>
+      </w:r>
+    </w:p>
+    <w:p>
+      <w:r>
+        <w:pict>
+          <v:rect style="width:0;height:1.5pt" o:hralign="center" o:hrstd="t" o:hr="t"/>
+        </w:pict>
+      </w:r>
+    </w:p>
+    <w:bookmarkStart w:id="9" w:name="abstract"/>
+    <w:p>
+      <w:pPr>
+        <w:pStyle w:val="Heading2"/>
+      </w:pPr>
+      <w:r>
+        <w:t xml:space="preserve">Abstract</w:t>
+      </w:r>
+    </w:p>
+    <w:p>
+      <w:pPr>
+        <w:pStyle w:val="FirstParagraph"/>
+      </w:pPr>
+      <w:r>
+        <w:t xml:space="preserve">Peptide-MHC-I binding predictors are routinely trained on computationally labelled data, yet benchmark scores that reproduce a labeler’s decision boundary are rarely separated from true binding accuracy. We present a controlled benchmark of six deep-learning architectures for HLA-A*02:01 under multi-seed uncertainty, and demonstrate how benchmark composition manufactures false conclusions: two apparent findings dissolved under re-analysis, each traced to a benchmark-composition artifact. The genuinely hard problem is non-canonical binding: a zero-parameter anchor rule underperforms the trained model, which recovers non-canonical binders the rule misses. We validate against 42 re-verified IEDB epitopes (97.6% sensitivity), and show that two high-fidelity predictors that rank peptides almost identically (Spearman ρ = 0.96) nevertheless agree on only 62% of hard labels, a discrepancy that reflects a ~4-fold offset in their percentile cutpoints and largely vanishes when the cutpoints are aligned. A benchmark-hygiene checklist distils the countermeasures. Code, models, and data are available at github.com/woodhaha/peptide-mhc-benchmark.</w:t>
+      </w:r>
+    </w:p>
+    <w:bookmarkEnd w:id="9"/>
+    <w:bookmarkStart w:id="10" w:name="author-summary"/>
+    <w:p>
+      <w:pPr>
+        <w:pStyle w:val="Heading2"/>
+      </w:pPr>
+      <w:r>
+        <w:t xml:space="preserve">Author summary</w:t>
+      </w:r>
+    </w:p>
+    <w:p>
+      <w:pPr>
+        <w:pStyle w:val="FirstParagraph"/>
+      </w:pPr>
+      <w:r>
+        <w:t xml:space="preserve">Predicting which peptides bind to MHC class I molecules — the first step in T-cell immune recognition — underpins cancer-vaccine and immunotherapy design. Many machine-learning tools now make these predictions, but it is hard to tell whether a tool’s reported accuracy reflects genuine biological insight or merely the quirks of how it was trained and evaluated. We benchmarked six neural-network architectures for the most common human MHC allele (HLA-A*02:01) and audited the benchmark itself. Two findings emerged. First, benchmark scores are highly sensitive to where the</w:t>
+      </w:r>
+      <w:r>
+        <w:t xml:space="preserve"> </w:t>
+      </w:r>
+      <w:r>
+        <w:t xml:space="preserve">“binder”</w:t>
+      </w:r>
+      <w:r>
+        <w:t xml:space="preserve"> </w:t>
+      </w:r>
+      <w:r>
+        <w:t xml:space="preserve">threshold is drawn: two leading predictors that rank peptides almost identically agree on only 62% of hard labels, a gap that reflects a roughly four-fold offset in their percentile cutpoints and largely vanishes when the cutpoints are aligned. Second, the genuinely difficult frontier is non-canonical binding — peptides that violate the classic anchor-position rules, which simple motif rules miss but the trained model recovers. We distil these lessons into a reusable benchmark-hygiene checklist so that others can avoid reporting evaluation artifacts as biological findings.</w:t>
+      </w:r>
+    </w:p>
+    <w:p>
+      <w:r>
+        <w:pict>
+          <v:rect style="width:0;height:1.5pt" o:hralign="center" o:hrstd="t" o:hr="t"/>
+        </w:pict>
+      </w:r>
+    </w:p>
+    <w:bookmarkEnd w:id="10"/>
+    <w:bookmarkStart w:id="11" w:name="introduction"/>
+    <w:p>
+      <w:pPr>
+        <w:pStyle w:val="Heading2"/>
+      </w:pPr>
+      <w:r>
+        <w:t xml:space="preserve">1 Introduction</w:t>
+      </w:r>
+    </w:p>
+    <w:p>
+      <w:pPr>
+        <w:pStyle w:val="FirstParagraph"/>
+      </w:pPr>
+      <w:r>
+        <w:t xml:space="preserve">MHC class I molecules present 8–11-mer peptides to CD8+ T cells, and accurate prediction of peptide–MHC-I binding underpins epitope discovery for vaccine design and cancer immunotherapy [1,2]. For HLA-A*02:01 — the most prevalent class I allele globally — binding is dominated by two primary anchor positions: position 2 (p2, hydrophobic: Leu/Met/Ile/Val) and position 9 (p9, C-terminal, Val/Leu preferred) [3,4]. Computational predictors have evolved from position-specific scoring matrices to neural networks and pan-specific tools such as NetMHCpan [5], MHCflurry [6], BigMHC [7], and MUNIS [8], increasingly using protein language model embeddings [9].</w:t>
+      </w:r>
+    </w:p>
+    <w:p>
+      <w:pPr>
+        <w:pStyle w:val="BodyText"/>
+      </w:pPr>
+      <w:r>
+        <w:t xml:space="preserve">Several gaps remain. A particularly under-examined one is</w:t>
       </w:r>
       <w:r>
         <w:t xml:space="preserve"> </w:t>
@@ -250,59 +312,37 @@
           <w:b/>
           <w:bCs/>
         </w:rPr>
-        <w:t xml:space="preserve">absolute predictive fidelity</w:t>
-      </w:r>
-      <w:r>
-        <w:t xml:space="preserve"> </w:t>
-      </w:r>
-      <w:r>
-        <w:t xml:space="preserve">(agreement with experimental binding) and its</w:t>
-      </w:r>
-      <w:r>
-        <w:t xml:space="preserve"> </w:t>
-      </w:r>
-      <w:r>
-        <w:rPr>
-          <w:b/>
-          <w:bCs/>
-        </w:rPr>
-        <w:t xml:space="preserve">cross-labeler transferability</w:t>
-      </w:r>
-      <w:r>
-        <w:t xml:space="preserve"> </w:t>
-      </w:r>
-      <w:r>
-        <w:t xml:space="preserve">(agreement with an independent predictor). On a 5,190-peptide HLA-A*02:01 benchmark, MHCflurry and NetMHCpan both reach ~0.94 AUC on 6,524 measured affinities yet agree on only 62% of boundary peptides — showing that low cross-labeler agreement reflects</w:t>
-      </w:r>
-      <w:r>
-        <w:t xml:space="preserve"> </w:t>
-      </w:r>
-      <w:r>
-        <w:rPr>
-          <w:b/>
-          <w:bCs/>
-        </w:rPr>
-        <w:t xml:space="preserve">label-definition divergence</w:t>
-      </w:r>
-      <w:r>
-        <w:t xml:space="preserve">, not label circularity. A zero-parameter anchor rule underperformed the trained model, and non-canonical binders reached 0.45–0.65 sensitivity across four predictors at matched canonical sensitivity 0.95, including BigMHC. Three apparent findings dissolved under controlled re-analysis, each traced to a benchmark-composition artifact, and a benchmark-hygiene checklist distils the countermeasures. Code, models, and data are available at github.com/woodhaha/peptide-mhc-benchmark.</w:t>
-      </w:r>
-    </w:p>
-    <w:p>
-      <w:r>
-        <w:pict>
-          <v:rect style="width:0;height:1.5pt" o:hralign="center" o:hrstd="t" o:hr="t"/>
-        </w:pict>
-      </w:r>
-    </w:p>
-    <w:bookmarkEnd w:id="9"/>
-    <w:bookmarkStart w:id="10" w:name="introduction"/>
+        <w:t xml:space="preserve">cutpoint sensitivity</w:t>
+      </w:r>
+      <w:r>
+        <w:t xml:space="preserve">: because &gt;55% of IEDB entries are computationally rather than experimentally labelled [10], a predictor’s apparent accuracy can track the decision boundary of whichever labeler trained it rather than true binding — and two labelers that agree on peptide ranking may still disagree on hard labels wherever their percentile thresholds differ. The impact of training-label quality is seldom quantified, and general guidance on avoiding data leakage [11] has not been instantiated as a peptide-MHC-specific set of tripwires. Head-to-head architecture comparisons under fully controlled conditions (identical training data, encoding, evaluation) are uncommon. And the translation of binding prediction to real-world epitope discovery is rarely demonstrated in a unified, reproducible pipeline.</w:t>
+      </w:r>
+    </w:p>
+    <w:p>
+      <w:pPr>
+        <w:pStyle w:val="BodyText"/>
+      </w:pPr>
+      <w:r>
+        <w:t xml:space="preserve">To isolate the effects of architecture choice, label quality, and encoding, we present a controlled benchmark. We compare six architectures under multi-seed uncertainty and find that architecture effects are small and largely indistinguishable after accounting for seed and sampling uncertainty, confirm that random labels fall to chance, and evaluate ESM-2 embeddings against BLOSUM62 with a mean-pooled ablation. We further validate against 42 A*02:01-verified IEDB epitopes, and scan proteins and cancer mutations as a translational application. We report this as a benchmark following the criteria of the PLOS Computational Biology benchmark category [12].</w:t>
+      </w:r>
+    </w:p>
+    <w:bookmarkEnd w:id="11"/>
+    <w:bookmarkStart w:id="17" w:name="methods"/>
     <w:p>
       <w:pPr>
         <w:pStyle w:val="Heading2"/>
       </w:pPr>
       <w:r>
-        <w:t xml:space="preserve">1 Introduction</w:t>
+        <w:t xml:space="preserve">2 Methods</w:t>
+      </w:r>
+    </w:p>
+    <w:bookmarkStart w:id="12" w:name="training-data-and-labels"/>
+    <w:p>
+      <w:pPr>
+        <w:pStyle w:val="Heading3"/>
+      </w:pPr>
+      <w:r>
+        <w:t xml:space="preserve">2.1 Training data and labels</w:t>
       </w:r>
     </w:p>
     <w:p>
@@ -310,87 +350,99 @@
         <w:pStyle w:val="FirstParagraph"/>
       </w:pPr>
       <w:r>
-        <w:t xml:space="preserve">MHC class I molecules present 8–11-mer peptides to CD8+ T cells, and accurate prediction of peptide–MHC-I binding underpins epitope discovery for vaccine design and cancer immunotherapy [1,2]. For HLA-A*02:01 — the most prevalent class I allele globally — binding is dominated by two primary anchor positions: position 2 (p2, hydrophobic: Leu/Met/Ile/Val) and position 9 (p9, C-terminal, Val/Leu preferred) [3,4]. Computational predictors have evolved from position-specific scoring matrices to neural networks and pan-specific tools such as NetMHCpan [5], MHCflurry [6], BigMHC [7], and MUNIS [8], increasingly using protein language model embeddings [9].</w:t>
-      </w:r>
-    </w:p>
-    <w:p>
-      <w:pPr>
-        <w:pStyle w:val="BodyText"/>
-      </w:pPr>
-      <w:r>
-        <w:t xml:space="preserve">Several gaps remain. A particularly under-examined one is</w:t>
-      </w:r>
-      <w:r>
-        <w:t xml:space="preserve"> </w:t>
-      </w:r>
-      <w:r>
-        <w:rPr>
-          <w:b/>
-          <w:bCs/>
-        </w:rPr>
-        <w:t xml:space="preserve">label-definition divergence</w:t>
-      </w:r>
-      <w:r>
-        <w:t xml:space="preserve">: because &gt;55% of IEDB entries are computationally rather than experimentally labelled [10], a predictor’s apparent accuracy can track the decision boundary of whichever labeler trained it rather than true binding — yet whether this reflects a</w:t>
-      </w:r>
-      <w:r>
-        <w:t xml:space="preserve"> </w:t>
-      </w:r>
-      <w:r>
-        <w:rPr>
-          <w:i/>
-          <w:iCs/>
-        </w:rPr>
-        <w:t xml:space="preserve">wrong</w:t>
-      </w:r>
-      <w:r>
-        <w:t xml:space="preserve"> </w:t>
-      </w:r>
-      <w:r>
-        <w:t xml:space="preserve">labeler (circularity) or merely a</w:t>
-      </w:r>
-      <w:r>
-        <w:t xml:space="preserve"> </w:t>
-      </w:r>
-      <w:r>
-        <w:rPr>
-          <w:i/>
-          <w:iCs/>
-        </w:rPr>
-        <w:t xml:space="preserve">different</w:t>
-      </w:r>
-      <w:r>
-        <w:t xml:space="preserve"> </w:t>
-      </w:r>
-      <w:r>
-        <w:t xml:space="preserve">binder definition has not been disentangled. The impact of training-label quality is seldom quantified, and general guidance on avoiding data leakage [11] has not been instantiated as a peptide-MHC-specific set of tripwires. Head-to-head architecture comparisons under fully controlled conditions (identical training data, encoding, evaluation) are uncommon. Whether a single pan-specific model can replace per-allele specialists, and how hard non-canonical binders are across alleles, remains unsettled. And the translation of binding prediction to real-world epitope discovery is rarely demonstrated in a unified, reproducible pipeline.</w:t>
-      </w:r>
-    </w:p>
-    <w:p>
-      <w:pPr>
-        <w:pStyle w:val="BodyText"/>
-      </w:pPr>
-      <w:r>
-        <w:t xml:space="preserve">To isolate the effects of architecture choice, label quality, and encoding, we present a controlled benchmark. We compare six architectures under multi-seed uncertainty and find that architecture effects are small and largely indistinguishable after accounting for seed and sampling uncertainty, confirm that random labels fall to chance, and evaluate ESM-2 embeddings against BLOSUM62 with a mean-pooled ablation. We further validate against 42 A*02:01-verified IEDB epitopes, scan proteins and cancer mutations as a translational application, and extend to five HLA-I alleles and a 15-allele panel to test whether a single rebalanced pan model matches per-allele specialists and to quantify how hard non-canonical binders are for four sequence predictors.</w:t>
-      </w:r>
-    </w:p>
-    <w:bookmarkEnd w:id="10"/>
-    <w:bookmarkStart w:id="23" w:name="methods"/>
+        <w:t xml:space="preserve">100,000 random 9-mer peptides were generated by uniform sampling of the 20 standard amino acids. Each was labelled with MHCflurry 2.2.1 against HLA-A*02:01 and assigned to Strong Binder (SB, percentile rank &lt;0.5%), Weak Binder (WB, 0.5%≤rank&lt;2.0%), or Non-Binder (NB, rank ≥2.0%) following the netMHCpan convention [5]. The resulting distribution (1.7% SB, 5.1% WB, 93.2% NB) was balanced by downsampling to 1,730 per class (n=5,190), partitioned 90/10 into training (n=4,671) and held-out test (n=519) sets with stratified sampling (seed 42). Two comparator labelling strategies were implemented: a PSSM encoding crystallographic A*02:01 anchor preferences, and random synthetic labels as a baseline control. A held-out benchmark of 42 experimentally validated IEDB epitopes (HLA-A*02:01-restricted, with positive binding/T-cell assay evidence, re-verified against the IEDB on 2026-10-23) plus 20 homopolymer negatives (≤2 unique amino acids) was curated from the IEDB (query-api.iedb.org); label-corpus overlap was determined by sequence-identity match against the IEDB entries in MHCflurry’s training corpus.</w:t>
+      </w:r>
+    </w:p>
+    <w:bookmarkEnd w:id="12"/>
+    <w:bookmarkStart w:id="13" w:name="peptide-encoding"/>
+    <w:p>
+      <w:pPr>
+        <w:pStyle w:val="Heading3"/>
+      </w:pPr>
+      <w:r>
+        <w:t xml:space="preserve">2.2 Peptide encoding</w:t>
+      </w:r>
+    </w:p>
+    <w:p>
+      <w:pPr>
+        <w:pStyle w:val="FirstParagraph"/>
+      </w:pPr>
+      <w:r>
+        <w:t xml:space="preserve">Each 9-mer was encoded with the BLOSUM62 matrix [13], min–max normalized, producing a 9×20 matrix flattened to 180 dimensions for fully connected networks. ESM-2 embeddings [14] were extracted at t6 (2,880-dim per-peptide; 320 per position × 9) and t12 (4,320-dim; 480 per position × 9) depths — the two smallest ESM-2 checkpoints (8M and 35M parameters); a mean-pooled t6 variant (320-dim) served as an ablation control destroying positional information.</w:t>
+      </w:r>
+    </w:p>
+    <w:bookmarkEnd w:id="13"/>
+    <w:bookmarkStart w:id="14" w:name="model-architectures"/>
+    <w:p>
+      <w:pPr>
+        <w:pStyle w:val="Heading3"/>
+      </w:pPr>
+      <w:r>
+        <w:t xml:space="preserve">2.3 Model architectures</w:t>
+      </w:r>
+    </w:p>
+    <w:p>
+      <w:pPr>
+        <w:pStyle w:val="FirstParagraph"/>
+      </w:pPr>
+      <w:r>
+        <w:t xml:space="preserve">Six classifiers were implemented: (i) FFN [15]: 180→90→3, 49K params; (ii) Deep FFN: 180→360→180→90→45→3 with batch normalisation and dropout, 152K params; (iii) CNN: Conv2D(32,3×3) + FFN body, 1.05M params; (iv) LSTM(64)→dense(32)→3, 24K params; (v) ResNet-style stem + 3 residual blocks, 325K params; (vi) Random Forest (100 trees). For ESM-2 embeddings an FFN classifier with a 256→128→64 stack was trained. All networks used cross-entropy loss with Adam or RMSprop (lr 0.001), 150 epochs, batch size 50, 20% internal validation split, early stopping (patience 10), and learning-rate reduction on plateau. Five-fold stratified cross-validation was performed for the FFN. The held-out test set (519 peptides) was disjoint from training and used for all reported metrics. All models were trained and evaluated on a single CPU (TensorFlow 2.x on native Windows, without GPU acceleration); confidence intervals are reported wherever sample sizes permit.</w:t>
+      </w:r>
+    </w:p>
+    <w:bookmarkEnd w:id="14"/>
+    <w:bookmarkStart w:id="15" w:name="X72628be123c5a4a8c66efdf6dd9243e4959fea1"/>
+    <w:p>
+      <w:pPr>
+        <w:pStyle w:val="Heading3"/>
+      </w:pPr>
+      <w:r>
+        <w:t xml:space="preserve">2.4 Protein scanning, mutation analysis, and structure</w:t>
+      </w:r>
+    </w:p>
+    <w:p>
+      <w:pPr>
+        <w:pStyle w:val="FirstParagraph"/>
+      </w:pPr>
+      <w:r>
+        <w:t xml:space="preserve">Ten therapeutically relevant proteins (MART-1, gp100, tyrosinase, NY-ESO-1, WT1, p53, KRAS, influenza M1, CMV pp65, SARS-CoV-2 spike RBD) were scanned with a sliding 9-mer window (stride 1; 3,357 windows). Sixteen recurrent hotspot mutations (7 p53, 9 KRAS) were analyzed by comparing wild-type and mutant binding scores; mutations were classified as Created/Enhanced/Destroyed/Unchanged. The KRAS G12V neoepitope YKLVVVGAV carries a non-canonical lysine at P2.</w:t>
+      </w:r>
+    </w:p>
+    <w:bookmarkEnd w:id="15"/>
+    <w:bookmarkStart w:id="16" w:name="feature-extraction"/>
+    <w:p>
+      <w:pPr>
+        <w:pStyle w:val="Heading3"/>
+      </w:pPr>
+      <w:r>
+        <w:t xml:space="preserve">2.5 Feature extraction</w:t>
+      </w:r>
+    </w:p>
+    <w:p>
+      <w:pPr>
+        <w:pStyle w:val="FirstParagraph"/>
+      </w:pPr>
+      <w:r>
+        <w:t xml:space="preserve">Learned features were extracted from the penultimate dense layer via truncated models. Hierarchical clustering (Ward’s method, Euclidean distance) was applied to representations of top epitope candidates; feature–binding-score correlation was assessed by Pearson’s r with a 1,000-iteration permutation test to control for chance correlations. t-SNE visualisation of the 45-dimensional penultimate layer was used to inspect class separation, and integrated gradients identified position-specific anchor contributions.</w:t>
+      </w:r>
+    </w:p>
+    <w:bookmarkEnd w:id="16"/>
+    <w:bookmarkEnd w:id="17"/>
+    <w:bookmarkStart w:id="23" w:name="results"/>
     <w:p>
       <w:pPr>
         <w:pStyle w:val="Heading2"/>
       </w:pPr>
       <w:r>
-        <w:t xml:space="preserve">2 Methods</w:t>
-      </w:r>
-    </w:p>
-    <w:bookmarkStart w:id="11" w:name="training-data-and-labels"/>
+        <w:t xml:space="preserve">3 Results</w:t>
+      </w:r>
+    </w:p>
+    <w:bookmarkStart w:id="18" w:name="X328ccea0a1818c4ae7426a226dff6f18d15ba8f"/>
     <w:p>
       <w:pPr>
         <w:pStyle w:val="Heading3"/>
       </w:pPr>
       <w:r>
-        <w:t xml:space="preserve">2.1 Training data and labels</w:t>
+        <w:t xml:space="preserve">3.1 Training data and architecture comparison</w:t>
       </w:r>
     </w:p>
     <w:p>
@@ -398,225 +450,7 @@
         <w:pStyle w:val="FirstParagraph"/>
       </w:pPr>
       <w:r>
-        <w:t xml:space="preserve">100,000 random 9-mer peptides were generated by uniform sampling of the 20 standard amino acids. Each was labelled with MHCflurry 2.2.1 against HLA-A*02:01 and assigned to Strong Binder (SB, percentile rank &lt;0.5%), Weak Binder (WB, 0.5%≤rank&lt;2.0%), or Non-Binder (NB, rank ≥2.0%) following the netMHCpan convention [5]. The resulting distribution (1.7% SB, 5.1% WB, 93.2% NB) was balanced by downsampling to 1,730 per class (n=5,190), partitioned 90/10 into training (n=4,671) and held-out test (n=519) sets with stratified sampling (seed 42). Two comparator labelling strategies were implemented: a PSSM encoding crystallographic A*02:01 anchor preferences, and random synthetic labels as a baseline control. A held-out benchmark of 42 experimentally validated IEDB epitopes (HLA-A*02:01-restricted, with positive binding/T-cell assay evidence, re-verified against the IEDB on 2026-10-23) plus 20 homopolymer negatives (≤2 unique amino acids) was curated from the IEDB (query-api.iedb.org); label-corpus overlap was determined by sequence-identity match against the IEDB entries in MHCflurry’s training corpus.</w:t>
-      </w:r>
-    </w:p>
-    <w:bookmarkEnd w:id="11"/>
-    <w:bookmarkStart w:id="12" w:name="peptide-encoding"/>
-    <w:p>
-      <w:pPr>
-        <w:pStyle w:val="Heading3"/>
-      </w:pPr>
-      <w:r>
-        <w:t xml:space="preserve">2.2 Peptide encoding</w:t>
-      </w:r>
-    </w:p>
-    <w:p>
-      <w:pPr>
-        <w:pStyle w:val="FirstParagraph"/>
-      </w:pPr>
-      <w:r>
-        <w:t xml:space="preserve">Each 9-mer was encoded with the BLOSUM62 matrix [12], min–max normalized, producing a 9×20 matrix flattened to 180 dimensions for fully connected networks. ESM-2 embeddings [13] were extracted at t6 (2,880-dim per-peptide; 320 per position × 9) and t12 (4,320-dim; 480 per position × 9) depths — the two smallest ESM-2 checkpoints (8M and 35M parameters); a mean-pooled t6 variant (320-dim) served as an ablation control destroying positional information.</w:t>
-      </w:r>
-    </w:p>
-    <w:bookmarkEnd w:id="12"/>
-    <w:bookmarkStart w:id="13" w:name="model-architectures"/>
-    <w:p>
-      <w:pPr>
-        <w:pStyle w:val="Heading3"/>
-      </w:pPr>
-      <w:r>
-        <w:t xml:space="preserve">2.3 Model architectures</w:t>
-      </w:r>
-    </w:p>
-    <w:p>
-      <w:pPr>
-        <w:pStyle w:val="FirstParagraph"/>
-      </w:pPr>
-      <w:r>
-        <w:t xml:space="preserve">Six classifiers were implemented: (i) FFN [14]: 180→90→3, 49K params; (ii) Deep FFN: 180→360→180→90→45→3 with batch normalisation and dropout, 152K params; (iii) CNN: Conv2D(32,3×3) + FFN body, 1.05M params; (iv) LSTM(64)→dense(32)→3, 24K params; (v) ResNet-style stem + 3 residual blocks, 325K params; (vi) Random Forest (100 trees). For ESM-2 embeddings an FFN classifier with a 256→128→64 stack was trained. All networks used cross-entropy loss with Adam or RMSprop (lr 0.001), 150 epochs, batch size 50, 20% internal validation split, early stopping (patience 10), and learning-rate reduction on plateau. Five-fold stratified cross-validation was performed for the FFN. The held-out test set (519 peptides) was disjoint from training and used for all reported metrics.</w:t>
-      </w:r>
-    </w:p>
-    <w:bookmarkEnd w:id="13"/>
-    <w:bookmarkStart w:id="14" w:name="X72628be123c5a4a8c66efdf6dd9243e4959fea1"/>
-    <w:p>
-      <w:pPr>
-        <w:pStyle w:val="Heading3"/>
-      </w:pPr>
-      <w:r>
-        <w:t xml:space="preserve">2.4 Protein scanning, mutation analysis, and structure</w:t>
-      </w:r>
-    </w:p>
-    <w:p>
-      <w:pPr>
-        <w:pStyle w:val="FirstParagraph"/>
-      </w:pPr>
-      <w:r>
-        <w:t xml:space="preserve">Ten therapeutically relevant proteins (MART-1, gp100, tyrosinase, NY-ESO-1, WT1, p53, KRAS, influenza M1, CMV pp65, SARS-CoV-2 spike RBD) were scanned with a sliding 9-mer window (stride 1; 3,357 windows). Sixteen recurrent hotspot mutations (7 p53, 9 KRAS) were analyzed by comparing wild-type and mutant binding scores; mutations were classified as Created/Enhanced/Destroyed/Unchanged. The KRAS G12V neoepitope YKLVVVGAV carries a non-canonical lysine at P2.</w:t>
-      </w:r>
-    </w:p>
-    <w:bookmarkEnd w:id="14"/>
-    <w:bookmarkStart w:id="15" w:name="feature-extraction"/>
-    <w:p>
-      <w:pPr>
-        <w:pStyle w:val="Heading3"/>
-      </w:pPr>
-      <w:r>
-        <w:t xml:space="preserve">2.5 Feature extraction</w:t>
-      </w:r>
-    </w:p>
-    <w:p>
-      <w:pPr>
-        <w:pStyle w:val="FirstParagraph"/>
-      </w:pPr>
-      <w:r>
-        <w:t xml:space="preserve">Learned features were extracted from the penultimate dense layer via truncated models. Hierarchical clustering (Ward’s method, Euclidean distance) was applied to representations of top epitope candidates; feature–binding-score correlation was assessed by Pearson’s r with a 1,000-iteration permutation test to control for chance correlations. t-SNE visualisation of the 45-dimensional penultimate layer was used to inspect class separation, and integrated gradients identified position-specific anchor contributions.</w:t>
-      </w:r>
-    </w:p>
-    <w:bookmarkEnd w:id="15"/>
-    <w:bookmarkStart w:id="22" w:name="multi-allele-extension"/>
-    <w:p>
-      <w:pPr>
-        <w:pStyle w:val="Heading3"/>
-      </w:pPr>
-      <w:r>
-        <w:t xml:space="preserve">2.6 Multi-allele extension</w:t>
-      </w:r>
-    </w:p>
-    <w:bookmarkStart w:id="16" w:name="multi-allele-data-curation"/>
-    <w:p>
-      <w:pPr>
-        <w:pStyle w:val="Heading4"/>
-      </w:pPr>
-      <w:r>
-        <w:t xml:space="preserve">2.6.1 Multi-allele data curation</w:t>
-      </w:r>
-    </w:p>
-    <w:p>
-      <w:pPr>
-        <w:pStyle w:val="FirstParagraph"/>
-      </w:pPr>
-      <w:r>
-        <w:t xml:space="preserve">Experimentally confirmed class I binders were curated from the IEDB [15] for five common alleles (HLA-A*02:01, A*01:01, A*03:01, B*07:02, B*44:03), yielding n = 14,488 positives (canonical 11,225; Type A 151; Type B 3,112). A 15-allele panel (pan16: 10 additional alleles — A*11:01, A*24:02, B*08:01, B*15:01, B*27:05, B*35:01, B*40:01, B*49:01, B*51:01, B*57:01) was curated for generalisation testing. Protein-background negatives were sampled from natural proteomes to avoid the uniform-random decoys used in earlier evaluations. IEDB data were queried live from query-api.iedb.org (accessed 2026-08-02); the 15-allele and temporal-holdout estimates are therefore snapshot-dependent and drift slightly as the IEDB grows.</w:t>
-      </w:r>
-    </w:p>
-    <w:bookmarkEnd w:id="16"/>
-    <w:bookmarkStart w:id="17" w:name="type-ab-classification"/>
-    <w:p>
-      <w:pPr>
-        <w:pStyle w:val="Heading4"/>
-      </w:pPr>
-      <w:r>
-        <w:t xml:space="preserve">2.6.2 Type A/B classification</w:t>
-      </w:r>
-    </w:p>
-    <w:p>
-      <w:pPr>
-        <w:pStyle w:val="FirstParagraph"/>
-      </w:pPr>
-      <w:r>
-        <w:t xml:space="preserve">Type A (tolerated weak anchors) and Type B (energy-compensated non-canonical) were defined by whether the peptide violates the allele’s canonical anchor motif at p2/p9. Type A carries broad-only tolerated anchors (residues that appear in binding motifs but are non-canonical); Type B carries non-canonical residues at anchor positions. The two classes have different biological origins and, as we show, different prediction difficulty.</w:t>
-      </w:r>
-    </w:p>
-    <w:bookmarkEnd w:id="17"/>
-    <w:bookmarkStart w:id="18" w:name="pan-model-and-per-allele-comparators"/>
-    <w:p>
-      <w:pPr>
-        <w:pStyle w:val="Heading4"/>
-      </w:pPr>
-      <w:r>
-        <w:t xml:space="preserve">2.6.3 Pan model and per-allele comparators</w:t>
-      </w:r>
-    </w:p>
-    <w:p>
-      <w:pPr>
-        <w:pStyle w:val="FirstParagraph"/>
-      </w:pPr>
-      <w:r>
-        <w:t xml:space="preserve">The pan-specific DFFN uses BLOSUM62 encoding [12] through a 360–180–90–45 hidden stack with batch normalisation and dropout. Rebalancing upsampled the minority B*07:02 allele 4× during training to correct for allele-frequency imbalance. Five seeds (0, 1, 42, 123, 2024) were used; per-seed variation arises from data-sampling RNG. Per-allele models (one per allele) and a pan16 model (15 alleles, per-allele minimum 2,000 upsampling) were trained with the same recipe. All per-allele and pan models were trained on synthetic motif-biased and random 9-mers labelled by MHCflurry (50/50 mix, seed 42), not on the IEDB positives; the 14,488 experimentally confirmed IEDB positives therefore constitute a held-out evaluation set unseen during training.</w:t>
-      </w:r>
-    </w:p>
-    <w:bookmarkEnd w:id="18"/>
-    <w:bookmarkStart w:id="19" w:name="comparator-predictors"/>
-    <w:p>
-      <w:pPr>
-        <w:pStyle w:val="Heading4"/>
-      </w:pPr>
-      <w:r>
-        <w:t xml:space="preserve">2.6.4 Comparator predictors</w:t>
-      </w:r>
-    </w:p>
-    <w:p>
-      <w:pPr>
-        <w:pStyle w:val="FirstParagraph"/>
-      </w:pPr>
-      <w:r>
-        <w:t xml:space="preserve">MHCflurry 2.2.1 [6] served as an independent sequence predictor (affinity threshold 500 nM). MUNIS [8] — a second sequence-based predictor using ESM-2 embeddings [9] — served as an independent sequence comparator, run on the n = 3,112 Type B population plus canonical controls.</w:t>
-      </w:r>
-    </w:p>
-    <w:bookmarkEnd w:id="19"/>
-    <w:bookmarkStart w:id="20" w:name="temporal-holdout"/>
-    <w:p>
-      <w:pPr>
-        <w:pStyle w:val="Heading4"/>
-      </w:pPr>
-      <w:r>
-        <w:t xml:space="preserve">2.6.5 Temporal holdout</w:t>
-      </w:r>
-    </w:p>
-    <w:p>
-      <w:pPr>
-        <w:pStyle w:val="FirstParagraph"/>
-      </w:pPr>
-      <w:r>
-        <w:t xml:space="preserve">To distinguish label-definition divergence from label circularity [10], IEDB epitopes published after 2022 (post-2022, unseen by MHCflurry’s ~pre-2021 training data) were compared against pre-2021 (in-distribution) epitopes at sensitivity threshold 0.95.</w:t>
-      </w:r>
-    </w:p>
-    <w:bookmarkEnd w:id="20"/>
-    <w:bookmarkStart w:id="21" w:name="evaluation"/>
-    <w:p>
-      <w:pPr>
-        <w:pStyle w:val="Heading4"/>
-      </w:pPr>
-      <w:r>
-        <w:t xml:space="preserve">2.6.6 Evaluation</w:t>
-      </w:r>
-    </w:p>
-    <w:p>
-      <w:pPr>
-        <w:pStyle w:val="FirstParagraph"/>
-      </w:pPr>
-      <w:r>
-        <w:t xml:space="preserve">Sensitivity was computed with protein-background negatives and fixed thresholds (0.95 for the pan model; 500 nM for MHCflurry; 5th percentile of canonical scores for MUNIS and BigMHC). Wilson 95% confidence intervals are reported for pooled estimates.</w:t>
-      </w:r>
-    </w:p>
-    <w:bookmarkEnd w:id="21"/>
-    <w:bookmarkEnd w:id="22"/>
-    <w:bookmarkEnd w:id="23"/>
-    <w:bookmarkStart w:id="36" w:name="results"/>
-    <w:p>
-      <w:pPr>
-        <w:pStyle w:val="Heading2"/>
-      </w:pPr>
-      <w:r>
-        <w:t xml:space="preserve">3 Results</w:t>
-      </w:r>
-    </w:p>
-    <w:bookmarkStart w:id="24" w:name="X328ccea0a1818c4ae7426a226dff6f18d15ba8f"/>
-    <w:p>
-      <w:pPr>
-        <w:pStyle w:val="Heading3"/>
-      </w:pPr>
-      <w:r>
-        <w:t xml:space="preserve">3.1 Training data and architecture comparison</w:t>
-      </w:r>
-    </w:p>
-    <w:p>
-      <w:pPr>
-        <w:pStyle w:val="FirstParagraph"/>
-      </w:pPr>
-      <w:r>
-        <w:t xml:space="preserve">MHCflurry labelling of 100,000 random 9-mers yielded 1.7% SB, 5.1% WB, 93.2% NB; after balancing, 5,190 peptides (1,730/class). Across five training seeds, the CNN achieved the highest accuracy (91.5% ± 0.8%; Table 1, Figure 1), modestly ahead of the Deep FFN (90.6% ± 1.2%), the FFN (89.8% ± 1.1%), and the LSTM (89.7% ± 0.9%) — the top four architectures within ~2 percentage points, a range within the combined seed-plus-binomial uncertainty (n=519; 95% CI CNN [0.886, 0.943] vs Deep FFN [0.872, 0.940]) — while ResNet (87.6% ± 1.8%) and Random Forest (79.7% ± 0.4%) were clearly worse. Two external predictors frame this comparison (Table 1): MHCflurry 2.2.1 itself scores 100% on the labels it produced — an expected ceiling, not evidence of superiority — while the independent state-of-the-art predictor NetMHCpan-4.1, which was not trained on these labels, agrees with them on only 62.24% (323/519). The 8.5-point gap between the labeler (100%) and the best finite-sample approximation (91.5% for the CNN) is information loss from finite samples; the far larger ~29-point gap to NetMHCpan (62.24%) reflects primarily label-definition divergence rather than circularity (see §3.4 and Discussion). The WB class was consistently the most difficult (F1 0.752–0.880). These class-balanced accuracies overstate real-world utility: under the uniform-random-peptide prior (1.7% SB, 5.1% WB, 93.2% NB), a trivial always-non-binder classifier reaches 93.2% accuracy, above every model’s balanced accuracy, so natural-prior precision/PPV should be reported (Box 1, item 5).</w:t>
+        <w:t xml:space="preserve">MHCflurry labelling of 100,000 random 9-mers yielded 1.7% SB, 5.1% WB, 93.2% NB; after balancing, 5,190 peptides (1,730/class). Across five training seeds, the CNN achieved the highest accuracy (91.5% ± 0.8%; Table 1, Figure 1), modestly ahead of the Deep FFN (90.6% ± 1.2%), the FFN (89.8% ± 1.1%), and the LSTM (89.7% ± 0.9%) — the top four architectures within ~2 percentage points, a range within the combined seed-plus-binomial uncertainty (n=519; 95% CI CNN [0.886, 0.943] vs Deep FFN [0.872, 0.940]) — while ResNet (87.6% ± 1.8%) and Random Forest (79.7% ± 0.4%) were clearly worse. Two external predictors frame this comparison (Table 1): MHCflurry 2.2.1 itself scores 100% on the labels it produced — an expected ceiling, not evidence of superiority — while the independent state-of-the-art predictor NetMHCpan-4.1, which was not trained on these labels, agrees with them on only 62.24% (323/519). The 8.5-point gap between the labeler (100%) and the best finite-sample approximation (91.5% for the CNN) is information loss from finite samples; the far larger ~29-point gap to NetMHCpan (62.24%) reflects primarily cutpoint placement rather than label fidelity (see §3.4 and Discussion). The WB class was consistently the most difficult (F1 0.752–0.880). These class-balanced accuracies overstate real-world utility: under the uniform-random-peptide prior (1.7% SB, 5.1% WB, 93.2% NB), a trivial always-non-binder classifier reaches 93.2% accuracy, above every model’s balanced accuracy, so natural-prior precision/PPV should be reported (Box 1, item 5).</w:t>
       </w:r>
     </w:p>
     <w:p>
@@ -994,7 +828,7 @@
         <w:pStyle w:val="BodyText"/>
       </w:pPr>
       <w:r>
-        <w:t xml:space="preserve">† Accuracy is agreement with the MHCflurry test labels (n=519). MHCflurry scores 100% because it produced the labels — an expected ceiling, not evidence of superiority. NetMHCpan-4.1, which was not trained on these labels, agrees with them on only 62.24%, quantifying label-definition divergence (see Discussion).</w:t>
+        <w:t xml:space="preserve">† Accuracy is agreement with the MHCflurry test labels (n=519). MHCflurry scores 100% because it produced the labels — an expected ceiling, not evidence of superiority. NetMHCpan-4.1, which was not trained on these labels, agrees with them on only 62.24%, quantifying cutpoint sensitivity (see Discussion).</w:t>
       </w:r>
     </w:p>
     <w:p>
@@ -1005,8 +839,8 @@
         <w:t xml:space="preserve">The modest spread among the top four architectures reflects the positional nature of peptide–MHC binding: anchor positions p2/p9 dominate, so architectures that preserve positional information perform comparably. ResNet and the Random Forest were clearly worse, consistent with the absence of translation invariance in a 9×20 encoding and, for the Random Forest, the high dimensionality of the BLOSUM62 encoding.</w:t>
       </w:r>
     </w:p>
-    <w:bookmarkEnd w:id="24"/>
-    <w:bookmarkStart w:id="25" w:name="label-source-controls"/>
+    <w:bookmarkEnd w:id="18"/>
+    <w:bookmarkStart w:id="19" w:name="label-source-controls"/>
     <w:p>
       <w:pPr>
         <w:pStyle w:val="Heading3"/>
@@ -1200,8 +1034,8 @@
         </w:tc>
       </w:tr>
     </w:tbl>
-    <w:bookmarkEnd w:id="25"/>
-    <w:bookmarkStart w:id="26" w:name="encoding"/>
+    <w:bookmarkEnd w:id="19"/>
+    <w:bookmarkStart w:id="20" w:name="encoding"/>
     <w:p>
       <w:pPr>
         <w:pStyle w:val="Heading3"/>
@@ -1589,8 +1423,8 @@
         </w:tc>
       </w:tr>
     </w:tbl>
-    <w:bookmarkEnd w:id="26"/>
-    <w:bookmarkStart w:id="27" w:name="held-out-validation-and-translation"/>
+    <w:bookmarkEnd w:id="20"/>
+    <w:bookmarkStart w:id="21" w:name="held-out-validation-and-translation"/>
     <w:p>
       <w:pPr>
         <w:pStyle w:val="Heading3"/>
@@ -1718,7 +1552,7 @@
         <w:t xml:space="preserve"> </w:t>
       </w:r>
       <w:r>
-        <w:t xml:space="preserve">(HPV16 E7), carries a non-canonical p9 anchor (C). An independent predictor, NetMHCpan-4.1b (DTU standalone, run locally), achieved 90.5% sensitivity (38/42; Wilson 95% CI 77.9–96.2%) on the corrected 42-epitope set, statistically indistinguishable from the Deep FFN (41/42 = 97.6%; exact McNemar p = 0.25, three discordant pairs). NetMHCpan’s pan-specific training on MS-elution-based labels makes this an indicative rather than clean comparison; the more direct evidence of label-definition divergence is the 62.24% label agreement (323/519 test peptides) reported in the Discussion. To contextualise the benchmark, we include a zero-parameter anchor-checker baseline (a rule classifying any 9-mer with canonical p2/p9 residues as a binder): it achieves sensitivity 0.786 (33/42) and specificity 0.900 (18/20), below the trained model (0.976), because nine genuine binders carry non-canonical p2/p9 anchors. The trained model recovers eight of these nine (Wilson 95% CI 52–98%) — the single residual miss,</w:t>
+        <w:t xml:space="preserve">(HPV16 E7), carries a non-canonical p9 anchor (C). An independent predictor, NetMHCpan-4.1b (DTU standalone, run locally), achieved 85.7% sensitivity (36/42; Wilson 95% CI 72.1–93.3%) on the corrected 42-epitope set, statistically indistinguishable from the Deep FFN (41/42 = 97.6%; exact McNemar p = 0.0625, five discordant pairs). NetMHCpan’s pan-specific training on MS-elution-based labels makes this an indicative rather than clean comparison; the more direct evidence of cutpoint sensitivity is the 62.24% label agreement (323/519 test peptides) reported in the Discussion. To contextualise the benchmark, we include a zero-parameter anchor-checker baseline (a rule classifying any 9-mer with canonical p2/p9 residues as a binder): it achieves sensitivity 0.786 (33/42) and specificity 0.900 (18/20), below the trained model (0.976), because nine genuine binders carry non-canonical p2/p9 anchors. The trained model recovers eight of these nine (Wilson 95% CI 52–98%) — the single residual miss,</w:t>
       </w:r>
       <w:r>
         <w:t xml:space="preserve"> </w:t>
@@ -1733,7 +1567,19 @@
         <w:t xml:space="preserve"> </w:t>
       </w:r>
       <w:r>
-        <w:t xml:space="preserve">(p9 = C), defines the hard non-canonical tail — suggesting, on nine peptides, that part of the informative signal lies beyond the anchor motif. The five false positives were homopolymers (≤2 unique amino acids) with canonical anchors — biologically implausible binders whose low sequence complexity the classifier fails to penalise. A domain-knowledge filter (≤2 unique amino acids → non-binder) removed all five, but we report 75.0% as the primary, unfiltered specificity to avoid post-hoc inflation. As a secondary negative set, 20 experimentally measured A*02:01 negatives (IEDB qualitative_measure = Negative) yielded 90.0% specificity (18/20), confirming that the homopolymer set is a conservative lower bound on realistic specificity. To characterise the labels independently of the labeler’s own decision boundary, we additionally scored the Deep FFN against a large label-independent set of experimentally measured affinities (IEDB binding-affinity corpus, accessed 2026-08-02) — 3,438 unique 9-mers with measured IC50 &lt;500 nM and 3,086 with IC50 &gt;5,000 nM (the 500–5,000 nM grey zone was excluded to yield unambiguous binders and non-binders), restricted to direct binding assays (competitive fluorescence/radioactivity) and excluding MS-elution-derived, predictor-dependent entries. The MHCflurry-trained Deep FFN recognised 94.4% of the experimental binders and rejected 74.5% of the non-binders (threshold 0.5; ROC AUC 0.942); the rebalanced per-allele model reached 89.8% sensitivity and 89.1% specificity (AUC 0.945). To test whether this fidelity is an in-corpus artifact of the labeler, we scored the independent predictor NetMHCpan-4.1b — trained on MS-elution data rather than this affinity corpus — on the same 6,524 affinities: it reached a comparable AUC of 0.937 (EL-rank) and 0.960 (BA-rank). Because an out-of-corpus labeler matches the Deep FFN’s 0.942, the training labels’ fidelity to experimental binding is genuine rather than circular; generalisation to unseen peptides is instead established by the temporal holdout (§3.11). Protein scanning of 10 proteins (3,357 9-mer windows) recovered all ten in-scope known epitopes (100%; Figure 4), including immunodominant</w:t>
+        <w:t xml:space="preserve">(p9 = C), defines the hard non-canonical tail — suggesting, on nine peptides, that part of the informative signal lies beyond the anchor motif. The five false positives were homopolymers (≤2 unique amino acids) with canonical anchors — biologically implausible binders whose low sequence complexity the classifier fails to penalise. A domain-knowledge filter (≤2 unique amino acids → non-binder) removed all five, but we report 75.0% as the primary, unfiltered specificity to avoid post-hoc inflation. As a secondary negative set, 20 experimentally measured A*02:01 negatives (IEDB qualitative_measure = Negative) yielded 90.0% specificity (18/20), confirming that the homopolymer set is a conservative lower bound on realistic specificity. To characterise the labels independently of the labeler’s own decision boundary, we additionally scored the Deep FFN against a large label-independent set of experimentally measured affinities (IEDB binding-affinity corpus, accessed 2026-08-02) — 3,438 unique 9-mers with measured IC50 &lt;500 nM and 3,086 with IC50 &gt;5,000 nM (the 500–5,000 nM grey zone was excluded to yield unambiguous binders and non-binders), restricted to direct binding assays (competitive fluorescence/radioactivity) and excluding MS-elution-derived, predictor-dependent entries. The MHCflurry-trained Deep FFN recognised 94.4% of the experimental binders and rejected 74.5% of the non-binders (threshold 0.5; ROC AUC 0.942); the rebalanced per-allele model reached 89.8% sensitivity and 89.1% specificity (AUC 0.945). To characterise the labelers directly, we scored MHCflurry 2.2.1 itself on the 6,524 affinities (AUC 0.950) alongside NetMHCpan-4.1b (0.937 EL-rank, 0.960 BA-rank) — both high, though 91.6% of these peptides appear in MHCflurry’s training corpus, so these values are largely in-corpus. The two predictors also rank peptides almost identically (Spearman ρ = 0.96), yet their hard labels agree on only 62.24% of the 519 test peptides (Cohen’s κ = 0.44). The disagreement is asymmetric — NetMHCpan downgrades MHCflurry’s weak binders to non-binders (73% of WB) and strong to weak (30%) — and largely vanishes under the natural class prior (96% agreement), localising the 62% figure to cutpoint placement rather than label definition or fidelity. To quantify this cutpoint sensitivity, we varied the percentile-rank threshold and recomputed the two predictors’ binary binder agreement (Figure 8). Agreement is non-monotonic, dipping to 73.4% at the standard 2% threshold, where MHCflurry calls 69.6% of the balanced test set binders versus 43.0% for NetMHCpan. The two rank distributions are offset roughly four-fold — MHCflurry’s top-2% threshold corresponds to NetMHCpan’s top-8% — and aligning the cutpoints recovers 96.1% agreement. The predictors thus share predictive skill but differ in calibration (where the binder threshold is drawn), a decoupling recently formalised as a</w:t>
+      </w:r>
+      <w:r>
+        <w:t xml:space="preserve"> </w:t>
+      </w:r>
+      <w:r>
+        <w:t xml:space="preserve">‘free knob’</w:t>
+      </w:r>
+      <w:r>
+        <w:t xml:space="preserve"> </w:t>
+      </w:r>
+      <w:r>
+        <w:t xml:space="preserve">in threshold-based evaluation [16]. These two effects are independent: the 62% three-class agreement reflects the balanced prior, whereas the 73% binary agreement at 2% reflects the cutpoint offset; correcting either effect separately restores ~96% agreement. This pattern generalises across objectives (Figure 9): two presentation predictors — MUNIS and BigMHC, which add antigen processing to binding — correlate with each other at ρ = 0.90 but with the two binding predictors at only |ρ| ≈ 0.72–0.78, below the binding predictors’ mutual 0.96. Cutpoint sensitivity is therefore specific to predictors sharing a binding-affinity objective, while cross-objective disagreement reflects a genuinely different task. Protein scanning of 10 proteins (3,357 9-mer windows) recovered all ten in-scope known epitopes (100%; Figure 4), including immunodominant</w:t>
       </w:r>
       <w:r>
         <w:t xml:space="preserve"> </w:t>
@@ -1823,7 +1669,7 @@
         <w:t xml:space="preserve"> </w:t>
       </w:r>
       <w:r>
-        <w:t xml:space="preserve">via G→V at p9 creating a canonical C-terminal anchor. p53 R248W is among the most frequent TP53 missense mutations across cancers (~3.5% of somatic TP53 mutations, IARC), and mutation-specific T-cell responses have been documented in patients and in HLA-A2/DRB1-transgenic mice [16,17]; KRAS G12C enhanced an existing epitope (WB→SB), suggesting synergy with pharmacological G12C inhibition. Three mutations (KRAS G13D, KRAS A146T, p53 R249S) destroyed existing epitopes, representing potential immune-evasion mechanisms.</w:t>
+        <w:t xml:space="preserve">via G→V at p9 creating a canonical C-terminal anchor. p53 R248W is among the most frequent TP53 missense mutations across cancers (~3.5% of somatic TP53 mutations, IARC), and mutation-specific T-cell responses have been documented in patients and in HLA-A2/DRB1-transgenic mice [17,18]; KRAS G12C enhanced an existing epitope (WB→SB), suggesting synergy with pharmacological G12C inhibition. Three mutations (KRAS G13D, KRAS A146T, p53 R249S) destroyed existing epitopes, representing potential immune-evasion mechanisms.</w:t>
       </w:r>
     </w:p>
     <w:p>
@@ -2426,7 +2272,7 @@
               <w:jc w:val="center"/>
             </w:pPr>
             <w:r>
-              <w:t xml:space="preserve">90.5% (38/42)</w:t>
+              <w:t xml:space="preserve">85.7% (36/42)</w:t>
             </w:r>
           </w:p>
         </w:tc>
@@ -2540,14 +2386,14 @@
         <w:t xml:space="preserve">*NetMHCpan-4.1b standalone (DTU academic license, run locally under WSL2).</w:t>
       </w:r>
     </w:p>
-    <w:bookmarkEnd w:id="27"/>
-    <w:bookmarkStart w:id="28" w:name="Xc086741a7b3a90d9524c358a03bf3e0111acdb3"/>
+    <w:bookmarkEnd w:id="21"/>
+    <w:bookmarkStart w:id="22" w:name="learned-feature-representations"/>
     <w:p>
       <w:pPr>
         <w:pStyle w:val="Heading3"/>
       </w:pPr>
       <w:r>
-        <w:t xml:space="preserve">3.5 A rebalanced pan model matches per-allele specialists on four of five alleles</w:t>
+        <w:t xml:space="preserve">3.5 Learned feature representations</w:t>
       </w:r>
     </w:p>
     <w:p>
@@ -2555,291 +2401,27 @@
         <w:pStyle w:val="FirstParagraph"/>
       </w:pPr>
       <w:r>
-        <w:t xml:space="preserve">With protein-background negatives and a fixed threshold (n=25 non-canonical binders per allele, so these point estimates carry wide confidence intervals), per-allele models reached non-canonical sensitivity A*02:01 0.84, A*01:01 0.88, A*03:01 1.00, B*07:02 0.96, B*44:03 0.96 (Table 6; Figure 8). The rebalanced pan model matched this on four of five alleles (A*02:01 0.84, A*01:01 0.88, A*03:01 1.00, B*44:03 1.00), but B*07:02 was the clear exception: the pan model dropped to 0.60 versus 0.96 per-allele (0.64 in the 15-allele pan16 panel; Wilson 95% CIs [0.41, 0.77] vs [0.81, 0.99], non-overlapping), consistent with over-anchoring to B*07:02’s distinctive P2-Proline — a reproducible limitation rather than a fundamental pan-model deficiency. The earlier observation that per-allele models outperform pan models on non-canonical binders is not supported once per-allele training-data size is controlled.</w:t>
-      </w:r>
-    </w:p>
-    <w:p>
-      <w:pPr>
-        <w:pStyle w:val="BodyText"/>
-      </w:pPr>
-      <w:r>
-        <w:rPr>
-          <w:b/>
-          <w:bCs/>
-        </w:rPr>
-        <w:t xml:space="preserve">Table 6. Non-canonical sensitivity by allele (protein-background negatives, n=25 per allele,</w:t>
-      </w:r>
-      <w:r>
-        <w:rPr>
-          <w:b/>
-          <w:bCs/>
-        </w:rPr>
-        <w:t xml:space="preserve"> </w:t>
-      </w:r>
-      <w:r>
-        <w:rPr>
-          <w:b/>
-          <w:bCs/>
-        </w:rPr>
-        <w:t xml:space="preserve">@0.95</w:t>
-      </w:r>
-      <w:r>
-        <w:rPr>
-          <w:b/>
-          <w:bCs/>
-        </w:rPr>
-        <w:t xml:space="preserve">).</w:t>
-      </w:r>
-    </w:p>
-    <w:tbl>
-      <w:tblPr>
-        <w:tblStyle w:val="Table"/>
-        <w:tblW w:type="auto" w:w="0"/>
-        <w:tblLook w:firstRow="1" w:lastRow="0" w:firstColumn="0" w:lastColumn="0" w:noHBand="0" w:noVBand="0" w:val="0020"/>
-      </w:tblPr>
-      <w:tblGrid>
-        <w:gridCol w:w="2640"/>
-        <w:gridCol w:w="2640"/>
-        <w:gridCol w:w="2640"/>
-      </w:tblGrid>
-      <w:tr>
-        <w:trPr>
-          <w:tblHeader w:val="on"/>
-        </w:trPr>
-        <w:tc>
-          <w:tcPr/>
-          <w:p>
-            <w:pPr>
-              <w:pStyle w:val="Compact"/>
-            </w:pPr>
-            <w:r>
-              <w:t xml:space="preserve">Allele</w:t>
-            </w:r>
-          </w:p>
-        </w:tc>
-        <w:tc>
-          <w:tcPr/>
-          <w:p>
-            <w:pPr>
-              <w:pStyle w:val="Compact"/>
-              <w:jc w:val="center"/>
-            </w:pPr>
-            <w:r>
-              <w:t xml:space="preserve">Per-allele</w:t>
-            </w:r>
-          </w:p>
-        </w:tc>
-        <w:tc>
-          <w:tcPr/>
-          <w:p>
-            <w:pPr>
-              <w:pStyle w:val="Compact"/>
-              <w:jc w:val="center"/>
-            </w:pPr>
-            <w:r>
-              <w:t xml:space="preserve">Pan</w:t>
-            </w:r>
-          </w:p>
-        </w:tc>
-      </w:tr>
-      <w:tr>
-        <w:tc>
-          <w:tcPr/>
-          <w:p>
-            <w:pPr>
-              <w:pStyle w:val="Compact"/>
-            </w:pPr>
-            <w:r>
-              <w:t xml:space="preserve">A*02:01</w:t>
-            </w:r>
-          </w:p>
-        </w:tc>
-        <w:tc>
-          <w:tcPr/>
-          <w:p>
-            <w:pPr>
-              <w:pStyle w:val="Compact"/>
-              <w:jc w:val="center"/>
-            </w:pPr>
-            <w:r>
-              <w:t xml:space="preserve">0.84</w:t>
-            </w:r>
-          </w:p>
-        </w:tc>
-        <w:tc>
-          <w:tcPr/>
-          <w:p>
-            <w:pPr>
-              <w:pStyle w:val="Compact"/>
-              <w:jc w:val="center"/>
-            </w:pPr>
-            <w:r>
-              <w:t xml:space="preserve">0.84</w:t>
-            </w:r>
-          </w:p>
-        </w:tc>
-      </w:tr>
-      <w:tr>
-        <w:tc>
-          <w:tcPr/>
-          <w:p>
-            <w:pPr>
-              <w:pStyle w:val="Compact"/>
-            </w:pPr>
-            <w:r>
-              <w:t xml:space="preserve">A*01:01</w:t>
-            </w:r>
-          </w:p>
-        </w:tc>
-        <w:tc>
-          <w:tcPr/>
-          <w:p>
-            <w:pPr>
-              <w:pStyle w:val="Compact"/>
-              <w:jc w:val="center"/>
-            </w:pPr>
-            <w:r>
-              <w:t xml:space="preserve">0.88</w:t>
-            </w:r>
-          </w:p>
-        </w:tc>
-        <w:tc>
-          <w:tcPr/>
-          <w:p>
-            <w:pPr>
-              <w:pStyle w:val="Compact"/>
-              <w:jc w:val="center"/>
-            </w:pPr>
-            <w:r>
-              <w:t xml:space="preserve">0.88</w:t>
-            </w:r>
-          </w:p>
-        </w:tc>
-      </w:tr>
-      <w:tr>
-        <w:tc>
-          <w:tcPr/>
-          <w:p>
-            <w:pPr>
-              <w:pStyle w:val="Compact"/>
-            </w:pPr>
-            <w:r>
-              <w:t xml:space="preserve">A*03:01</w:t>
-            </w:r>
-          </w:p>
-        </w:tc>
-        <w:tc>
-          <w:tcPr/>
-          <w:p>
-            <w:pPr>
-              <w:pStyle w:val="Compact"/>
-              <w:jc w:val="center"/>
-            </w:pPr>
-            <w:r>
-              <w:t xml:space="preserve">1.00</w:t>
-            </w:r>
-          </w:p>
-        </w:tc>
-        <w:tc>
-          <w:tcPr/>
-          <w:p>
-            <w:pPr>
-              <w:pStyle w:val="Compact"/>
-              <w:jc w:val="center"/>
-            </w:pPr>
-            <w:r>
-              <w:t xml:space="preserve">1.00</w:t>
-            </w:r>
-          </w:p>
-        </w:tc>
-      </w:tr>
-      <w:tr>
-        <w:tc>
-          <w:tcPr/>
-          <w:p>
-            <w:pPr>
-              <w:pStyle w:val="Compact"/>
-            </w:pPr>
-            <w:r>
-              <w:t xml:space="preserve">B*07:02</w:t>
-            </w:r>
-          </w:p>
-        </w:tc>
-        <w:tc>
-          <w:tcPr/>
-          <w:p>
-            <w:pPr>
-              <w:pStyle w:val="Compact"/>
-              <w:jc w:val="center"/>
-            </w:pPr>
-            <w:r>
-              <w:t xml:space="preserve">0.96</w:t>
-            </w:r>
-          </w:p>
-        </w:tc>
-        <w:tc>
-          <w:tcPr/>
-          <w:p>
-            <w:pPr>
-              <w:pStyle w:val="Compact"/>
-              <w:jc w:val="center"/>
-            </w:pPr>
-            <w:r>
-              <w:rPr>
-                <w:b/>
-                <w:bCs/>
-              </w:rPr>
-              <w:t xml:space="preserve">0.60</w:t>
-            </w:r>
-          </w:p>
-        </w:tc>
-      </w:tr>
-      <w:tr>
-        <w:tc>
-          <w:tcPr/>
-          <w:p>
-            <w:pPr>
-              <w:pStyle w:val="Compact"/>
-            </w:pPr>
-            <w:r>
-              <w:t xml:space="preserve">B*44:03</w:t>
-            </w:r>
-          </w:p>
-        </w:tc>
-        <w:tc>
-          <w:tcPr/>
-          <w:p>
-            <w:pPr>
-              <w:pStyle w:val="Compact"/>
-              <w:jc w:val="center"/>
-            </w:pPr>
-            <w:r>
-              <w:t xml:space="preserve">0.96</w:t>
-            </w:r>
-          </w:p>
-        </w:tc>
-        <w:tc>
-          <w:tcPr/>
-          <w:p>
-            <w:pPr>
-              <w:pStyle w:val="Compact"/>
-              <w:jc w:val="center"/>
-            </w:pPr>
-            <w:r>
-              <w:t xml:space="preserve">1.00</w:t>
-            </w:r>
-          </w:p>
-        </w:tc>
-      </w:tr>
-    </w:tbl>
-    <w:bookmarkEnd w:id="28"/>
-    <w:bookmarkStart w:id="29" w:name="Xfcbe84235508e84109109da1baa937288b62fbe"/>
+        <w:t xml:space="preserve">For interpretability, we extracted the Deep FFN penultimate dense layer (Figure 6). t-SNE showed partial class separation, with strong binders forming a distinct cluster and weak binders a transition zone; integrated gradients attributed position-specific anchor contributions (p9 dominated strong binders, p2/p3 weak binders). Because these features are the penultimate layer of a model trained to predict binding, their correlation with the binding score is expected and is reported for completeness rather than as an independent finding.</w:t>
+      </w:r>
+    </w:p>
+    <w:bookmarkEnd w:id="22"/>
+    <w:bookmarkEnd w:id="23"/>
+    <w:bookmarkStart w:id="27" w:name="discussion"/>
+    <w:p>
+      <w:pPr>
+        <w:pStyle w:val="Heading2"/>
+      </w:pPr>
+      <w:r>
+        <w:t xml:space="preserve">4 Discussion</w:t>
+      </w:r>
+    </w:p>
+    <w:bookmarkStart w:id="24" w:name="methodological-warnings"/>
     <w:p>
       <w:pPr>
         <w:pStyle w:val="Heading3"/>
       </w:pPr>
       <w:r>
-        <w:t xml:space="preserve">3.6 Canonical binders are recognized at ~0.98 by every predictor</w:t>
+        <w:t xml:space="preserve">Methodological warnings</w:t>
       </w:r>
     </w:p>
     <w:p>
@@ -2847,1429 +2429,7 @@
         <w:pStyle w:val="FirstParagraph"/>
       </w:pPr>
       <w:r>
-        <w:t xml:space="preserve">On n = 11,225 canonical positives, all four predictors were saturated: DFFN 0.979, MHCflurry 0.986, MUNIS 0.950, BigMHC 0.950 (Table 7). The canonical binder problem is effectively solved by all current methods.</w:t>
-      </w:r>
-    </w:p>
-    <w:bookmarkEnd w:id="29"/>
-    <w:bookmarkStart w:id="30" w:name="Xf66799ab54b808700e46f040ced71f8bfb4694a"/>
-    <w:p>
-      <w:pPr>
-        <w:pStyle w:val="Heading3"/>
-      </w:pPr>
-      <w:r>
-        <w:t xml:space="preserve">3.7 Non-canonical (Type B) sensitivity depends on operating point</w:t>
-      </w:r>
-    </w:p>
-    <w:p>
-      <w:pPr>
-        <w:pStyle w:val="FirstParagraph"/>
-      </w:pPr>
-      <w:r>
-        <w:t xml:space="preserve">On n = 3,112 Type B positives, sensitivity at each predictor’s own operating point was DFFN 0.607, MHCflurry 0.668, MUNIS 0.647, and BigMHC 0.660 (Table 7; Figure 9). These operating points are not matched, so the apparent narrow band (0.607–0.668) is partly a threshold artifact rather than a genuine ceiling: the predictors operate at different points (DFFN at a fixed 0.95 score, MHCflurry at 500 nM, MUNIS and BigMHC at the 5th percentile of canonical scores), and when aligned to matched canonical sensitivity (0.90/0.95/0.98) the Type B sensitivities diverge monotonically — DFFN 0.369/0.454/0.610, MHCflurry 0.385/0.497/0.628, MUNIS 0.521/0.647/0.773, BigMHC 0.555/0.653/0.740. Yet regardless of operating point, non-canonical (Type B) sensitivity stays far below the ~0.98 canonical level for every predictor — at matched canonical sensitivity 0.98 the best Type B value is 0.773 (MUNIS) and 0.740 (BigMHC) — so the non-canonical tail is genuinely prediction-resistant, and neither richer embeddings nor attention-based architectures close the gap.</w:t>
-      </w:r>
-    </w:p>
-    <w:p>
-      <w:pPr>
-        <w:pStyle w:val="BodyText"/>
-      </w:pPr>
-      <w:r>
-        <w:rPr>
-          <w:b/>
-          <w:bCs/>
-        </w:rPr>
-        <w:t xml:space="preserve">Table 7. Predictor sensitivity by binder class (pooled, 5 alleles).</w:t>
-      </w:r>
-    </w:p>
-    <w:tbl>
-      <w:tblPr>
-        <w:tblStyle w:val="Table"/>
-        <w:tblW w:type="auto" w:w="0"/>
-        <w:tblLook w:firstRow="1" w:lastRow="0" w:firstColumn="0" w:lastColumn="0" w:noHBand="0" w:noVBand="0" w:val="0020"/>
-      </w:tblPr>
-      <w:tblGrid>
-        <w:gridCol w:w="1980"/>
-        <w:gridCol w:w="1980"/>
-        <w:gridCol w:w="1980"/>
-        <w:gridCol w:w="1980"/>
-      </w:tblGrid>
-      <w:tr>
-        <w:trPr>
-          <w:tblHeader w:val="on"/>
-        </w:trPr>
-        <w:tc>
-          <w:tcPr/>
-          <w:p>
-            <w:pPr>
-              <w:pStyle w:val="Compact"/>
-            </w:pPr>
-            <w:r>
-              <w:t xml:space="preserve">Predictor</w:t>
-            </w:r>
-          </w:p>
-        </w:tc>
-        <w:tc>
-          <w:tcPr/>
-          <w:p>
-            <w:pPr>
-              <w:pStyle w:val="Compact"/>
-              <w:jc w:val="center"/>
-            </w:pPr>
-            <w:r>
-              <w:t xml:space="preserve">Canonical (n=11,225)</w:t>
-            </w:r>
-          </w:p>
-        </w:tc>
-        <w:tc>
-          <w:tcPr/>
-          <w:p>
-            <w:pPr>
-              <w:pStyle w:val="Compact"/>
-              <w:jc w:val="center"/>
-            </w:pPr>
-            <w:r>
-              <w:t xml:space="preserve">Type A (n=151)</w:t>
-            </w:r>
-          </w:p>
-        </w:tc>
-        <w:tc>
-          <w:tcPr/>
-          <w:p>
-            <w:pPr>
-              <w:pStyle w:val="Compact"/>
-              <w:jc w:val="center"/>
-            </w:pPr>
-            <w:r>
-              <w:t xml:space="preserve">Type B (n=3,112)</w:t>
-            </w:r>
-          </w:p>
-        </w:tc>
-      </w:tr>
-      <w:tr>
-        <w:tc>
-          <w:tcPr/>
-          <w:p>
-            <w:pPr>
-              <w:pStyle w:val="Compact"/>
-            </w:pPr>
-            <w:r>
-              <w:t xml:space="preserve">DFFN (sequence)</w:t>
-            </w:r>
-          </w:p>
-        </w:tc>
-        <w:tc>
-          <w:tcPr/>
-          <w:p>
-            <w:pPr>
-              <w:pStyle w:val="Compact"/>
-              <w:jc w:val="center"/>
-            </w:pPr>
-            <w:r>
-              <w:t xml:space="preserve">0.979</w:t>
-            </w:r>
-          </w:p>
-        </w:tc>
-        <w:tc>
-          <w:tcPr/>
-          <w:p>
-            <w:pPr>
-              <w:pStyle w:val="Compact"/>
-              <w:jc w:val="center"/>
-            </w:pPr>
-            <w:r>
-              <w:t xml:space="preserve">0.477</w:t>
-            </w:r>
-          </w:p>
-        </w:tc>
-        <w:tc>
-          <w:tcPr/>
-          <w:p>
-            <w:pPr>
-              <w:pStyle w:val="Compact"/>
-              <w:jc w:val="center"/>
-            </w:pPr>
-            <w:r>
-              <w:t xml:space="preserve">0.607</w:t>
-            </w:r>
-          </w:p>
-        </w:tc>
-      </w:tr>
-      <w:tr>
-        <w:tc>
-          <w:tcPr/>
-          <w:p>
-            <w:pPr>
-              <w:pStyle w:val="Compact"/>
-            </w:pPr>
-            <w:r>
-              <w:t xml:space="preserve">MHCflurry (sequence)</w:t>
-            </w:r>
-          </w:p>
-        </w:tc>
-        <w:tc>
-          <w:tcPr/>
-          <w:p>
-            <w:pPr>
-              <w:pStyle w:val="Compact"/>
-              <w:jc w:val="center"/>
-            </w:pPr>
-            <w:r>
-              <w:t xml:space="preserve">0.986</w:t>
-            </w:r>
-          </w:p>
-        </w:tc>
-        <w:tc>
-          <w:tcPr/>
-          <w:p>
-            <w:pPr>
-              <w:pStyle w:val="Compact"/>
-              <w:jc w:val="center"/>
-            </w:pPr>
-            <w:r>
-              <w:t xml:space="preserve">0.669</w:t>
-            </w:r>
-          </w:p>
-        </w:tc>
-        <w:tc>
-          <w:tcPr/>
-          <w:p>
-            <w:pPr>
-              <w:pStyle w:val="Compact"/>
-              <w:jc w:val="center"/>
-            </w:pPr>
-            <w:r>
-              <w:t xml:space="preserve">0.668</w:t>
-            </w:r>
-          </w:p>
-        </w:tc>
-      </w:tr>
-      <w:tr>
-        <w:tc>
-          <w:tcPr/>
-          <w:p>
-            <w:pPr>
-              <w:pStyle w:val="Compact"/>
-            </w:pPr>
-            <w:r>
-              <w:t xml:space="preserve">MUNIS (sequence)</w:t>
-            </w:r>
-          </w:p>
-        </w:tc>
-        <w:tc>
-          <w:tcPr/>
-          <w:p>
-            <w:pPr>
-              <w:pStyle w:val="Compact"/>
-              <w:jc w:val="center"/>
-            </w:pPr>
-            <w:r>
-              <w:t xml:space="preserve">0.950</w:t>
-            </w:r>
-          </w:p>
-        </w:tc>
-        <w:tc>
-          <w:tcPr/>
-          <w:p>
-            <w:pPr>
-              <w:pStyle w:val="Compact"/>
-              <w:jc w:val="center"/>
-            </w:pPr>
-            <w:r>
-              <w:t xml:space="preserve">—</w:t>
-            </w:r>
-          </w:p>
-        </w:tc>
-        <w:tc>
-          <w:tcPr/>
-          <w:p>
-            <w:pPr>
-              <w:pStyle w:val="Compact"/>
-              <w:jc w:val="center"/>
-            </w:pPr>
-            <w:r>
-              <w:t xml:space="preserve">0.647</w:t>
-            </w:r>
-          </w:p>
-        </w:tc>
-      </w:tr>
-      <w:tr>
-        <w:tc>
-          <w:tcPr/>
-          <w:p>
-            <w:pPr>
-              <w:pStyle w:val="Compact"/>
-            </w:pPr>
-            <w:r>
-              <w:t xml:space="preserve">BigMHC (sequence)</w:t>
-            </w:r>
-          </w:p>
-        </w:tc>
-        <w:tc>
-          <w:tcPr/>
-          <w:p>
-            <w:pPr>
-              <w:pStyle w:val="Compact"/>
-              <w:jc w:val="center"/>
-            </w:pPr>
-            <w:r>
-              <w:t xml:space="preserve">0.950</w:t>
-            </w:r>
-          </w:p>
-        </w:tc>
-        <w:tc>
-          <w:tcPr/>
-          <w:p>
-            <w:pPr>
-              <w:pStyle w:val="Compact"/>
-              <w:jc w:val="center"/>
-            </w:pPr>
-            <w:r>
-              <w:t xml:space="preserve">0.600</w:t>
-            </w:r>
-          </w:p>
-        </w:tc>
-        <w:tc>
-          <w:tcPr/>
-          <w:p>
-            <w:pPr>
-              <w:pStyle w:val="Compact"/>
-              <w:jc w:val="center"/>
-            </w:pPr>
-            <w:r>
-              <w:t xml:space="preserve">0.660</w:t>
-            </w:r>
-          </w:p>
-        </w:tc>
-      </w:tr>
-    </w:tbl>
-    <w:bookmarkEnd w:id="30"/>
-    <w:bookmarkStart w:id="31" w:name="X852a807115fd532ce4fca9dc86d7a16c3ff432e"/>
-    <w:p>
-      <w:pPr>
-        <w:pStyle w:val="Heading3"/>
-      </w:pPr>
-      <w:r>
-        <w:t xml:space="preserve">3.8 Type A (tolerated weak anchors) is under-represented in training</w:t>
-      </w:r>
-    </w:p>
-    <w:p>
-      <w:pPr>
-        <w:pStyle w:val="FirstParagraph"/>
-      </w:pPr>
-      <w:r>
-        <w:t xml:space="preserve">On n = 151 Type A positives, DFFN achieved 0.477 and MHCflurry 0.669 (MUNIS not evaluated). Broad-motif retraining did not recover Type A (Table 8); the low sensitivity reflects under-representation of these heterogeneous, weak binders in the training data (independent predictors MHCflurry 0.669 and BigMHC 0.600 outperform DFFN 0.477 on the same set).</w:t>
-      </w:r>
-    </w:p>
-    <w:p>
-      <w:pPr>
-        <w:pStyle w:val="BodyText"/>
-      </w:pPr>
-      <w:r>
-        <w:rPr>
-          <w:b/>
-          <w:bCs/>
-        </w:rPr>
-        <w:t xml:space="preserve">Table 8. Broad-motif retraining does not consistently recover Type A across alleles.</w:t>
-      </w:r>
-    </w:p>
-    <w:tbl>
-      <w:tblPr>
-        <w:tblStyle w:val="Table"/>
-        <w:tblW w:type="auto" w:w="0"/>
-        <w:tblLook w:firstRow="1" w:lastRow="0" w:firstColumn="0" w:lastColumn="0" w:noHBand="0" w:noVBand="0" w:val="0020"/>
-      </w:tblPr>
-      <w:tblGrid>
-        <w:gridCol w:w="1980"/>
-        <w:gridCol w:w="1980"/>
-        <w:gridCol w:w="1980"/>
-        <w:gridCol w:w="1980"/>
-      </w:tblGrid>
-      <w:tr>
-        <w:trPr>
-          <w:tblHeader w:val="on"/>
-        </w:trPr>
-        <w:tc>
-          <w:tcPr/>
-          <w:p>
-            <w:pPr>
-              <w:pStyle w:val="Compact"/>
-            </w:pPr>
-            <w:r>
-              <w:t xml:space="preserve">Allele</w:t>
-            </w:r>
-          </w:p>
-        </w:tc>
-        <w:tc>
-          <w:tcPr/>
-          <w:p>
-            <w:pPr>
-              <w:pStyle w:val="Compact"/>
-              <w:jc w:val="center"/>
-            </w:pPr>
-            <w:r>
-              <w:t xml:space="preserve">Type A before</w:t>
-            </w:r>
-          </w:p>
-        </w:tc>
-        <w:tc>
-          <w:tcPr/>
-          <w:p>
-            <w:pPr>
-              <w:pStyle w:val="Compact"/>
-              <w:jc w:val="center"/>
-            </w:pPr>
-            <w:r>
-              <w:t xml:space="preserve">Type A after</w:t>
-            </w:r>
-          </w:p>
-        </w:tc>
-        <w:tc>
-          <w:tcPr/>
-          <w:p>
-            <w:pPr>
-              <w:pStyle w:val="Compact"/>
-              <w:jc w:val="center"/>
-            </w:pPr>
-            <w:r>
-              <w:t xml:space="preserve">Type B after</w:t>
-            </w:r>
-          </w:p>
-        </w:tc>
-      </w:tr>
-      <w:tr>
-        <w:tc>
-          <w:tcPr/>
-          <w:p>
-            <w:pPr>
-              <w:pStyle w:val="Compact"/>
-            </w:pPr>
-            <w:r>
-              <w:t xml:space="preserve">A*03:01</w:t>
-            </w:r>
-          </w:p>
-        </w:tc>
-        <w:tc>
-          <w:tcPr/>
-          <w:p>
-            <w:pPr>
-              <w:pStyle w:val="Compact"/>
-              <w:jc w:val="center"/>
-            </w:pPr>
-            <w:r>
-              <w:t xml:space="preserve">—</w:t>
-            </w:r>
-          </w:p>
-        </w:tc>
-        <w:tc>
-          <w:tcPr/>
-          <w:p>
-            <w:pPr>
-              <w:pStyle w:val="Compact"/>
-              <w:jc w:val="center"/>
-            </w:pPr>
-            <w:r>
-              <w:t xml:space="preserve">0.634</w:t>
-            </w:r>
-          </w:p>
-        </w:tc>
-        <w:tc>
-          <w:tcPr/>
-          <w:p>
-            <w:pPr>
-              <w:pStyle w:val="Compact"/>
-              <w:jc w:val="center"/>
-            </w:pPr>
-            <w:r>
-              <w:t xml:space="preserve">—</w:t>
-            </w:r>
-          </w:p>
-        </w:tc>
-      </w:tr>
-      <w:tr>
-        <w:tc>
-          <w:tcPr/>
-          <w:p>
-            <w:pPr>
-              <w:pStyle w:val="Compact"/>
-            </w:pPr>
-            <w:r>
-              <w:t xml:space="preserve">A*02:01</w:t>
-            </w:r>
-          </w:p>
-        </w:tc>
-        <w:tc>
-          <w:tcPr/>
-          <w:p>
-            <w:pPr>
-              <w:pStyle w:val="Compact"/>
-              <w:jc w:val="center"/>
-            </w:pPr>
-            <w:r>
-              <w:t xml:space="preserve">0.08</w:t>
-            </w:r>
-          </w:p>
-        </w:tc>
-        <w:tc>
-          <w:tcPr/>
-          <w:p>
-            <w:pPr>
-              <w:pStyle w:val="Compact"/>
-              <w:jc w:val="center"/>
-            </w:pPr>
-            <w:r>
-              <w:t xml:space="preserve">0.24</w:t>
-            </w:r>
-          </w:p>
-        </w:tc>
-        <w:tc>
-          <w:tcPr/>
-          <w:p>
-            <w:pPr>
-              <w:pStyle w:val="Compact"/>
-              <w:jc w:val="center"/>
-            </w:pPr>
-            <w:r>
-              <w:t xml:space="preserve">—</w:t>
-            </w:r>
-          </w:p>
-        </w:tc>
-      </w:tr>
-      <w:tr>
-        <w:tc>
-          <w:tcPr/>
-          <w:p>
-            <w:pPr>
-              <w:pStyle w:val="Compact"/>
-            </w:pPr>
-            <w:r>
-              <w:t xml:space="preserve">B*07:02</w:t>
-            </w:r>
-          </w:p>
-        </w:tc>
-        <w:tc>
-          <w:tcPr/>
-          <w:p>
-            <w:pPr>
-              <w:pStyle w:val="Compact"/>
-              <w:jc w:val="center"/>
-            </w:pPr>
-            <w:r>
-              <w:t xml:space="preserve">—</w:t>
-            </w:r>
-          </w:p>
-        </w:tc>
-        <w:tc>
-          <w:tcPr/>
-          <w:p>
-            <w:pPr>
-              <w:pStyle w:val="Compact"/>
-              <w:jc w:val="center"/>
-            </w:pPr>
-            <w:r>
-              <w:t xml:space="preserve">—</w:t>
-            </w:r>
-          </w:p>
-        </w:tc>
-        <w:tc>
-          <w:tcPr/>
-          <w:p>
-            <w:pPr>
-              <w:pStyle w:val="Compact"/>
-              <w:jc w:val="center"/>
-            </w:pPr>
-            <w:r>
-              <w:t xml:space="preserve">0.341 (from 0.680)</w:t>
-            </w:r>
-          </w:p>
-        </w:tc>
-      </w:tr>
-    </w:tbl>
-    <w:bookmarkEnd w:id="31"/>
-    <w:bookmarkStart w:id="32" w:name="Xae4eebc59097160a2722f0b697afc2cb184dfbe"/>
-    <w:p>
-      <w:pPr>
-        <w:pStyle w:val="Heading3"/>
-      </w:pPr>
-      <w:r>
-        <w:t xml:space="preserve">3.9 The extreme tail is prediction-resistant, cross-predictor</w:t>
-      </w:r>
-    </w:p>
-    <w:p>
-      <w:pPr>
-        <w:pStyle w:val="FirstParagraph"/>
-      </w:pPr>
-      <w:r>
-        <w:t xml:space="preserve">The single-allele false negative (TLGIVCPIC) and the KRAS G12V P2-Lys epitope YKLVVVGAV were scored as non-binders by all three predictors (MHCflurry 3.8–13.8 µM; DFFN 0.000–0.254; MUNIS 3/4 low), despite experimental CTL evidence — albeit the weakest of three mutants screened [18].</w:t>
-      </w:r>
-    </w:p>
-    <w:bookmarkEnd w:id="32"/>
-    <w:bookmarkStart w:id="33" w:name="X9c6bf181d7a016fe1245acfa5b56e2f58efb112"/>
-    <w:p>
-      <w:pPr>
-        <w:pStyle w:val="Heading3"/>
-      </w:pPr>
-      <w:r>
-        <w:t xml:space="preserve">3.10 Scaling: one model approximates a 15-allele panel</w:t>
-      </w:r>
-    </w:p>
-    <w:p>
-      <w:pPr>
-        <w:pStyle w:val="FirstParagraph"/>
-      </w:pPr>
-      <w:r>
-        <w:t xml:space="preserve">The rebalanced pan16 reached pooled non-canonical sensitivity 0.819 (307/375,</w:t>
-      </w:r>
-      <w:r>
-        <w:t xml:space="preserve"> </w:t>
-      </w:r>
-      <w:r>
-        <w:t xml:space="preserve">@0.95</w:t>
-      </w:r>
-      <w:r>
-        <w:t xml:space="preserve">), with most alleles at 0.76–1.0 (12 of 15 in the frozen Aug 2026 snapshot; 11 of 15 in a 2026-10 re-run, the difference reflecting n=25 sampling noise; Table 9; Figure 10). The weak tail — B*27:05 (0.08), B*51:01 (0.52), B*07:02 (0.64), A*24:02 (0.76) — reflects data scarcity and, for B*07:02, over-anchoring, not architecture.</w:t>
-      </w:r>
-    </w:p>
-    <w:p>
-      <w:pPr>
-        <w:pStyle w:val="BodyText"/>
-      </w:pPr>
-      <w:r>
-        <w:rPr>
-          <w:b/>
-          <w:bCs/>
-        </w:rPr>
-        <w:t xml:space="preserve">Table 9. Pan16 non-canonical sensitivity by allele (15-allele panel,</w:t>
-      </w:r>
-      <w:r>
-        <w:rPr>
-          <w:b/>
-          <w:bCs/>
-        </w:rPr>
-        <w:t xml:space="preserve"> </w:t>
-      </w:r>
-      <w:r>
-        <w:rPr>
-          <w:b/>
-          <w:bCs/>
-        </w:rPr>
-        <w:t xml:space="preserve">@0.95</w:t>
-      </w:r>
-      <w:r>
-        <w:rPr>
-          <w:b/>
-          <w:bCs/>
-        </w:rPr>
-        <w:t xml:space="preserve">).</w:t>
-      </w:r>
-    </w:p>
-    <w:tbl>
-      <w:tblPr>
-        <w:tblStyle w:val="Table"/>
-        <w:tblW w:type="auto" w:w="0"/>
-        <w:tblLook w:firstRow="1" w:lastRow="0" w:firstColumn="0" w:lastColumn="0" w:noHBand="0" w:noVBand="0" w:val="0020"/>
-      </w:tblPr>
-      <w:tblGrid>
-        <w:gridCol w:w="1980"/>
-        <w:gridCol w:w="1980"/>
-        <w:gridCol w:w="1980"/>
-        <w:gridCol w:w="1980"/>
-      </w:tblGrid>
-      <w:tr>
-        <w:trPr>
-          <w:tblHeader w:val="on"/>
-        </w:trPr>
-        <w:tc>
-          <w:tcPr/>
-          <w:p>
-            <w:pPr>
-              <w:pStyle w:val="Compact"/>
-            </w:pPr>
-            <w:r>
-              <w:t xml:space="preserve">Allele</w:t>
-            </w:r>
-          </w:p>
-        </w:tc>
-        <w:tc>
-          <w:tcPr/>
-          <w:p>
-            <w:pPr>
-              <w:pStyle w:val="Compact"/>
-              <w:jc w:val="center"/>
-            </w:pPr>
-            <w:r>
-              <w:t xml:space="preserve">Sens</w:t>
-            </w:r>
-          </w:p>
-        </w:tc>
-        <w:tc>
-          <w:tcPr/>
-          <w:p>
-            <w:pPr>
-              <w:pStyle w:val="Compact"/>
-            </w:pPr>
-            <w:r>
-              <w:t xml:space="preserve">Allele</w:t>
-            </w:r>
-          </w:p>
-        </w:tc>
-        <w:tc>
-          <w:tcPr/>
-          <w:p>
-            <w:pPr>
-              <w:pStyle w:val="Compact"/>
-              <w:jc w:val="center"/>
-            </w:pPr>
-            <w:r>
-              <w:t xml:space="preserve">Sens</w:t>
-            </w:r>
-          </w:p>
-        </w:tc>
-      </w:tr>
-      <w:tr>
-        <w:tc>
-          <w:tcPr/>
-          <w:p>
-            <w:pPr>
-              <w:pStyle w:val="Compact"/>
-            </w:pPr>
-            <w:r>
-              <w:t xml:space="preserve">A*02:01</w:t>
-            </w:r>
-          </w:p>
-        </w:tc>
-        <w:tc>
-          <w:tcPr/>
-          <w:p>
-            <w:pPr>
-              <w:pStyle w:val="Compact"/>
-              <w:jc w:val="center"/>
-            </w:pPr>
-            <w:r>
-              <w:t xml:space="preserve">0.88</w:t>
-            </w:r>
-          </w:p>
-        </w:tc>
-        <w:tc>
-          <w:tcPr/>
-          <w:p>
-            <w:pPr>
-              <w:pStyle w:val="Compact"/>
-            </w:pPr>
-            <w:r>
-              <w:t xml:space="preserve">A*11:01</w:t>
-            </w:r>
-          </w:p>
-        </w:tc>
-        <w:tc>
-          <w:tcPr/>
-          <w:p>
-            <w:pPr>
-              <w:pStyle w:val="Compact"/>
-              <w:jc w:val="center"/>
-            </w:pPr>
-            <w:r>
-              <w:t xml:space="preserve">1.00</w:t>
-            </w:r>
-          </w:p>
-        </w:tc>
-      </w:tr>
-      <w:tr>
-        <w:tc>
-          <w:tcPr/>
-          <w:p>
-            <w:pPr>
-              <w:pStyle w:val="Compact"/>
-            </w:pPr>
-            <w:r>
-              <w:t xml:space="preserve">A*01:01</w:t>
-            </w:r>
-          </w:p>
-        </w:tc>
-        <w:tc>
-          <w:tcPr/>
-          <w:p>
-            <w:pPr>
-              <w:pStyle w:val="Compact"/>
-              <w:jc w:val="center"/>
-            </w:pPr>
-            <w:r>
-              <w:t xml:space="preserve">0.80</w:t>
-            </w:r>
-          </w:p>
-        </w:tc>
-        <w:tc>
-          <w:tcPr/>
-          <w:p>
-            <w:pPr>
-              <w:pStyle w:val="Compact"/>
-            </w:pPr>
-            <w:r>
-              <w:t xml:space="preserve">A*24:02</w:t>
-            </w:r>
-          </w:p>
-        </w:tc>
-        <w:tc>
-          <w:tcPr/>
-          <w:p>
-            <w:pPr>
-              <w:pStyle w:val="Compact"/>
-              <w:jc w:val="center"/>
-            </w:pPr>
-            <w:r>
-              <w:t xml:space="preserve">0.76</w:t>
-            </w:r>
-          </w:p>
-        </w:tc>
-      </w:tr>
-      <w:tr>
-        <w:tc>
-          <w:tcPr/>
-          <w:p>
-            <w:pPr>
-              <w:pStyle w:val="Compact"/>
-            </w:pPr>
-            <w:r>
-              <w:t xml:space="preserve">A*03:01</w:t>
-            </w:r>
-          </w:p>
-        </w:tc>
-        <w:tc>
-          <w:tcPr/>
-          <w:p>
-            <w:pPr>
-              <w:pStyle w:val="Compact"/>
-              <w:jc w:val="center"/>
-            </w:pPr>
-            <w:r>
-              <w:t xml:space="preserve">1.00</w:t>
-            </w:r>
-          </w:p>
-        </w:tc>
-        <w:tc>
-          <w:tcPr/>
-          <w:p>
-            <w:pPr>
-              <w:pStyle w:val="Compact"/>
-            </w:pPr>
-            <w:r>
-              <w:t xml:space="preserve">B*08:01</w:t>
-            </w:r>
-          </w:p>
-        </w:tc>
-        <w:tc>
-          <w:tcPr/>
-          <w:p>
-            <w:pPr>
-              <w:pStyle w:val="Compact"/>
-              <w:jc w:val="center"/>
-            </w:pPr>
-            <w:r>
-              <w:t xml:space="preserve">0.88</w:t>
-            </w:r>
-          </w:p>
-        </w:tc>
-      </w:tr>
-      <w:tr>
-        <w:tc>
-          <w:tcPr/>
-          <w:p>
-            <w:pPr>
-              <w:pStyle w:val="Compact"/>
-            </w:pPr>
-            <w:r>
-              <w:t xml:space="preserve">B*07:02</w:t>
-            </w:r>
-          </w:p>
-        </w:tc>
-        <w:tc>
-          <w:tcPr/>
-          <w:p>
-            <w:pPr>
-              <w:pStyle w:val="Compact"/>
-              <w:jc w:val="center"/>
-            </w:pPr>
-            <w:r>
-              <w:t xml:space="preserve">0.64</w:t>
-            </w:r>
-          </w:p>
-        </w:tc>
-        <w:tc>
-          <w:tcPr/>
-          <w:p>
-            <w:pPr>
-              <w:pStyle w:val="Compact"/>
-            </w:pPr>
-            <w:r>
-              <w:t xml:space="preserve">B*15:01</w:t>
-            </w:r>
-          </w:p>
-        </w:tc>
-        <w:tc>
-          <w:tcPr/>
-          <w:p>
-            <w:pPr>
-              <w:pStyle w:val="Compact"/>
-              <w:jc w:val="center"/>
-            </w:pPr>
-            <w:r>
-              <w:t xml:space="preserve">0.96</w:t>
-            </w:r>
-          </w:p>
-        </w:tc>
-      </w:tr>
-      <w:tr>
-        <w:tc>
-          <w:tcPr/>
-          <w:p>
-            <w:pPr>
-              <w:pStyle w:val="Compact"/>
-            </w:pPr>
-            <w:r>
-              <w:t xml:space="preserve">B*44:03</w:t>
-            </w:r>
-          </w:p>
-        </w:tc>
-        <w:tc>
-          <w:tcPr/>
-          <w:p>
-            <w:pPr>
-              <w:pStyle w:val="Compact"/>
-              <w:jc w:val="center"/>
-            </w:pPr>
-            <w:r>
-              <w:t xml:space="preserve">1.00</w:t>
-            </w:r>
-          </w:p>
-        </w:tc>
-        <w:tc>
-          <w:tcPr/>
-          <w:p>
-            <w:pPr>
-              <w:pStyle w:val="Compact"/>
-            </w:pPr>
-            <w:r>
-              <w:t xml:space="preserve">B*27:05</w:t>
-            </w:r>
-          </w:p>
-        </w:tc>
-        <w:tc>
-          <w:tcPr/>
-          <w:p>
-            <w:pPr>
-              <w:pStyle w:val="Compact"/>
-              <w:jc w:val="center"/>
-            </w:pPr>
-            <w:r>
-              <w:t xml:space="preserve">0.08</w:t>
-            </w:r>
-          </w:p>
-        </w:tc>
-      </w:tr>
-      <w:tr>
-        <w:tc>
-          <w:tcPr/>
-          <w:p>
-            <w:pPr>
-              <w:pStyle w:val="Compact"/>
-            </w:pPr>
-          </w:p>
-        </w:tc>
-        <w:tc>
-          <w:tcPr/>
-          <w:p>
-            <w:pPr>
-              <w:pStyle w:val="Compact"/>
-            </w:pPr>
-          </w:p>
-        </w:tc>
-        <w:tc>
-          <w:tcPr/>
-          <w:p>
-            <w:pPr>
-              <w:pStyle w:val="Compact"/>
-            </w:pPr>
-            <w:r>
-              <w:t xml:space="preserve">B*35:01</w:t>
-            </w:r>
-          </w:p>
-        </w:tc>
-        <w:tc>
-          <w:tcPr/>
-          <w:p>
-            <w:pPr>
-              <w:pStyle w:val="Compact"/>
-              <w:jc w:val="center"/>
-            </w:pPr>
-            <w:r>
-              <w:t xml:space="preserve">0.84</w:t>
-            </w:r>
-          </w:p>
-        </w:tc>
-      </w:tr>
-      <w:tr>
-        <w:tc>
-          <w:tcPr/>
-          <w:p>
-            <w:pPr>
-              <w:pStyle w:val="Compact"/>
-            </w:pPr>
-          </w:p>
-        </w:tc>
-        <w:tc>
-          <w:tcPr/>
-          <w:p>
-            <w:pPr>
-              <w:pStyle w:val="Compact"/>
-            </w:pPr>
-          </w:p>
-        </w:tc>
-        <w:tc>
-          <w:tcPr/>
-          <w:p>
-            <w:pPr>
-              <w:pStyle w:val="Compact"/>
-            </w:pPr>
-            <w:r>
-              <w:t xml:space="preserve">B*40:01</w:t>
-            </w:r>
-          </w:p>
-        </w:tc>
-        <w:tc>
-          <w:tcPr/>
-          <w:p>
-            <w:pPr>
-              <w:pStyle w:val="Compact"/>
-              <w:jc w:val="center"/>
-            </w:pPr>
-            <w:r>
-              <w:t xml:space="preserve">1.00</w:t>
-            </w:r>
-          </w:p>
-        </w:tc>
-      </w:tr>
-      <w:tr>
-        <w:tc>
-          <w:tcPr/>
-          <w:p>
-            <w:pPr>
-              <w:pStyle w:val="Compact"/>
-            </w:pPr>
-          </w:p>
-        </w:tc>
-        <w:tc>
-          <w:tcPr/>
-          <w:p>
-            <w:pPr>
-              <w:pStyle w:val="Compact"/>
-            </w:pPr>
-          </w:p>
-        </w:tc>
-        <w:tc>
-          <w:tcPr/>
-          <w:p>
-            <w:pPr>
-              <w:pStyle w:val="Compact"/>
-            </w:pPr>
-            <w:r>
-              <w:t xml:space="preserve">B*49:01</w:t>
-            </w:r>
-          </w:p>
-        </w:tc>
-        <w:tc>
-          <w:tcPr/>
-          <w:p>
-            <w:pPr>
-              <w:pStyle w:val="Compact"/>
-              <w:jc w:val="center"/>
-            </w:pPr>
-            <w:r>
-              <w:t xml:space="preserve">1.00</w:t>
-            </w:r>
-          </w:p>
-        </w:tc>
-      </w:tr>
-      <w:tr>
-        <w:tc>
-          <w:tcPr/>
-          <w:p>
-            <w:pPr>
-              <w:pStyle w:val="Compact"/>
-            </w:pPr>
-          </w:p>
-        </w:tc>
-        <w:tc>
-          <w:tcPr/>
-          <w:p>
-            <w:pPr>
-              <w:pStyle w:val="Compact"/>
-            </w:pPr>
-          </w:p>
-        </w:tc>
-        <w:tc>
-          <w:tcPr/>
-          <w:p>
-            <w:pPr>
-              <w:pStyle w:val="Compact"/>
-            </w:pPr>
-            <w:r>
-              <w:t xml:space="preserve">B*51:01</w:t>
-            </w:r>
-          </w:p>
-        </w:tc>
-        <w:tc>
-          <w:tcPr/>
-          <w:p>
-            <w:pPr>
-              <w:pStyle w:val="Compact"/>
-              <w:jc w:val="center"/>
-            </w:pPr>
-            <w:r>
-              <w:t xml:space="preserve">0.52</w:t>
-            </w:r>
-          </w:p>
-        </w:tc>
-      </w:tr>
-      <w:tr>
-        <w:tc>
-          <w:tcPr/>
-          <w:p>
-            <w:pPr>
-              <w:pStyle w:val="Compact"/>
-            </w:pPr>
-          </w:p>
-        </w:tc>
-        <w:tc>
-          <w:tcPr/>
-          <w:p>
-            <w:pPr>
-              <w:pStyle w:val="Compact"/>
-            </w:pPr>
-          </w:p>
-        </w:tc>
-        <w:tc>
-          <w:tcPr/>
-          <w:p>
-            <w:pPr>
-              <w:pStyle w:val="Compact"/>
-            </w:pPr>
-            <w:r>
-              <w:t xml:space="preserve">B*57:01</w:t>
-            </w:r>
-          </w:p>
-        </w:tc>
-        <w:tc>
-          <w:tcPr/>
-          <w:p>
-            <w:pPr>
-              <w:pStyle w:val="Compact"/>
-              <w:jc w:val="center"/>
-            </w:pPr>
-            <w:r>
-              <w:t xml:space="preserve">0.92</w:t>
-            </w:r>
-          </w:p>
-        </w:tc>
-      </w:tr>
-      <w:tr>
-        <w:tc>
-          <w:tcPr/>
-          <w:p>
-            <w:pPr>
-              <w:pStyle w:val="Compact"/>
-            </w:pPr>
-            <w:r>
-              <w:rPr>
-                <w:b/>
-                <w:bCs/>
-              </w:rPr>
-              <w:t xml:space="preserve">Pooled</w:t>
-            </w:r>
-          </w:p>
-        </w:tc>
-        <w:tc>
-          <w:tcPr/>
-          <w:p>
-            <w:pPr>
-              <w:pStyle w:val="Compact"/>
-              <w:jc w:val="center"/>
-            </w:pPr>
-            <w:r>
-              <w:rPr>
-                <w:b/>
-                <w:bCs/>
-              </w:rPr>
-              <w:t xml:space="preserve">0.819</w:t>
-            </w:r>
-          </w:p>
-        </w:tc>
-        <w:tc>
-          <w:tcPr/>
-          <w:p>
-            <w:pPr>
-              <w:pStyle w:val="Compact"/>
-            </w:pPr>
-          </w:p>
-        </w:tc>
-        <w:tc>
-          <w:tcPr/>
-          <w:p>
-            <w:pPr>
-              <w:pStyle w:val="Compact"/>
-            </w:pPr>
-          </w:p>
-        </w:tc>
-      </w:tr>
-    </w:tbl>
-    <w:bookmarkEnd w:id="33"/>
-    <w:bookmarkStart w:id="34" w:name="X48311649840dc191078378d8cff80f3bf67f572"/>
-    <w:p>
-      <w:pPr>
-        <w:pStyle w:val="Heading3"/>
-      </w:pPr>
-      <w:r>
-        <w:t xml:space="preserve">3.11 Temporal holdout shows no detectable generalisation penalty</w:t>
-      </w:r>
-    </w:p>
-    <w:p>
-      <w:pPr>
-        <w:pStyle w:val="FirstParagraph"/>
-      </w:pPr>
-      <w:r>
-        <w:t xml:space="preserve">Post-2022 epitopes (unseen by the labeler) were recognized at sens@0.95: A*02:01 0.824, A*03:01 0.936, B*07:02 0.973 — preserved or slightly reduced versus pre-2021 (0.879/0.905/0.898; Table 10, Figure 11), consistent with snapshot drift (a 2026-10 re-run against the live IEDB shifted these estimates by 0.01–0.03).</w:t>
-      </w:r>
-    </w:p>
-    <w:p>
-      <w:pPr>
-        <w:pStyle w:val="BodyText"/>
-      </w:pPr>
-      <w:r>
-        <w:rPr>
-          <w:b/>
-          <w:bCs/>
-        </w:rPr>
-        <w:t xml:space="preserve">Table 10. Temporal holdout: pre-2021 vs. post-2022 sensitivity (</w:t>
-      </w:r>
-      <w:r>
-        <w:rPr>
-          <w:b/>
-          <w:bCs/>
-        </w:rPr>
-        <w:t xml:space="preserve">@0.95</w:t>
-      </w:r>
-      <w:r>
-        <w:rPr>
-          <w:b/>
-          <w:bCs/>
-        </w:rPr>
-        <w:t xml:space="preserve">).</w:t>
-      </w:r>
-    </w:p>
-    <w:tbl>
-      <w:tblPr>
-        <w:tblStyle w:val="Table"/>
-        <w:tblW w:type="auto" w:w="0"/>
-        <w:tblLook w:firstRow="1" w:lastRow="0" w:firstColumn="0" w:lastColumn="0" w:noHBand="0" w:noVBand="0" w:val="0020"/>
-      </w:tblPr>
-      <w:tblGrid>
-        <w:gridCol w:w="2640"/>
-        <w:gridCol w:w="2640"/>
-        <w:gridCol w:w="2640"/>
-      </w:tblGrid>
-      <w:tr>
-        <w:trPr>
-          <w:tblHeader w:val="on"/>
-        </w:trPr>
-        <w:tc>
-          <w:tcPr/>
-          <w:p>
-            <w:pPr>
-              <w:pStyle w:val="Compact"/>
-            </w:pPr>
-            <w:r>
-              <w:t xml:space="preserve">Allele</w:t>
-            </w:r>
-          </w:p>
-        </w:tc>
-        <w:tc>
-          <w:tcPr/>
-          <w:p>
-            <w:pPr>
-              <w:pStyle w:val="Compact"/>
-              <w:jc w:val="center"/>
-            </w:pPr>
-            <w:r>
-              <w:t xml:space="preserve">Pre-2021 (in-distribution)</w:t>
-            </w:r>
-          </w:p>
-        </w:tc>
-        <w:tc>
-          <w:tcPr/>
-          <w:p>
-            <w:pPr>
-              <w:pStyle w:val="Compact"/>
-              <w:jc w:val="center"/>
-            </w:pPr>
-            <w:r>
-              <w:t xml:space="preserve">Post-2022 (unseen)</w:t>
-            </w:r>
-          </w:p>
-        </w:tc>
-      </w:tr>
-      <w:tr>
-        <w:tc>
-          <w:tcPr/>
-          <w:p>
-            <w:pPr>
-              <w:pStyle w:val="Compact"/>
-            </w:pPr>
-            <w:r>
-              <w:t xml:space="preserve">A*02:01</w:t>
-            </w:r>
-          </w:p>
-        </w:tc>
-        <w:tc>
-          <w:tcPr/>
-          <w:p>
-            <w:pPr>
-              <w:pStyle w:val="Compact"/>
-              <w:jc w:val="center"/>
-            </w:pPr>
-            <w:r>
-              <w:t xml:space="preserve">0.879</w:t>
-            </w:r>
-          </w:p>
-        </w:tc>
-        <w:tc>
-          <w:tcPr/>
-          <w:p>
-            <w:pPr>
-              <w:pStyle w:val="Compact"/>
-              <w:jc w:val="center"/>
-            </w:pPr>
-            <w:r>
-              <w:t xml:space="preserve">0.824</w:t>
-            </w:r>
-          </w:p>
-        </w:tc>
-      </w:tr>
-      <w:tr>
-        <w:tc>
-          <w:tcPr/>
-          <w:p>
-            <w:pPr>
-              <w:pStyle w:val="Compact"/>
-            </w:pPr>
-            <w:r>
-              <w:t xml:space="preserve">A*03:01</w:t>
-            </w:r>
-          </w:p>
-        </w:tc>
-        <w:tc>
-          <w:tcPr/>
-          <w:p>
-            <w:pPr>
-              <w:pStyle w:val="Compact"/>
-              <w:jc w:val="center"/>
-            </w:pPr>
-            <w:r>
-              <w:t xml:space="preserve">0.905</w:t>
-            </w:r>
-          </w:p>
-        </w:tc>
-        <w:tc>
-          <w:tcPr/>
-          <w:p>
-            <w:pPr>
-              <w:pStyle w:val="Compact"/>
-              <w:jc w:val="center"/>
-            </w:pPr>
-            <w:r>
-              <w:t xml:space="preserve">0.936</w:t>
-            </w:r>
-          </w:p>
-        </w:tc>
-      </w:tr>
-      <w:tr>
-        <w:tc>
-          <w:tcPr/>
-          <w:p>
-            <w:pPr>
-              <w:pStyle w:val="Compact"/>
-            </w:pPr>
-            <w:r>
-              <w:t xml:space="preserve">B*07:02</w:t>
-            </w:r>
-          </w:p>
-        </w:tc>
-        <w:tc>
-          <w:tcPr/>
-          <w:p>
-            <w:pPr>
-              <w:pStyle w:val="Compact"/>
-              <w:jc w:val="center"/>
-            </w:pPr>
-            <w:r>
-              <w:t xml:space="preserve">0.898</w:t>
-            </w:r>
-          </w:p>
-        </w:tc>
-        <w:tc>
-          <w:tcPr/>
-          <w:p>
-            <w:pPr>
-              <w:pStyle w:val="Compact"/>
-              <w:jc w:val="center"/>
-            </w:pPr>
-            <w:r>
-              <w:t xml:space="preserve">0.973</w:t>
-            </w:r>
-          </w:p>
-        </w:tc>
-      </w:tr>
-    </w:tbl>
-    <w:bookmarkEnd w:id="34"/>
-    <w:bookmarkStart w:id="35" w:name="learned-feature-representations"/>
-    <w:p>
-      <w:pPr>
-        <w:pStyle w:val="Heading3"/>
-      </w:pPr>
-      <w:r>
-        <w:t xml:space="preserve">3.12 Learned feature representations</w:t>
-      </w:r>
-    </w:p>
-    <w:p>
-      <w:pPr>
-        <w:pStyle w:val="FirstParagraph"/>
-      </w:pPr>
-      <w:r>
-        <w:t xml:space="preserve">Feature extraction from the Deep FFN penultimate dense layer revealed biologically meaningful structure (Figure 6). t-SNE showed partial class separation: SB peptides clustered distinctly (91% within the SB cluster), while WB peptides formed a transition zone between SB and NB — consistent with the 50–500 nM affinity boundary. Integrated-gradients identified position-specific anchor contributions (p9 dominated SB, p2/p3 WB, NB driven by absent anchors). Hierarchical clustering separated validated epitopes, with false negatives forming a distinct branch. Five features showed Pearson r &gt; 0.7 with binding score; a 1,000-iteration permutation test (≈0.3 expected by chance) confirmed genuine binding-relevant representations.</w:t>
-      </w:r>
-    </w:p>
-    <w:bookmarkEnd w:id="35"/>
-    <w:bookmarkEnd w:id="36"/>
-    <w:bookmarkStart w:id="40" w:name="discussion"/>
-    <w:p>
-      <w:pPr>
-        <w:pStyle w:val="Heading2"/>
-      </w:pPr>
-      <w:r>
-        <w:t xml:space="preserve">4 Discussion</w:t>
-      </w:r>
-    </w:p>
-    <w:bookmarkStart w:id="37" w:name="methodological-warnings"/>
-    <w:p>
-      <w:pPr>
-        <w:pStyle w:val="Heading3"/>
-      </w:pPr>
-      <w:r>
-        <w:t xml:space="preserve">Methodological warnings</w:t>
-      </w:r>
-    </w:p>
-    <w:p>
-      <w:pPr>
-        <w:pStyle w:val="FirstParagraph"/>
-      </w:pPr>
-      <w:r>
-        <w:t xml:space="preserve">Three apparent findings in this project dissolved under controlled re-analysis, each illustrating how benchmark composition can manufacture false conclusions. First, an apparent per-allele superiority over a pan model was a 10.6× training-data-size artifact, not biology. Second, a claimed</w:t>
+        <w:t xml:space="preserve">Two apparent findings in this project dissolved under controlled re-analysis, each illustrating how benchmark composition can manufacture false conclusions. First, a claimed</w:t>
       </w:r>
       <w:r>
         <w:t xml:space="preserve"> </w:t>
@@ -4281,7 +2441,7 @@
         <w:t xml:space="preserve"> </w:t>
       </w:r>
       <w:r>
-        <w:t xml:space="preserve">result collapsed once the degenerate random-label null (which performed at chance, ~33%) was removed — the realistic label effect is smaller than the architecture range. Third, a reported</w:t>
+        <w:t xml:space="preserve">result collapsed once the degenerate random-label null (which performed at chance, ~33%) was removed — the realistic label effect is smaller than the architecture range. Second, a reported</w:t>
       </w:r>
       <w:r>
         <w:t xml:space="preserve"> </w:t>
@@ -4293,7 +2453,7 @@
         <w:t xml:space="preserve"> </w:t>
       </w:r>
       <w:r>
-        <w:t xml:space="preserve">ranking was an artifact of stale model checkpoints: re-training with fixed seeds showed a CNN instead ranked above the Deep FFN (91.5% vs 90.6%, higher in four of five seeds). We recommend that peptide-MHC benchmarks report multi-seed estimates with confidence intervals, protein-background negatives, frozen data snapshots, and a state-of-the-art comparator such as NetMHCpan, to avoid these failure modes. The same failure modes recur beyond peptide-MHC: data leakage from protein language-model pretraining distorts downstream task performance whenever train/test splits are not pretraining-aware [19], and leakage is now recognised as a field-wide reproducibility problem affecting hundreds of papers across seventeen fields [20]. Dedicated guidance now exists for avoiding leakage in biological machine learning [11] and for reporting clinical prediction models [21]; a recent audit of biomolecular benchmarks found cross-split contamination and label conflicts pervasive across the field [22]; Box 1 instantiates these general principles for peptide-MHC benchmarking specifically.</w:t>
+        <w:t xml:space="preserve">ranking was an artifact of stale model checkpoints: re-training with fixed seeds showed a CNN instead ranked above the Deep FFN (91.5% vs 90.6%, higher in four of five seeds). We recommend that peptide-MHC benchmarks report multi-seed estimates with confidence intervals, protein-background negatives, frozen data snapshots, and a state-of-the-art comparator such as NetMHCpan, to avoid these failure modes. The same failure modes recur beyond peptide-MHC: data leakage from protein language-model pretraining distorts downstream task performance whenever train/test splits are not pretraining-aware [19], and leakage is now recognised as a field-wide reproducibility problem affecting hundreds of papers across seventeen fields [20]. Dedicated guidance now exists for avoiding leakage in biological machine learning [11] and for reporting clinical prediction models [21]; a recent audit of biomolecular benchmarks found cross-split contamination and label conflicts pervasive across the field [22]; and label errors in test sets have been shown to destabilise machine-learning benchmarks more broadly [23]. Box 1 instantiates these general principles for peptide-MHC benchmarking specifically.</w:t>
       </w:r>
     </w:p>
     <w:p>
@@ -4311,7 +2471,7 @@
         <w:t xml:space="preserve"> </w:t>
       </w:r>
       <w:r>
-        <w:t xml:space="preserve">The three artifacts translate into reusable practices for immunoinformatics and machine-learning benchmarks: (1) equalise training-data size across model arms and report per-allele sample counts; (2) use a true i.i.d. random-label null (chance ≈ 33% for three balanced classes) rather than a degenerate control; (3) freeze data snapshots, model checkpoints, and label versions, and report multi-seed mean ± SD with confidence intervals; (4) report label provenance and distinguish label-definition divergence from circularity with a temporal holdout and an independent state-of-the-art comparator (NetMHCpan); (5) report performance under a realistic class prior (e.g. proteome-scan prevalence), not only a class-balanced prior, since a class-balanced benchmark overstates real-world utility. Each failure mode reproduced a false conclusion that was caught only by controlled re-analysis.</w:t>
+        <w:t xml:space="preserve">The two artifacts translate into reusable practices for immunoinformatics and machine-learning benchmarks: (1) use a true i.i.d. random-label null (chance ≈ 33% for three balanced classes) rather than a degenerate control; (2) freeze data snapshots, model checkpoints, and label versions, and report multi-seed mean ± SD with confidence intervals; (3) report label provenance and, alongside hard labels, the continuous-score rank correlation with an independent state-of-the-art comparator (NetMHCpan), to separate cutpoint sensitivity from fidelity; (4) report performance under a realistic class prior (e.g. proteome-scan prevalence), not only a class-balanced prior, since a class-balanced benchmark overstates real-world utility. Each failure mode reproduced a false conclusion that was caught only by controlled re-analysis.</w:t>
       </w:r>
     </w:p>
     <w:p>
@@ -4335,19 +2495,7 @@
         <w:pStyle w:val="BodyText"/>
       </w:pPr>
       <w:r>
-        <w:t xml:space="preserve">An independent predictor, NetMHCpan-4.1, agreed with the MHCflurry labels on only 62.24% (323/519) of the held-out test peptides, versus 90.6% for a model trained on those labels. This ~28-point gap could reflect either label circularity (one labeler is wrong) or label-definition divergence (two valid labelers partition</w:t>
-      </w:r>
-      <w:r>
-        <w:t xml:space="preserve"> </w:t>
-      </w:r>
-      <w:r>
-        <w:t xml:space="preserve">“binder”</w:t>
-      </w:r>
-      <w:r>
-        <w:t xml:space="preserve"> </w:t>
-      </w:r>
-      <w:r>
-        <w:t xml:space="preserve">differently). We disambiguate the two by scoring NetMHCpan on the same 6,524 experimentally measured affinities: it reaches 0.937 AUC, comparable to the Deep FFN’s 0.942 (§3.4). Because both labelers are equally faithful to experimental binding, the 62% disagreement reflects label-definition divergence rather than circularity.</w:t>
+        <w:t xml:space="preserve">An independent predictor, NetMHCpan-4.1, agreed with the MHCflurry labels on only 62.24% (323/519) of the held-out test peptides, versus 90.6% for a model trained on those labels. This ~28-point gap could reflect low label fidelity, low rank agreement, or different cutpoints. Scoring NetMHCpan on the same 6,524 measured affinities gives 0.937 AUC (§3.4), and its ranks correlate with MHCflurry’s at Spearman ρ = 0.97, so neither fidelity nor ranking explains the gap; it localises to the placement of percentile cutpoints (NetMHCpan systematically downgrading weak binders).</w:t>
       </w:r>
     </w:p>
     <w:p>
@@ -4355,55 +2503,19 @@
         <w:pStyle w:val="BodyText"/>
       </w:pPr>
       <w:r>
-        <w:t xml:space="preserve">We therefore formalise a</w:t>
-      </w:r>
-      <w:r>
-        <w:t xml:space="preserve"> </w:t>
-      </w:r>
-      <w:r>
-        <w:rPr>
-          <w:b/>
-          <w:bCs/>
-        </w:rPr>
-        <w:t xml:space="preserve">label-fidelity decomposition</w:t>
-      </w:r>
-      <w:r>
-        <w:t xml:space="preserve"> </w:t>
-      </w:r>
-      <w:r>
-        <w:t xml:space="preserve">of any benchmark’s reported accuracy into two properties of a labelling scheme — its</w:t>
-      </w:r>
-      <w:r>
-        <w:t xml:space="preserve"> </w:t>
-      </w:r>
-      <w:r>
-        <w:rPr>
-          <w:b/>
-          <w:bCs/>
-        </w:rPr>
-        <w:t xml:space="preserve">absolute predictive fidelity</w:t>
-      </w:r>
-      <w:r>
-        <w:t xml:space="preserve"> </w:t>
-      </w:r>
-      <w:r>
-        <w:t xml:space="preserve">(agreement with experimental binding, which is high: AUC ≈0.94 for both MHCflurry and NetMHCpan on 6,524 measured affinities) and its</w:t>
-      </w:r>
-      <w:r>
-        <w:t xml:space="preserve"> </w:t>
-      </w:r>
-      <w:r>
-        <w:rPr>
-          <w:b/>
-          <w:bCs/>
-        </w:rPr>
-        <w:t xml:space="preserve">cross-labeler transferability</w:t>
-      </w:r>
-      <w:r>
-        <w:t xml:space="preserve"> </w:t>
-      </w:r>
-      <w:r>
-        <w:t xml:space="preserve">(agreement with an independent predictor, 62.24%, which is low). High fidelity rules out circularity; the low transferability then identifies label-definition divergence as the source of inflated reported accuracy. Benchmarks that report accuracy only against a single computational labeler measure fidelity to that labeler’s specific binder definition rather than true binding, and overstate generalisation whenever labelers disagree.</w:t>
+        <w:t xml:space="preserve">Two predictors (MHCflurry and NetMHCpan) rank peptides almost identically (Spearman ρ = 0.96) and share a high AUC on experimental affinities (~0.95), yet agree on only 62% of hard labels. This separation of predictive skill (ranking, AUC) from calibration (where the binder threshold is drawn) is a general property of threshold-based evaluation, recently formalised as a</w:t>
+      </w:r>
+      <w:r>
+        <w:t xml:space="preserve"> </w:t>
+      </w:r>
+      <w:r>
+        <w:t xml:space="preserve">‘free knob’</w:t>
+      </w:r>
+      <w:r>
+        <w:t xml:space="preserve"> </w:t>
+      </w:r>
+      <w:r>
+        <w:t xml:space="preserve">in model benchmarking [16]; two models with equal predictive skill can disagree substantially at any fixed threshold [24]. The two labelers’ near-identical ranking is consistent with prior systematic benchmarking [25,26]; the contribution here is quantifying that hard-label agreement is nonetheless only 62%, and localising that gap to percentile-cutpoint placement rather than label fidelity or definition. Benchmarks that report accuracy against a single computational labeler therefore measure that labeler’s specific cutpoints, and overstate generalisation whenever labelers draw different thresholds.</w:t>
       </w:r>
     </w:p>
     <w:p>
@@ -4411,7 +2523,7 @@
         <w:pStyle w:val="BodyText"/>
       </w:pPr>
       <w:r>
-        <w:t xml:space="preserve">BLOSUM62 proved more robust than ESM-2 at single-allele scales: the 2,880-dimensional per-position embeddings overfit the 4,671-sample training set, and the single-split 93.3% reflects a favourable partition rather than a genuine advantage. The shallower 6-layer ESM-2 variant outperformed the deeper 12-layer model, and a PSSM label source (82.6%) underperformed MHCflurry labels. The language-model route may still be viable with continued pre-training on HLA-associated peptides [23].</w:t>
+        <w:t xml:space="preserve">BLOSUM62 proved more robust than ESM-2 at single-allele scales: the 2,880-dimensional per-position embeddings overfit the 4,671-sample training set, and the single-split 93.3% reflects a favourable partition rather than a genuine advantage. The shallower 6-layer ESM-2 variant outperformed the deeper 12-layer model, and a PSSM label source (82.6%) underperformed MHCflurry labels. The language-model route may still be viable with continued pre-training on HLA-associated peptides [27].</w:t>
       </w:r>
     </w:p>
     <w:p>
@@ -4419,11 +2531,11 @@
         <w:pStyle w:val="BodyText"/>
       </w:pPr>
       <w:r>
-        <w:t xml:space="preserve">The multi-allele extension shows the recipe is portable: one rebalanced pan model matches per-allele specialists on four of five alleles (B*07:02 excepted) and reaches 0.819 pooled sensitivity on 15 alleles, approximating NetMHCpan’s practical value with a simple DFFN. This is consistent with the pan-specific paradigm established by mono-allelic immunopeptidomics [24], now exemplified by MixMHCpred v3.0’s pan-allele model, which outperforms state-of-the-art MHC-I ligand predictors across alleles and species [25]. Yet non-canonical (motif-failing) binders remain far below canonical performance across four sequence-based predictors: our Deep FFN (0.607), MHCflurry (0.668), the ESM-2-based MUNIS (0.647), and BigMHC (0.660) report 0.61–0.67 at their own (unmatched) operating points. This convergence is partly a threshold artifact — the predictors operate at unmatched points, and aligned to matched canonical sensitivity the values diverge (DFFN 0.454, MHCflurry 0.497, MUNIS 0.647, BigMHC 0.653) — so the shared ceiling is weaker than the raw band suggests, though it remains far below canonical performance for every predictor. The energy-compensated tail is prediction-resistant to all four. Canonical binding is solved across methods; the non-canonical tail is where current predictors still fall short. This frontier extends beyond anchor-motif violations to non-coding, fusion-derived, and post-translationally modified peptides, for which current predictors remain under-powered [26]. A new wave of transformer- and PLM-based predictors continues to improve canonical prediction [27,28], but whether any of them lifts the non-canonical plateau remains to be seen.</w:t>
-      </w:r>
-    </w:p>
-    <w:bookmarkEnd w:id="37"/>
-    <w:bookmarkStart w:id="38" w:name="translational-implications"/>
+        <w:t xml:space="preserve">The non-canonical tail — where a zero-parameter anchor rule fails but the trained model still recovers eight of nine such binders — extends to non-coding, fusion-derived, and post-translationally modified peptides, for which current predictors remain under-powered [28]. A new wave of transformer- and PLM-based predictors continues to improve canonical prediction [29,30], but whether any of them lifts the non-canonical plateau remains to be seen.</w:t>
+      </w:r>
+    </w:p>
+    <w:bookmarkEnd w:id="24"/>
+    <w:bookmarkStart w:id="25" w:name="translational-implications"/>
     <w:p>
       <w:pPr>
         <w:pStyle w:val="Heading3"/>
@@ -4449,11 +2561,11 @@
         <w:t xml:space="preserve">MNWRPILTI</w:t>
       </w:r>
       <w:r>
-        <w:t xml:space="preserve">, is among the most frequent TP53 missense mutations (~3.5% of somatic mutations, IARC); its vaccine potential requires experimental confirmation (IFN-γ ELISpot). KRAS G12C, which enhanced an existing epitope (WB→SB), is targeted by sotorasib and adagrasib, suggesting combination immunotherapy. We note that binding prediction alone does not establish immunogenicity: peptide–MHC stability predicts immunogenicity better than affinity [29,30], and high-throughput thermostability profiling now quantifies this at immunopeptidome scale [31,32].</w:t>
-      </w:r>
-    </w:p>
-    <w:bookmarkEnd w:id="38"/>
-    <w:bookmarkStart w:id="39" w:name="limitations"/>
+        <w:t xml:space="preserve">, is among the most frequent TP53 missense mutations (~3.5% of somatic mutations, IARC); its vaccine potential requires experimental confirmation (IFN-γ ELISpot). KRAS G12C, which enhanced an existing epitope (WB→SB), is targeted by sotorasib and adagrasib, suggesting combination immunotherapy. We note that binding prediction alone does not establish immunogenicity: peptide–MHC stability predicts immunogenicity better than affinity [31,32], and high-throughput thermostability profiling now quantifies this at immunopeptidome scale [33,34].</w:t>
+      </w:r>
+    </w:p>
+    <w:bookmarkEnd w:id="25"/>
+    <w:bookmarkStart w:id="26" w:name="limitations"/>
     <w:p>
       <w:pPr>
         <w:pStyle w:val="Heading3"/>
@@ -4467,7 +2579,7 @@
         <w:pStyle w:val="FirstParagraph"/>
       </w:pPr>
       <w:r>
-        <w:t xml:space="preserve">Training labels are MHCflurry-derived rather than experimental affinities, so our single-allele benchmark is itself subject to the label-definition divergence we describe; we quantify this by cross-referencing the 42 A*02:01-verified IEDB epitopes against MHCflurry’s training corpus; 40 of the 42 overlapped with MHCflurry’s training corpus, and the two non-overlapping epitopes (</w:t>
+        <w:t xml:space="preserve">Training labels are MHCflurry-derived rather than experimental affinities, so our single-allele benchmark is itself subject to the cutpoint sensitivity we describe; we quantify this by cross-referencing the 42 A*02:01-verified IEDB epitopes against MHCflurry’s training corpus; 40 of the 42 overlapped with MHCflurry’s training corpus, and the two non-overlapping epitopes (</w:t>
       </w:r>
       <w:r>
         <w:rPr>
@@ -4488,12 +2600,12 @@
         <w:t xml:space="preserve">YLQPRTFLL</w:t>
       </w:r>
       <w:r>
-        <w:t xml:space="preserve">) were nonetheless correctly classified, providing limited evidence of generalisation beyond the training distribution. Similarly, the temporal holdout (§3.11) shows that post-2022 epitopes are recognised without a detectable drop, but the evaluated model’s training snapshot was not time-truncated to pre-2022, so this result bounds labeler-level circularity rather than formally excluding leakage of post-2022 peptides into the model’s training data. The single-allele design was deliberate — holding the allele constant isolates label-source variation from allele-driven confounds — but the multi-allele extension addresses the generalisability question directly. The multi-allele estimates rest on IEDB-derived positives; experimental (non-IEDB) validation of the extreme tail is outstanding, and a pMHC-fine-tuned structure model (beyond generic AlphaFold-Multimer) might lift the Type B plateau. All translational predictions and the cancer neoepitope candidates require experimental confirmation (e.g., IFN-γ ELISpot or tetramer staining). Antigen-processing steps (proteasomal cleavage, TAP transport) are not modelled.</w:t>
-      </w:r>
-    </w:p>
-    <w:bookmarkEnd w:id="39"/>
-    <w:bookmarkEnd w:id="40"/>
-    <w:bookmarkStart w:id="41" w:name="conclusion"/>
+        <w:t xml:space="preserve">) were nonetheless correctly classified, providing limited evidence of generalisation beyond the training distribution. The single-allele design was deliberate — holding the allele constant isolates label-source variation from allele-driven confounds. The cutpoint-sensitivity quantification (the ~4-fold offset) is accordingly specific to the A*02:01 benchmark. Testing whether it transfers is not a matter of re-scoring the same peptides for other alleles: those peptides are A*02:01-selected and mostly non-binders elsewhere (rank agreement drops to Spearman ρ = 0.73 and 0.82 for A*01:01 and A*03:01 versus 0.96 for A*02:01). A proper cross-allele test therefore requires a balanced benchmark per allele — which is itself the methodological point: per-allele balanced benchmarks, not pooled multi-allele ones, are the correct unit of analysis; a systematic per-allele survey remains future work. All translational predictions and the cancer neoepitope candidates require experimental confirmation (e.g., IFN-γ ELISpot or tetramer staining). Antigen-processing steps (proteasomal cleavage, TAP transport) are not modelled.</w:t>
+      </w:r>
+    </w:p>
+    <w:bookmarkEnd w:id="26"/>
+    <w:bookmarkEnd w:id="27"/>
+    <w:bookmarkStart w:id="28" w:name="conclusion"/>
     <w:p>
       <w:pPr>
         <w:pStyle w:val="Heading2"/>
@@ -4507,11 +2619,11 @@
         <w:pStyle w:val="FirstParagraph"/>
       </w:pPr>
       <w:r>
-        <w:t xml:space="preserve">Architecture choice has a small effect on peptide-MHC binding prediction: a CNN ranked above the Deep FFN in four of five seeds (a difference within seed-to-seed variability); the top four architectures fell within ~2 percentage points, and a Random Forest was clearly worse. Random-label controls confirmed chance-level performance, ruling out noise overfitting. Canonical binding is largely captured by the anchor motif, but a zero-parameter anchor rule (sensitivity 0.79) underperforms the trained model (0.98), which recovers non-canonical binders the rule misses — while non-canonical binders reach 0.45–0.65 sensitivity across four sequence-based predictors at matched canonical sensitivity 0.95, marking the unresolved part of the problem. Beyond peptide-MHC, the three artifacts we corrected — data-size imbalance, a degenerate null, and stale checkpoints — illustrate a general benchmark-composition failure mode that reproduces false conclusions across machine-learning benchmarks. The label-fidelity decomposition distinguishes label-definition divergence from circularity — two equally faithful labelers (~0.94 AUC) that agree on only 62% of the boundary — and, with the Box 1 checklist, is offered as a reusable safeguard that others can apply to their own benchmarks. Experimental validation of the non-canonical tail is the decisive next step.</w:t>
-      </w:r>
-    </w:p>
-    <w:bookmarkEnd w:id="41"/>
-    <w:bookmarkStart w:id="42" w:name="figure-legends"/>
+        <w:t xml:space="preserve">Architecture choice has a small effect on peptide-MHC binding prediction: a CNN ranked above the Deep FFN in four of five seeds (a difference within seed-to-seed variability); the top four architectures fell within ~2 percentage points, and a Random Forest was clearly worse. Random-label controls confirmed chance-level performance, ruling out noise overfitting. Canonical binding is largely captured by the anchor motif, but a zero-parameter anchor rule (sensitivity 0.79) underperforms the trained model (0.98), which recovers non-canonical binders the rule misses. Beyond peptide-MHC, the two artifacts we corrected — a degenerate null and stale checkpoints — illustrate a general benchmark-composition failure mode that reproduces false conclusions across machine-learning benchmarks. Benchmark hygiene reveals that two high-fidelity labelers with near-identical rankings (ρ = 0.96) agree on only 62% of hard labels — a ~4-fold cutpoint offset that largely vanishes when the cutpoints are aligned — and, with the Box 1 checklist, is offered as a reusable safeguard that others can apply to their own benchmarks. Experimental validation of the non-canonical tail is the decisive next step.</w:t>
+      </w:r>
+    </w:p>
+    <w:bookmarkEnd w:id="28"/>
+    <w:bookmarkStart w:id="29" w:name="figure-legends"/>
     <w:p>
       <w:pPr>
         <w:pStyle w:val="Heading2"/>
@@ -4661,7 +2773,16 @@
         <w:t xml:space="preserve"> </w:t>
       </w:r>
       <w:r>
-        <w:t xml:space="preserve">Rebalanced pan model non-canonical sensitivity (5-seed mean ± SD) across five common HLA-I alleles. Per-allele values are tabulated in Table 6 rather than overlaid, as the per-allele benchmark (n=25 broad-motif) is not directly comparable to the large non-canonical set.</w:t>
+        <w:t xml:space="preserve">Cutpoint sensitivity (the calibration</w:t>
+      </w:r>
+      <w:r>
+        <w:t xml:space="preserve"> </w:t>
+      </w:r>
+      <w:r>
+        <w:t xml:space="preserve">“free knob”</w:t>
+      </w:r>
+      <w:r>
+        <w:t xml:space="preserve">). (a) Binary binder agreement between MHCflurry and NetMHCpan as a function of a shared percentile-rank threshold; agreement dips at the standard 2% cutpoint. (b) Agreement with MHCflurry’s 2% binder call as NetMHCpan’s threshold is varied, showing an ~4-fold calibration offset (MHCflurry 2% ≈ NetMHCpan 8%).</w:t>
       </w:r>
     </w:p>
     <w:p>
@@ -4679,47 +2800,11 @@
         <w:t xml:space="preserve"> </w:t>
       </w:r>
       <w:r>
-        <w:t xml:space="preserve">Predictor sensitivity for Deep FFN, MHCflurry, MUNIS, and BigMHC (sequence): canonical versus Type B (non-canonical) sensitivity, shown at matched canonical operating points (0.90/0.95/0.98).</w:t>
-      </w:r>
-    </w:p>
-    <w:p>
-      <w:pPr>
-        <w:pStyle w:val="BodyText"/>
-      </w:pPr>
-      <w:r>
-        <w:rPr>
-          <w:b/>
-          <w:bCs/>
-        </w:rPr>
-        <w:t xml:space="preserve">Figure 10.</w:t>
-      </w:r>
-      <w:r>
-        <w:t xml:space="preserve"> </w:t>
-      </w:r>
-      <w:r>
-        <w:t xml:space="preserve">Pan16: per-allele non-canonical sensitivity for the 15-allele panel, sorted ascending; dashed line marks the pooled 0.819.</w:t>
-      </w:r>
-    </w:p>
-    <w:p>
-      <w:pPr>
-        <w:pStyle w:val="BodyText"/>
-      </w:pPr>
-      <w:r>
-        <w:rPr>
-          <w:b/>
-          <w:bCs/>
-        </w:rPr>
-        <w:t xml:space="preserve">Figure 11.</w:t>
-      </w:r>
-      <w:r>
-        <w:t xml:space="preserve"> </w:t>
-      </w:r>
-      <w:r>
-        <w:t xml:space="preserve">Temporal holdout: non-canonical sensitivity at threshold 0.95 for pre-2021 (in-distribution) versus post-2022 (unseen by the labeler) epitopes across three alleles.</w:t>
-      </w:r>
-    </w:p>
-    <w:bookmarkEnd w:id="42"/>
-    <w:bookmarkStart w:id="43" w:name="data-and-code-availability"/>
+        <w:t xml:space="preserve">Cross-predictor rank-correlation matrix (|Spearman ρ|). Predictors sharing an objective correlate highly (binding–binding 0.96; presentation–presentation 0.90), whereas cross-objective correlation is moderate (0.72–0.78), reflecting the additional antigen-processing component of presentation predictors.</w:t>
+      </w:r>
+    </w:p>
+    <w:bookmarkEnd w:id="29"/>
+    <w:bookmarkStart w:id="30" w:name="data-and-code-availability"/>
     <w:p>
       <w:pPr>
         <w:pStyle w:val="Heading2"/>
@@ -4733,52 +2818,7 @@
         <w:pStyle w:val="FirstParagraph"/>
       </w:pPr>
       <w:r>
-        <w:t xml:space="preserve">All code, trained models (per-allele</w:t>
-      </w:r>
-      <w:r>
-        <w:t xml:space="preserve"> </w:t>
-      </w:r>
-      <w:r>
-        <w:rPr>
-          <w:rStyle w:val="VerbatimChar"/>
-        </w:rPr>
-        <w:t xml:space="preserve">deep_ffn_HLA-A_*.keras</w:t>
-      </w:r>
-      <w:r>
-        <w:t xml:space="preserve"> </w:t>
-      </w:r>
-      <w:r>
-        <w:t xml:space="preserve">and pan</w:t>
-      </w:r>
-      <w:r>
-        <w:t xml:space="preserve"> </w:t>
-      </w:r>
-      <w:r>
-        <w:rPr>
-          <w:rStyle w:val="VerbatimChar"/>
-        </w:rPr>
-        <w:t xml:space="preserve">deep_ffn_pan_seed*.keras</w:t>
-      </w:r>
-      <w:r>
-        <w:t xml:space="preserve">/</w:t>
-      </w:r>
-      <w:r>
-        <w:rPr>
-          <w:rStyle w:val="VerbatimChar"/>
-        </w:rPr>
-        <w:t xml:space="preserve">deep_ffn_pan16.keras</w:t>
-      </w:r>
-      <w:r>
-        <w:t xml:space="preserve">), feature matrices, prediction results, the curated multi-allele dataset (</w:t>
-      </w:r>
-      <w:r>
-        <w:rPr>
-          <w:rStyle w:val="VerbatimChar"/>
-        </w:rPr>
-        <w:t xml:space="preserve">type_ab_dataset.json</w:t>
-      </w:r>
-      <w:r>
-        <w:t xml:space="preserve">, 14,488 positives), and the experimental-label benchmark (</w:t>
+        <w:t xml:space="preserve">All code, trained models, feature matrices, prediction results, and the experimental-label benchmark (</w:t>
       </w:r>
       <w:r>
         <w:rPr>
@@ -4787,7 +2827,7 @@
         <w:t xml:space="preserve">experimental_label_scores.json</w:t>
       </w:r>
       <w:r>
-        <w:t xml:space="preserve">: 6,524 peptides — 3,438 binders with measured IC50 &lt;500 nM and 3,086 non-binders with IC50 &gt;5,000 nM) are available at github.com/woodhaha/peptide-mhc-benchmark. The per-allele Deep FFN is distributed as the</w:t>
+        <w:t xml:space="preserve">: 6,524 peptides — 3,438 binders with measured IC50 &lt;500 nM and 3,086 non-binders with IC50 &gt;5,000 nM) are available at github.com/woodhaha/peptide-mhc-benchmark and archived at Zenodo (DOI: 10.5281/zenodo.XXXXXXX). The Deep FFN is distributed as the</w:t>
       </w:r>
       <w:r>
         <w:t xml:space="preserve"> </w:t>
@@ -4835,7 +2875,7 @@
         <w:t xml:space="preserve">pmhc_models.npz</w:t>
       </w:r>
       <w:r>
-        <w:t xml:space="preserve">) enable tensorflow-free inference. The single-allele benchmark-hygiene analysis and the multi-allele pan-vs-per-allele benchmark (§3.5–3.11) together constitute the complete study. A reusable benchmark-hygiene checker (</w:t>
+        <w:t xml:space="preserve">) enable tensorflow-free inference. The single-allele benchmark-hygiene analysis constitutes the complete study. A manuscript-consistency checker (</w:t>
       </w:r>
       <w:r>
         <w:rPr>
@@ -4859,11 +2899,11 @@
         <w:t xml:space="preserve">audit_config.json</w:t>
       </w:r>
       <w:r>
-        <w:t xml:space="preserve">) automates the reference-order, factual-tripwire, and figure-inventory consistency checks used in this audit, so others can apply the Box 1 checklist to their own benchmarks.</w:t>
-      </w:r>
-    </w:p>
-    <w:bookmarkEnd w:id="43"/>
-    <w:bookmarkStart w:id="44" w:name="author-contributions"/>
+        <w:t xml:space="preserve">) automates the reference-order, factual-tripwire, and figure-inventory checks used in this audit.</w:t>
+      </w:r>
+    </w:p>
+    <w:bookmarkEnd w:id="30"/>
+    <w:bookmarkStart w:id="31" w:name="author-contributions"/>
     <w:p>
       <w:pPr>
         <w:pStyle w:val="Heading2"/>
@@ -4880,8 +2920,8 @@
         <w:t xml:space="preserve">Conceptualization: Yunshi Huang, Weisheng Chen, Zhuha Zhou. Methodology: Yunshi Huang, Weisheng Chen. Formal analysis: Yunshi Huang, Weisheng Chen, Yiqi Cai. Investigation: Yunshi Huang, Weisheng Chen, Yiqi Cai. Validation: Xiaopeng Zhuang, Zhuxian Zhou. Writing – original draft: Yunshi Huang, Weisheng Chen, Yiqi Cai. Writing – review &amp; editing: Xiaopeng Zhuang, Zhuxian Zhou, Xiangyang Xue, Zhuha Zhou. Supervision: Xiangyang Xue, Zhuha Zhou.</w:t>
       </w:r>
     </w:p>
-    <w:bookmarkEnd w:id="44"/>
-    <w:bookmarkStart w:id="45" w:name="competing-interests"/>
+    <w:bookmarkEnd w:id="31"/>
+    <w:bookmarkStart w:id="32" w:name="competing-interests"/>
     <w:p>
       <w:pPr>
         <w:pStyle w:val="Heading2"/>
@@ -4898,8 +2938,8 @@
         <w:t xml:space="preserve">The authors declare no competing interests.</w:t>
       </w:r>
     </w:p>
-    <w:bookmarkEnd w:id="45"/>
-    <w:bookmarkStart w:id="46" w:name="funding"/>
+    <w:bookmarkEnd w:id="32"/>
+    <w:bookmarkStart w:id="33" w:name="funding"/>
     <w:p>
       <w:pPr>
         <w:pStyle w:val="Heading2"/>
@@ -4916,8 +2956,8 @@
         <w:t xml:space="preserve">This research did not receive specific grant funding.</w:t>
       </w:r>
     </w:p>
-    <w:bookmarkEnd w:id="46"/>
-    <w:bookmarkStart w:id="47" w:name="ethics-statement"/>
+    <w:bookmarkEnd w:id="33"/>
+    <w:bookmarkStart w:id="34" w:name="ethics-statement"/>
     <w:p>
       <w:pPr>
         <w:pStyle w:val="Heading2"/>
@@ -4934,8 +2974,8 @@
         <w:t xml:space="preserve">This study used only publicly available, de-identified data from the Immune Epitope Database (IEDB) and public protein databases; no human subjects, animals, or patient-derived samples were involved, and no ethics approval or informed consent was required.</w:t>
       </w:r>
     </w:p>
-    <w:bookmarkEnd w:id="47"/>
-    <w:bookmarkStart w:id="48" w:name="ai-use-disclosure"/>
+    <w:bookmarkEnd w:id="34"/>
+    <w:bookmarkStart w:id="35" w:name="ai-use-disclosure"/>
     <w:p>
       <w:pPr>
         <w:pStyle w:val="Heading2"/>
@@ -4952,8 +2992,8 @@
         <w:t xml:space="preserve">AI-assisted tools (Claude Code, Anthropic) were used for code development and manuscript editing. All scientific content, interpretations, and conclusions were authored and approved by the human authors, who take full responsibility for the manuscript’s content. No AI tools were listed as authors.</w:t>
       </w:r>
     </w:p>
-    <w:bookmarkEnd w:id="48"/>
-    <w:bookmarkStart w:id="49" w:name="references"/>
+    <w:bookmarkEnd w:id="35"/>
+    <w:bookmarkStart w:id="36" w:name="references"/>
     <w:p>
       <w:pPr>
         <w:pStyle w:val="Heading2"/>
@@ -5103,7 +3143,7 @@
         </w:numPr>
       </w:pPr>
       <w:r>
-        <w:t xml:space="preserve">Henikoff S, Henikoff JG. Amino acid substitution matrices from protein blocks. Proc Natl Acad Sci USA 1992;89:10915-10919.</w:t>
+        <w:t xml:space="preserve">Peters B, Brenner SE, Wang E, Slonim D, Kann MG. Putting benchmarks in their rightful place: The heart of computational biology. PLoS Comput Biol 2018;14:e1006494.</w:t>
       </w:r>
     </w:p>
     <w:p>
@@ -5115,7 +3155,7 @@
         </w:numPr>
       </w:pPr>
       <w:r>
-        <w:t xml:space="preserve">Lin Z, Akin H, Rao R, et al. Evolutionary-scale prediction of atomic-level protein structure with a language model. Science 2023;379:1123-1130.</w:t>
+        <w:t xml:space="preserve">Henikoff S, Henikoff JG. Amino acid substitution matrices from protein blocks. Proc Natl Acad Sci USA 1992;89:10915-10919.</w:t>
       </w:r>
     </w:p>
     <w:p>
@@ -5127,7 +3167,7 @@
         </w:numPr>
       </w:pPr>
       <w:r>
-        <w:t xml:space="preserve">Nielsen M, Lundegaard C, Worning P, et al. Reliable prediction of T-cell epitopes using neural networks with novel sequence representations. Protein Sci 2003;12:1007-1017.</w:t>
+        <w:t xml:space="preserve">Lin Z, Akin H, Rao R, et al. Evolutionary-scale prediction of atomic-level protein structure with a language model. Science 2023;379:1123-1130.</w:t>
       </w:r>
     </w:p>
     <w:p>
@@ -5139,7 +3179,7 @@
         </w:numPr>
       </w:pPr>
       <w:r>
-        <w:t xml:space="preserve">Vita R, Mahajan S, Overton JA, et al. The Immune Epitope Database (IEDB): 2018 update. Nucleic Acids Res 2019;47:D339-D343.</w:t>
+        <w:t xml:space="preserve">Nielsen M, Lundegaard C, Worning P, et al. Reliable prediction of T-cell epitopes using neural networks with novel sequence representations. Protein Sci 2003;12:1007-1017.</w:t>
       </w:r>
     </w:p>
     <w:p>
@@ -5151,7 +3191,7 @@
         </w:numPr>
       </w:pPr>
       <w:r>
-        <w:t xml:space="preserve">Malekzadeh P, Yossef R, Cafri G, et al. Antigen experienced T cells from peripheral blood recognize p53 neoantigens. Clin Cancer Res 2020. doi:10.1158/1078-0432.CCR-19-1874.</w:t>
+        <w:t xml:space="preserve">Munim MH, Saiem BA, Sany A-A, Hashem T. A free knob: decoupling calibration and predictive skill in threshold-based evaluation. arXiv 2026;2609.33457.</w:t>
       </w:r>
     </w:p>
     <w:p>
@@ -5163,7 +3203,7 @@
         </w:numPr>
       </w:pPr>
       <w:r>
-        <w:t xml:space="preserve">Quandt J, Schlude C, Bartoschek M, et al. Long-peptide vaccination with driver gene mutations in p53 and Kras induces cancer mutation-specific effector as well as regulatory T cell responses. Oncoimmunology 2018;7:e1500671.</w:t>
+        <w:t xml:space="preserve">Malekzadeh P, Yossef R, Cafri G, et al. Antigen experienced T cells from peripheral blood recognize p53 neoantigens. Clin Cancer Res 2020. doi:10.1158/1078-0432.CCR-19-1874.</w:t>
       </w:r>
     </w:p>
     <w:p>
@@ -5175,7 +3215,7 @@
         </w:numPr>
       </w:pPr>
       <w:r>
-        <w:t xml:space="preserve">Wu W, Chen Y, Huang L, et al. Point mutation screening of tumor neoantigens and peptide-induced specific cytotoxic T lymphocytes using The Cancer Genome Atlas database. Oncol Lett 2020;20:11986.</w:t>
+        <w:t xml:space="preserve">Quandt J, Schlude C, Bartoschek M, et al. Long-peptide vaccination with driver gene mutations in p53 and Kras induces cancer mutation-specific effector as well as regulatory T cell responses. Oncoimmunology 2018;7:e1500671.</w:t>
       </w:r>
     </w:p>
     <w:p>
@@ -5235,7 +3275,7 @@
         </w:numPr>
       </w:pPr>
       <w:r>
-        <w:t xml:space="preserve">Mares SE, Espinoza Weinberger A, Ioannidis NM. Continued domain-specific pre-training of protein language models for pMHC-I binding prediction. Proc Mach Learn Res 2025;311:304-325.</w:t>
+        <w:t xml:space="preserve">Northcutt CG, Athalye A, Mueller J. Pervasive label errors in test sets destabilize machine learning benchmarks. Proc Conf Neural Inf Process Syst Datasets Benchmarks Track 2021.</w:t>
       </w:r>
     </w:p>
     <w:p>
@@ -5247,7 +3287,7 @@
         </w:numPr>
       </w:pPr>
       <w:r>
-        <w:t xml:space="preserve">Sarkizova S, Klaeger S, Le PM, et al. A large peptidome dataset improves HLA class I epitope prediction across most of the human population. Nat Biotechnol 2020;38:199-209.</w:t>
+        <w:t xml:space="preserve">Sanz-Guerrero M, von der Wense K. Calibration as a first-class criterion in LLM evaluation. arXiv 2026;2609.26489.</w:t>
       </w:r>
     </w:p>
     <w:p>
@@ -5259,7 +3299,7 @@
         </w:numPr>
       </w:pPr>
       <w:r>
-        <w:t xml:space="preserve">Tadros DM, Racle J, Gfeller D. Predicting MHC-I ligands across alleles and species: how far can we go? Genome Med 2025. doi:10.1186/s13073-025-01450-8.</w:t>
+        <w:t xml:space="preserve">Paul S, Croft NP, Purcell AW, Tscharke DC, Sette A, Nielsen M, Peters B. Benchmarking predictions of MHC class I restricted T cell epitopes in a comprehensively studied model system. PLoS Comput Biol 2020;16:e1007757.</w:t>
       </w:r>
     </w:p>
     <w:p>
@@ -5271,7 +3311,7 @@
         </w:numPr>
       </w:pPr>
       <w:r>
-        <w:t xml:space="preserve">Vo TH, McNeela E, O’Donovan O, et al. Artificial intelligence and the evolving landscape of immunopeptidomics. Proteomics Clin Appl 2025. doi:10.1002/prca.70018.</w:t>
+        <w:t xml:space="preserve">Zhao W, Sher X. Systematically benchmarking peptide-MHC binding predictors: From synthetic to naturally processed epitopes. PLoS Comput Biol 2018;14:e1006457.</w:t>
       </w:r>
     </w:p>
     <w:p>
@@ -5283,7 +3323,7 @@
         </w:numPr>
       </w:pPr>
       <w:r>
-        <w:t xml:space="preserve">Xu H, Ni Y, Chai Z, Cui X, Lei X, Liu L, Shan J, Qian C. TransBindpMHCI: a transformer-based model for pan-specific MHC-I peptide binding prediction. BMC Bioinformatics 2026;27:117.</w:t>
+        <w:t xml:space="preserve">Mares SE, Espinoza Weinberger A, Ioannidis NM. Continued domain-specific pre-training of protein language models for pMHC-I binding prediction. Proc Mach Learn Res 2025;311:304-325.</w:t>
       </w:r>
     </w:p>
     <w:p>
@@ -5295,7 +3335,7 @@
         </w:numPr>
       </w:pPr>
       <w:r>
-        <w:t xml:space="preserve">Cheng X, Mei H, Chen P, Wu H, Liu R, Lei Y, Wang P. ESMpHLA: evolutionary scale model-based deep learning prediction of HLA class I binding peptides. HLA 2025;105:e70263.</w:t>
+        <w:t xml:space="preserve">Vo TH, McNeela E, O’Donovan O, et al. Artificial intelligence and the evolving landscape of immunopeptidomics. Proteomics Clin Appl 2025. doi:10.1002/prca.70018.</w:t>
       </w:r>
     </w:p>
     <w:p>
@@ -5307,7 +3347,7 @@
         </w:numPr>
       </w:pPr>
       <w:r>
-        <w:t xml:space="preserve">Harndahl M, Rasmussen M, Roder G, et al. Peptide-MHC class I stability is a better predictor than peptide affinity of CTL immunogenicity. Eur J Immunol 2012;42:1405-1416.</w:t>
+        <w:t xml:space="preserve">Xu H, Ni Y, Chai Z, Cui X, Lei X, Liu L, Shan J, Qian C. TransBindpMHCI: a transformer-based model for pan-specific MHC-I peptide binding prediction. BMC Bioinformatics 2026;27:117.</w:t>
       </w:r>
     </w:p>
     <w:p>
@@ -5319,7 +3359,7 @@
         </w:numPr>
       </w:pPr>
       <w:r>
-        <w:t xml:space="preserve">Backert L, Kohlbacher O. Immunoinformatics and epitope prediction in the age of genomic medicine. Genome Med 2015;7:119.</w:t>
+        <w:t xml:space="preserve">Cheng X, Mei H, Chen P, Wu H, Liu R, Lei Y, Wang P. ESMpHLA: evolutionary scale model-based deep learning prediction of HLA class I binding peptides. HLA 2025;105:e70263.</w:t>
       </w:r>
     </w:p>
     <w:p>
@@ -5331,7 +3371,7 @@
         </w:numPr>
       </w:pPr>
       <w:r>
-        <w:t xml:space="preserve">Jappe EC, Garde C, Ramarathinam SH, et al. Thermostability profiling of MHC-bound peptides: a new dimension in immunopeptidomics and aid for immunotherapy design. Nat Commun 2020. doi:10.1038/s41467-020-20166-4.</w:t>
+        <w:t xml:space="preserve">Harndahl M, Rasmussen M, Roder G, et al. Peptide-MHC class I stability is a better predictor than peptide affinity of CTL immunogenicity. Eur J Immunol 2012;42:1405-1416.</w:t>
       </w:r>
     </w:p>
     <w:p>
@@ -5343,11 +3383,35 @@
         </w:numPr>
       </w:pPr>
       <w:r>
+        <w:t xml:space="preserve">Backert L, Kohlbacher O. Immunoinformatics and epitope prediction in the age of genomic medicine. Genome Med 2015;7:119.</w:t>
+      </w:r>
+    </w:p>
+    <w:p>
+      <w:pPr>
+        <w:pStyle w:val="Compact"/>
+        <w:numPr>
+          <w:ilvl w:val="0"/>
+          <w:numId w:val="1001"/>
+        </w:numPr>
+      </w:pPr>
+      <w:r>
+        <w:t xml:space="preserve">Jappe EC, Garde C, Ramarathinam SH, et al. Thermostability profiling of MHC-bound peptides: a new dimension in immunopeptidomics and aid for immunotherapy design. Nat Commun 2020. doi:10.1038/s41467-020-20166-4.</w:t>
+      </w:r>
+    </w:p>
+    <w:p>
+      <w:pPr>
+        <w:pStyle w:val="Compact"/>
+        <w:numPr>
+          <w:ilvl w:val="0"/>
+          <w:numId w:val="1001"/>
+        </w:numPr>
+      </w:pPr>
+      <w:r>
         <w:t xml:space="preserve">Fasoulis R, Rigo MM, Antunes DA, et al. Transfer learning improves pMHC kinetic stability and immunogenicity predictions. ImmunoInformatics 2024. doi:10.1016/j.immuno.2023.100030.</w:t>
       </w:r>
     </w:p>
-    <w:bookmarkEnd w:id="49"/>
-    <w:bookmarkEnd w:id="50"/>
+    <w:bookmarkEnd w:id="36"/>
+    <w:bookmarkEnd w:id="37"/>
     <w:sectPr>
       <w:footnotePr>
         <w:numRestart w:val="eachSect"/>

</xml_diff>

<commit_message>
fix: reconcile figure-data and naming inconsistencies
- unify Spearman to 0.96 (last stray 0.97 in Discussion)
- BLOSUM62 CV 92.2 -> 92.1, correct per-fold list to match esm2_cv_results.csv
- encoding model label FFN -> Deep FFN (matches esm2_cv_results.csv)
- rename data key "FFN (Jessen)" -> "FFN (Nielsen)" across multiseed_results.json,
  pssm_comparison.csv, regenerate_corrected_figures.py

Co-Authored-By: Claude Code <noreply@anthropic.com>
</commit_message>
<xml_diff>
--- a/06_Bioinformatics_Submission/manuscript_plos.docx
+++ b/06_Bioinformatics_Submission/manuscript_plos.docx
@@ -1049,7 +1049,7 @@
         <w:pStyle w:val="FirstParagraph"/>
       </w:pPr>
       <w:r>
-        <w:t xml:space="preserve">On the FFN (the architecture used for all encoding comparisons), BLOSUM62 generalized stably under cross-validation (92.2 ± 0.4%; per-fold 92.2/92.4/92.1/92.7/91.6%). ESM-2 t6 per-position embeddings scored 93.3% on a single split but collapsed to 82.2 ± 1.0% under CV — the 2,880-dimensional features overfit the 4,671-sample training set (Table 3, Figure 7). Mean-pooled t6 embeddings collapsed to 65.9%, confirming that positional information is essential. The t12 variant (4,320-dim) overfit similarly (90.9–91.5%). The single-split 93.3% result reflects a favourable partition rather than a genuine encoding advantage at this training scale. ESM-2’s representational advantage materialises only at large scale: the 650M checkpoint (11,520-dim per-peptide) reached 92.4 ± 0.5% under CV, matching BLOSUM62 (92.2 ± 0.4%) but at 64× the input dimensionality. At the data scale typical of single-allele studies, compact biologically motivated encodings such as BLOSUM62 therefore remain the more cost-effective choice, while the small ESM-2 checkpoints overfit.</w:t>
+        <w:t xml:space="preserve">On the Deep FFN (the architecture used for the encoding comparisons), BLOSUM62 generalized stably under cross-validation (92.1 ± 0.4%; per-fold 92.0/92.6/91.7/92.4/91.8%). ESM-2 t6 per-position embeddings scored 93.3% on a single split but collapsed to 82.2 ± 1.0% under CV — the 2,880-dimensional features overfit the 4,671-sample training set (Table 3, Figure 7). Mean-pooled t6 embeddings collapsed to 65.9%, confirming that positional information is essential. The t12 variant (4,320-dim) overfit similarly (90.9–91.5%). The single-split 93.3% result reflects a favourable partition rather than a genuine encoding advantage at this training scale. ESM-2’s representational advantage materialises only at large scale: the 650M checkpoint (11,520-dim per-peptide) reached 92.4 ± 0.5% under CV, matching BLOSUM62 (92.1 ± 0.4%) but at 64× the input dimensionality. At the data scale typical of single-allele studies, compact biologically motivated encodings such as BLOSUM62 therefore remain the more cost-effective choice, while the small ESM-2 checkpoints overfit.</w:t>
       </w:r>
     </w:p>
     <w:p>
@@ -1166,7 +1166,7 @@
               <w:jc w:val="center"/>
             </w:pPr>
             <w:r>
-              <w:t xml:space="preserve">92.2 ± 0.4 (CV)</w:t>
+              <w:t xml:space="preserve">92.1 ± 0.4 (CV)</w:t>
             </w:r>
           </w:p>
         </w:tc>
@@ -2495,7 +2495,7 @@
         <w:pStyle w:val="BodyText"/>
       </w:pPr>
       <w:r>
-        <w:t xml:space="preserve">An independent predictor, NetMHCpan-4.1, agreed with the MHCflurry labels on only 62.24% (323/519) of the held-out test peptides, versus 90.6% for a model trained on those labels. This ~28-point gap could reflect low label fidelity, low rank agreement, or different cutpoints. Scoring NetMHCpan on the same 6,524 measured affinities gives 0.937 AUC (§3.4), and its ranks correlate with MHCflurry’s at Spearman ρ = 0.97, so neither fidelity nor ranking explains the gap; it localises to the placement of percentile cutpoints (NetMHCpan systematically downgrading weak binders).</w:t>
+        <w:t xml:space="preserve">An independent predictor, NetMHCpan-4.1, agreed with the MHCflurry labels on only 62.24% (323/519) of the held-out test peptides, versus 90.6% for a model trained on those labels. This ~28-point gap could reflect low label fidelity, low rank agreement, or different cutpoints. Scoring NetMHCpan on the same 6,524 measured affinities gives 0.937 AUC (§3.4), and its ranks correlate with MHCflurry’s at Spearman ρ = 0.96, so neither fidelity nor ranking explains the gap; it localises to the placement of percentile cutpoints (NetMHCpan systematically downgrading weak binders).</w:t>
       </w:r>
     </w:p>
     <w:p>

</xml_diff>

<commit_message>
docs: address 3-judge review — conservative wording, structure, scope framing
- §3.4: McNemar non-inferiority caveat (5 discordant pairs, underpowered)
- §3.4: soften non-canonical tail claim (n=9, weak inference)
- Results intro: reframe §3.1-3.3 as controlled setup for the §3.4 cutpoint finding
- Discussion: distinguish allele-agnostic Box 1 practices from A*02:01-specific offset

Co-Authored-By: Claude Code <noreply@anthropic.com>
</commit_message>
<xml_diff>
--- a/06_Bioinformatics_Submission/manuscript_plos.docx
+++ b/06_Bioinformatics_Submission/manuscript_plos.docx
@@ -434,6 +434,14 @@
       </w:pPr>
       <w:r>
         <w:t xml:space="preserve">3 Results</w:t>
+      </w:r>
+    </w:p>
+    <w:p>
+      <w:pPr>
+        <w:pStyle w:val="FirstParagraph"/>
+      </w:pPr>
+      <w:r>
+        <w:t xml:space="preserve">The results are organised to isolate the failure mode of interest. Sections 3.1–3.3 vary the three variables that could confound a benchmark — architecture, label source, and encoding — and show that each has only a small effect at this data scale. This controlled setup is what allows §3.4 to attribute the large label-agreement gap between two high-fidelity predictors to percentile-cutpoint placement rather than to architecture choice, label quality, or feature encoding.</w:t>
       </w:r>
     </w:p>
     <w:bookmarkStart w:id="18" w:name="X328ccea0a1818c4ae7426a226dff6f18d15ba8f"/>
@@ -1552,7 +1560,7 @@
         <w:t xml:space="preserve"> </w:t>
       </w:r>
       <w:r>
-        <w:t xml:space="preserve">(HPV16 E7), carries a non-canonical p9 anchor (C). An independent predictor, NetMHCpan-4.1b (DTU standalone, run locally), achieved 85.7% sensitivity (36/42; Wilson 95% CI 72.1–93.3%) on the corrected 42-epitope set, statistically indistinguishable from the Deep FFN (41/42 = 97.6%; exact McNemar p = 0.0625, five discordant pairs). NetMHCpan’s pan-specific training on MS-elution-based labels makes this an indicative rather than clean comparison; the more direct evidence of cutpoint sensitivity is the 62.24% label agreement (323/519 test peptides) reported in the Discussion. To contextualise the benchmark, we include a zero-parameter anchor-checker baseline (a rule classifying any 9-mer with canonical p2/p9 residues as a binder): it achieves sensitivity 0.786 (33/42) and specificity 0.900 (18/20), below the trained model (0.976), because nine genuine binders carry non-canonical p2/p9 anchors. The trained model recovers eight of these nine (Wilson 95% CI 52–98%) — the single residual miss,</w:t>
+        <w:t xml:space="preserve">(HPV16 E7), carries a non-canonical p9 anchor (C). An independent predictor, NetMHCpan-4.1b (DTU standalone, run locally), achieved 85.7% sensitivity (36/42; Wilson 95% CI 72.1–93.3%) on the corrected 42-epitope set, statistically indistinguishable from the Deep FFN (41/42 = 97.6%; exact McNemar p = 0.0625, five discordant pairs) — though with only five discordant pairs this comparison is underpowered and establishes non-inferiority, not equivalence. NetMHCpan’s pan-specific training on MS-elution-based labels makes this an indicative rather than clean comparison; the more direct evidence of cutpoint sensitivity is the 62.24% label agreement (323/519 test peptides) reported in the Discussion. To contextualise the benchmark, we include a zero-parameter anchor-checker baseline (a rule classifying any 9-mer with canonical p2/p9 residues as a binder): it achieves sensitivity 0.786 (33/42) and specificity 0.900 (18/20), below the trained model (0.976), because nine genuine binders carry non-canonical p2/p9 anchors. The trained model recovers eight of these nine (Wilson 95% CI 52–98%) — the single residual miss,</w:t>
       </w:r>
       <w:r>
         <w:t xml:space="preserve"> </w:t>
@@ -1567,7 +1575,7 @@
         <w:t xml:space="preserve"> </w:t>
       </w:r>
       <w:r>
-        <w:t xml:space="preserve">(p9 = C), defines the hard non-canonical tail — suggesting, on nine peptides, that part of the informative signal lies beyond the anchor motif. The five false positives were homopolymers (≤2 unique amino acids) with canonical anchors — biologically implausible binders whose low sequence complexity the classifier fails to penalise. A domain-knowledge filter (≤2 unique amino acids → non-binder) removed all five, but we report 75.0% as the primary, unfiltered specificity to avoid post-hoc inflation. As a secondary negative set, 20 experimentally measured A*02:01 negatives (IEDB qualitative_measure = Negative) yielded 90.0% specificity (18/20), confirming that the homopolymer set is a conservative lower bound on realistic specificity. To characterise the labels independently of the labeler’s own decision boundary, we additionally scored the Deep FFN against a large label-independent set of experimentally measured affinities (IEDB binding-affinity corpus, accessed 2026-08-02) — 3,438 unique 9-mers with measured IC50 &lt;500 nM and 3,086 with IC50 &gt;5,000 nM (the 500–5,000 nM grey zone was excluded to yield unambiguous binders and non-binders), restricted to direct binding assays (competitive fluorescence/radioactivity) and excluding MS-elution-derived, predictor-dependent entries. The MHCflurry-trained Deep FFN recognised 94.4% of the experimental binders and rejected 74.5% of the non-binders (threshold 0.5; ROC AUC 0.942); the rebalanced per-allele model reached 89.8% sensitivity and 89.1% specificity (AUC 0.945). To characterise the labelers directly, we scored MHCflurry 2.2.1 itself on the 6,524 affinities (AUC 0.950) alongside NetMHCpan-4.1b (0.937 EL-rank, 0.960 BA-rank) — both high, though 91.6% of these peptides appear in MHCflurry’s training corpus, so these values are largely in-corpus. The two predictors also rank peptides almost identically (Spearman ρ = 0.96), yet their hard labels agree on only 62.24% of the 519 test peptides (Cohen’s κ = 0.44). The disagreement is asymmetric — NetMHCpan downgrades MHCflurry’s weak binders to non-binders (73% of WB) and strong to weak (30%) — and largely vanishes under the natural class prior (96% agreement), localising the 62% figure to cutpoint placement rather than label definition or fidelity. To quantify this cutpoint sensitivity, we varied the percentile-rank threshold and recomputed the two predictors’ binary binder agreement (Figure 8). Agreement is non-monotonic, dipping to 73.4% at the standard 2% threshold, where MHCflurry calls 69.6% of the balanced test set binders versus 43.0% for NetMHCpan. The two rank distributions are offset roughly four-fold — MHCflurry’s top-2% threshold corresponds to NetMHCpan’s top-8% — and aligning the cutpoints recovers 96.1% agreement. The predictors thus share predictive skill but differ in calibration (where the binder threshold is drawn), a decoupling recently formalised as a</w:t>
+        <w:t xml:space="preserve">(p9 = C), defines the hard non-canonical tail — suggesting — on a sample of only nine peptides, too small for strong inference — that part of the informative signal may lie beyond the anchor motif. The five false positives were homopolymers (≤2 unique amino acids) with canonical anchors — biologically implausible binders whose low sequence complexity the classifier fails to penalise. A domain-knowledge filter (≤2 unique amino acids → non-binder) removed all five, but we report 75.0% as the primary, unfiltered specificity to avoid post-hoc inflation. As a secondary negative set, 20 experimentally measured A*02:01 negatives (IEDB qualitative_measure = Negative) yielded 90.0% specificity (18/20), confirming that the homopolymer set is a conservative lower bound on realistic specificity. To characterise the labels independently of the labeler’s own decision boundary, we additionally scored the Deep FFN against a large label-independent set of experimentally measured affinities (IEDB binding-affinity corpus, accessed 2026-08-02) — 3,438 unique 9-mers with measured IC50 &lt;500 nM and 3,086 with IC50 &gt;5,000 nM (the 500–5,000 nM grey zone was excluded to yield unambiguous binders and non-binders), restricted to direct binding assays (competitive fluorescence/radioactivity) and excluding MS-elution-derived, predictor-dependent entries. The MHCflurry-trained Deep FFN recognised 94.4% of the experimental binders and rejected 74.5% of the non-binders (threshold 0.5; ROC AUC 0.942); the rebalanced per-allele model reached 89.8% sensitivity and 89.1% specificity (AUC 0.945). To characterise the labelers directly, we scored MHCflurry 2.2.1 itself on the 6,524 affinities (AUC 0.950) alongside NetMHCpan-4.1b (0.937 EL-rank, 0.960 BA-rank) — both high, though 91.6% of these peptides appear in MHCflurry’s training corpus, so these values are largely in-corpus. The two predictors also rank peptides almost identically (Spearman ρ = 0.96), yet their hard labels agree on only 62.24% of the 519 test peptides (Cohen’s κ = 0.44). The disagreement is asymmetric — NetMHCpan downgrades MHCflurry’s weak binders to non-binders (73% of WB) and strong to weak (30%) — and largely vanishes under the natural class prior (96% agreement), localising the 62% figure to cutpoint placement rather than label definition or fidelity. To quantify this cutpoint sensitivity, we varied the percentile-rank threshold and recomputed the two predictors’ binary binder agreement (Figure 8). Agreement is non-monotonic, dipping to 73.4% at the standard 2% threshold, where MHCflurry calls 69.6% of the balanced test set binders versus 43.0% for NetMHCpan. The two rank distributions are offset roughly four-fold — MHCflurry’s top-2% threshold corresponds to NetMHCpan’s top-8% — and aligning the cutpoints recovers 96.1% agreement. The predictors thus share predictive skill but differ in calibration (where the binder threshold is drawn), a decoupling recently formalised as a</w:t>
       </w:r>
       <w:r>
         <w:t xml:space="preserve"> </w:t>
@@ -2515,7 +2523,7 @@
         <w:t xml:space="preserve"> </w:t>
       </w:r>
       <w:r>
-        <w:t xml:space="preserve">in model benchmarking [16]; two models with equal predictive skill can disagree substantially at any fixed threshold [24]. The two labelers’ near-identical ranking is consistent with prior systematic benchmarking [25,26]; the contribution here is quantifying that hard-label agreement is nonetheless only 62%, and localising that gap to percentile-cutpoint placement rather than label fidelity or definition. Benchmarks that report accuracy against a single computational labeler therefore measure that labeler’s specific cutpoints, and overstate generalisation whenever labelers draw different thresholds.</w:t>
+        <w:t xml:space="preserve">in model benchmarking [16]; two models with equal predictive skill can disagree substantially at any fixed threshold [24]. The two labelers’ near-identical ranking is consistent with prior systematic benchmarking [25,26]; the contribution here is quantifying that hard-label agreement is nonetheless only 62%, and localising that gap to percentile-cutpoint placement rather than label fidelity or definition. Benchmarks that report accuracy against a single computational labeler therefore measure that labeler’s specific cutpoints, and overstate generalisation whenever labelers draw different thresholds. The countermeasures in Box 1 are allele-agnostic practices — a random-label null, multi-seed reporting, a rank-correlation comparator, and natural-prior reporting apply to any allele — whereas the ~4-fold offset we quantify is an A*02:01-specific instantiation; whether other alleles show a smaller or larger offset is precisely what a per-allele balanced benchmark is designed to answer.</w:t>
       </w:r>
     </w:p>
     <w:p>

</xml_diff>

<commit_message>
docs: de-template prose, keep all numbers and citations
- vary the "agree on only 62%" formula across abstract/summary/conclusion
- break verbatim "anchor rule underperforms the trained model" duplication
- trim redundant "therefore" (6->4) and vary "the trained model" references

Co-Authored-By: Claude Code <noreply@anthropic.com>
</commit_message>
<xml_diff>
--- a/06_Bioinformatics_Submission/manuscript_plos.docx
+++ b/06_Bioinformatics_Submission/manuscript_plos.docx
@@ -239,7 +239,7 @@
         <w:pStyle w:val="FirstParagraph"/>
       </w:pPr>
       <w:r>
-        <w:t xml:space="preserve">Peptide-MHC-I binding predictors are routinely trained on computationally labelled data, yet benchmark scores that reproduce a labeler’s decision boundary are rarely separated from true binding accuracy. We present a controlled benchmark of six deep-learning architectures for HLA-A*02:01 under multi-seed uncertainty, and demonstrate how benchmark composition manufactures false conclusions: two apparent findings dissolved under re-analysis, each traced to a benchmark-composition artifact. The genuinely hard problem is non-canonical binding: a zero-parameter anchor rule underperforms the trained model, which recovers non-canonical binders the rule misses. We validate against 42 re-verified IEDB epitopes (97.6% sensitivity), and show that two high-fidelity predictors that rank peptides almost identically (Spearman ρ = 0.96) nevertheless agree on only 62% of hard labels, a discrepancy that reflects a ~4-fold offset in their percentile cutpoints and largely vanishes when the cutpoints are aligned. A benchmark-hygiene checklist distils the countermeasures. Code, models, and data are available at github.com/woodhaha/peptide-mhc-benchmark.</w:t>
+        <w:t xml:space="preserve">Peptide-MHC-I binding predictors are routinely trained on computationally labelled data, yet benchmark scores that reproduce a labeler’s decision boundary are rarely separated from true binding accuracy. We present a controlled benchmark of six deep-learning architectures for HLA-A*02:01 under multi-seed uncertainty, and demonstrate how benchmark composition manufactures false conclusions: two apparent findings dissolved under re-analysis, each traced to a benchmark-composition artifact. The genuinely hard problem is non-canonical binding: the trained model recovers binders that a zero-parameter anchor rule misses. We validate against 42 re-verified IEDB epitopes (97.6% sensitivity), and show that two high-fidelity predictors that rank peptides almost identically (Spearman ρ = 0.96) nevertheless give the same hard label to only 62% of peptides, a discrepancy that reflects a ~4-fold offset in their percentile cutpoints and largely vanishes when the cutpoints are aligned. A benchmark-hygiene checklist distils the countermeasures. Code, models, and data are available at github.com/woodhaha/peptide-mhc-benchmark.</w:t>
       </w:r>
     </w:p>
     <w:bookmarkEnd w:id="9"/>
@@ -269,7 +269,7 @@
         <w:t xml:space="preserve"> </w:t>
       </w:r>
       <w:r>
-        <w:t xml:space="preserve">threshold is drawn: two leading predictors that rank peptides almost identically agree on only 62% of hard labels, a gap that reflects a roughly four-fold offset in their percentile cutpoints and largely vanishes when the cutpoints are aligned. Second, the genuinely difficult frontier is non-canonical binding — peptides that violate the classic anchor-position rules, which simple motif rules miss but the trained model recovers. We distil these lessons into a reusable benchmark-hygiene checklist so that others can avoid reporting evaluation artifacts as biological findings.</w:t>
+        <w:t xml:space="preserve">threshold is drawn: two leading predictors, despite near-identical rankings, give the same hard label to only 62% of peptides; the disagreement traces to a roughly four-fold difference in where each draws its binder threshold and mostly disappears once the thresholds are aligned. Second, the genuinely difficult frontier is non-canonical binding — peptides that violate the classic anchor-position rules, which simple motif rules miss but the trained model recovers. We distil these lessons into a reusable benchmark-hygiene checklist so that others can avoid reporting evaluation artifacts as biological findings.</w:t>
       </w:r>
     </w:p>
     <w:p>
@@ -1057,7 +1057,7 @@
         <w:pStyle w:val="FirstParagraph"/>
       </w:pPr>
       <w:r>
-        <w:t xml:space="preserve">On the Deep FFN (the architecture used for the encoding comparisons), BLOSUM62 generalized stably under cross-validation (92.1 ± 0.4%; per-fold 92.0/92.6/91.7/92.4/91.8%). ESM-2 t6 per-position embeddings scored 93.3% on a single split but collapsed to 82.2 ± 1.0% under CV — the 2,880-dimensional features overfit the 4,671-sample training set (Table 3, Figure 7). Mean-pooled t6 embeddings collapsed to 65.9%, confirming that positional information is essential. The t12 variant (4,320-dim) overfit similarly (90.9–91.5%). The single-split 93.3% result reflects a favourable partition rather than a genuine encoding advantage at this training scale. ESM-2’s representational advantage materialises only at large scale: the 650M checkpoint (11,520-dim per-peptide) reached 92.4 ± 0.5% under CV, matching BLOSUM62 (92.1 ± 0.4%) but at 64× the input dimensionality. At the data scale typical of single-allele studies, compact biologically motivated encodings such as BLOSUM62 therefore remain the more cost-effective choice, while the small ESM-2 checkpoints overfit.</w:t>
+        <w:t xml:space="preserve">On the Deep FFN (the architecture used for the encoding comparisons), BLOSUM62 generalized stably under cross-validation (92.1 ± 0.4%; per-fold 92.0/92.6/91.7/92.4/91.8%). ESM-2 t6 per-position embeddings scored 93.3% on a single split but collapsed to 82.2 ± 1.0% under CV — the 2,880-dimensional features overfit the 4,671-sample training set (Table 3, Figure 7). Mean-pooled t6 embeddings collapsed to 65.9%, confirming that positional information is essential. The t12 variant (4,320-dim) overfit similarly (90.9–91.5%). The single-split 93.3% result reflects a favourable partition rather than a genuine encoding advantage at this training scale. ESM-2’s representational advantage materialises only at large scale: the 650M checkpoint (11,520-dim per-peptide) reached 92.4 ± 0.5% under CV, matching BLOSUM62 (92.1 ± 0.4%) but at 64× the input dimensionality. At the data scale typical of single-allele studies, compact biologically motivated encodings such as BLOSUM62 remain the more cost-effective choice, while the small ESM-2 checkpoints overfit.</w:t>
       </w:r>
     </w:p>
     <w:p>
@@ -1560,7 +1560,7 @@
         <w:t xml:space="preserve"> </w:t>
       </w:r>
       <w:r>
-        <w:t xml:space="preserve">(HPV16 E7), carries a non-canonical p9 anchor (C). An independent predictor, NetMHCpan-4.1b (DTU standalone, run locally), achieved 85.7% sensitivity (36/42; Wilson 95% CI 72.1–93.3%) on the corrected 42-epitope set, statistically indistinguishable from the Deep FFN (41/42 = 97.6%; exact McNemar p = 0.0625, five discordant pairs) — though with only five discordant pairs this comparison is underpowered and establishes non-inferiority, not equivalence. NetMHCpan’s pan-specific training on MS-elution-based labels makes this an indicative rather than clean comparison; the more direct evidence of cutpoint sensitivity is the 62.24% label agreement (323/519 test peptides) reported in the Discussion. To contextualise the benchmark, we include a zero-parameter anchor-checker baseline (a rule classifying any 9-mer with canonical p2/p9 residues as a binder): it achieves sensitivity 0.786 (33/42) and specificity 0.900 (18/20), below the trained model (0.976), because nine genuine binders carry non-canonical p2/p9 anchors. The trained model recovers eight of these nine (Wilson 95% CI 52–98%) — the single residual miss,</w:t>
+        <w:t xml:space="preserve">(HPV16 E7), carries a non-canonical p9 anchor (C). An independent predictor, NetMHCpan-4.1b (DTU standalone, run locally), achieved 85.7% sensitivity (36/42; Wilson 95% CI 72.1–93.3%) on the corrected 42-epitope set, statistically indistinguishable from the Deep FFN (41/42 = 97.6%; exact McNemar p = 0.0625, five discordant pairs) — though with only five discordant pairs this comparison is underpowered and establishes non-inferiority, not equivalence. NetMHCpan’s pan-specific training on MS-elution-based labels makes this an indicative rather than clean comparison; the more direct evidence of cutpoint sensitivity is the 62.24% label agreement (323/519 test peptides) reported in the Discussion. To contextualise the benchmark, we include a zero-parameter anchor-checker baseline (a rule classifying any 9-mer with canonical p2/p9 residues as a binder): it achieves sensitivity 0.786 (33/42) and specificity 0.900 (18/20), below the trained model (0.976), because nine genuine binders carry non-canonical p2/p9 anchors. It recovers eight of these nine (Wilson 95% CI 52–98%) — the single residual miss,</w:t>
       </w:r>
       <w:r>
         <w:t xml:space="preserve"> </w:t>
@@ -2495,7 +2495,7 @@
         <w:pStyle w:val="BodyText"/>
       </w:pPr>
       <w:r>
-        <w:t xml:space="preserve">A PSSM-derived label source yielded lower accuracy than MHCflurry labels (82.6% vs 90.6%, though on a separate peptide pool and therefore not a clean comparison). This does not support the hypothesis that deterministic biophysical labels are inherently superior to ML-derived labels; rather, it suggests that MHCflurry’s labels are at least as learnable as a simple PSSM. We emphasise that training on any computational label — including MHCflurry — re-deposits predictor bias into downstream models, and recommend that benchmarks report label provenance and the WB-class F1 as a standard diagnostic.</w:t>
+        <w:t xml:space="preserve">A PSSM-derived label source yielded lower accuracy than MHCflurry labels (82.6% vs 90.6%, though on a separate peptide pool and so not a clean comparison). This does not support the hypothesis that deterministic biophysical labels are inherently superior to ML-derived labels; rather, it suggests that MHCflurry’s labels are at least as learnable as a simple PSSM. We emphasise that training on any computational label — including MHCflurry — re-deposits predictor bias into downstream models, and recommend that benchmarks report label provenance and the WB-class F1 as a standard diagnostic.</w:t>
       </w:r>
     </w:p>
     <w:p>
@@ -2627,7 +2627,7 @@
         <w:pStyle w:val="FirstParagraph"/>
       </w:pPr>
       <w:r>
-        <w:t xml:space="preserve">Architecture choice has a small effect on peptide-MHC binding prediction: a CNN ranked above the Deep FFN in four of five seeds (a difference within seed-to-seed variability); the top four architectures fell within ~2 percentage points, and a Random Forest was clearly worse. Random-label controls confirmed chance-level performance, ruling out noise overfitting. Canonical binding is largely captured by the anchor motif, but a zero-parameter anchor rule (sensitivity 0.79) underperforms the trained model (0.98), which recovers non-canonical binders the rule misses. Beyond peptide-MHC, the two artifacts we corrected — a degenerate null and stale checkpoints — illustrate a general benchmark-composition failure mode that reproduces false conclusions across machine-learning benchmarks. Benchmark hygiene reveals that two high-fidelity labelers with near-identical rankings (ρ = 0.96) agree on only 62% of hard labels — a ~4-fold cutpoint offset that largely vanishes when the cutpoints are aligned — and, with the Box 1 checklist, is offered as a reusable safeguard that others can apply to their own benchmarks. Experimental validation of the non-canonical tail is the decisive next step.</w:t>
+        <w:t xml:space="preserve">Architecture mattered little: the CNN ranked above the Deep FFN in four of five seeds, the top four architectures fell within ~2 percentage points, and only the Random Forest lagged (79.7%). Random-label controls confirmed chance-level performance, ruling out noise overfitting. Canonical binding is largely captured by the anchor motif, but the trained model (0.98 sensitivity) recovers non-canonical binders that a zero-parameter anchor rule (0.79) misses. Beyond peptide-MHC, the two artifacts we corrected — a degenerate null and stale checkpoints — illustrate a general benchmark-composition failure mode that reproduces false conclusions across machine-learning benchmarks. Benchmark hygiene reveals that two high-fidelity labelers, near-identical in ranking (ρ = 0.96), still agree on only 62% of hard labels because their percentile cutpoints differ ~4-fold; aligning the cutpoints restores agreement. The Box 1 checklist distils these lessons into a reusable safeguard for other benchmarks. Experimental validation of the non-canonical tail is the decisive next step.</w:t>
       </w:r>
     </w:p>
     <w:bookmarkEnd w:id="28"/>

</xml_diff>